<commit_message>
Chore (App): From Gemini, done
</commit_message>
<xml_diff>
--- a/Chapter2.docx
+++ b/Chapter2.docx
@@ -1,6 +1,6 @@
 
 <file path=word/document.xml><?xml version="1.0" encoding="utf-8"?>
-<w:document xmlns:wpc="http://schemas.microsoft.com/office/word/2010/wordprocessingCanvas" xmlns:cx="http://schemas.microsoft.com/office/drawing/2014/chartex" xmlns:cx1="http://schemas.microsoft.com/office/drawing/2015/9/8/chartex" xmlns:cx2="http://schemas.microsoft.com/office/drawing/2015/10/21/chartex" xmlns:cx3="http://schemas.microsoft.com/office/drawing/2016/5/9/chartex" xmlns:cx4="http://schemas.microsoft.com/office/drawing/2016/5/10/chartex" xmlns:cx5="http://schemas.microsoft.com/office/drawing/2016/5/11/chartex" xmlns:cx6="http://schemas.microsoft.com/office/drawing/2016/5/12/chartex" xmlns:cx7="http://schemas.microsoft.com/office/drawing/2016/5/13/chartex" xmlns:cx8="http://schemas.microsoft.com/office/drawing/2016/5/14/chartex" xmlns:mc="http://schemas.openxmlformats.org/markup-compatibility/2006" xmlns:aink="http://schemas.microsoft.com/office/drawing/2016/ink" xmlns:am3d="http://schemas.microsoft.com/office/drawing/2017/model3d" xmlns:o="urn:schemas-microsoft-com:office:office" xmlns:oel="http://schemas.microsoft.com/office/2019/extlst" xmlns:r="http://schemas.openxmlformats.org/officeDocument/2006/relationships" xmlns:m="http://schemas.openxmlformats.org/officeDocument/2006/math" xmlns:v="urn:schemas-microsoft-com:vml" xmlns:wp14="http://schemas.microsoft.com/office/word/2010/wordprocessingDrawing" xmlns:wp="http://schemas.openxmlformats.org/drawingml/2006/wordprocessingDrawing" xmlns:w10="urn:schemas-microsoft-com:office:word" xmlns:w="http://schemas.openxmlformats.org/wordprocessingml/2006/main" xmlns:w14="http://schemas.microsoft.com/office/word/2010/wordml" xmlns:w15="http://schemas.microsoft.com/office/word/2012/wordml" xmlns:w16cei="http://schemas.microsoft.com/office/word/2026/wordml/cei" xmlns:w16cex="http://schemas.microsoft.com/office/word/2018/wordml/cex" xmlns:w16cid="http://schemas.microsoft.com/office/word/2016/wordml/cid" xmlns:w16="http://schemas.microsoft.com/office/word/2018/wordml" xmlns:w16du="http://schemas.microsoft.com/office/word/2023/wordml/word16du" xmlns:w16sdtdh="http://schemas.microsoft.com/office/word/2020/wordml/sdtdatahash" xmlns:w16sdtfl="http://schemas.microsoft.com/office/word/2024/wordml/sdtformatlock" xmlns:w16se="http://schemas.microsoft.com/office/word/2015/wordml/symex" xmlns:wpg="http://schemas.microsoft.com/office/word/2010/wordprocessingGroup" xmlns:wpi="http://schemas.microsoft.com/office/word/2010/wordprocessingInk" xmlns:wne="http://schemas.microsoft.com/office/word/2006/wordml" xmlns:wps="http://schemas.microsoft.com/office/word/2010/wordprocessingShape" mc:Ignorable="w14 w15 w16se w16cid w16 w16cex w16sdtdh w16sdtfl w16du wp14">
+<w:document xmlns:wpc="http://schemas.microsoft.com/office/word/2010/wordprocessingCanvas" xmlns:cx="http://schemas.microsoft.com/office/drawing/2014/chartex" xmlns:cx1="http://schemas.microsoft.com/office/drawing/2015/9/8/chartex" xmlns:cx2="http://schemas.microsoft.com/office/drawing/2015/10/21/chartex" xmlns:cx3="http://schemas.microsoft.com/office/drawing/2016/5/9/chartex" xmlns:cx4="http://schemas.microsoft.com/office/drawing/2016/5/10/chartex" xmlns:cx5="http://schemas.microsoft.com/office/drawing/2016/5/11/chartex" xmlns:cx6="http://schemas.microsoft.com/office/drawing/2016/5/12/chartex" xmlns:cx7="http://schemas.microsoft.com/office/drawing/2016/5/13/chartex" xmlns:cx8="http://schemas.microsoft.com/office/drawing/2016/5/14/chartex" xmlns:mc="http://schemas.openxmlformats.org/markup-compatibility/2006" xmlns:aink="http://schemas.microsoft.com/office/drawing/2016/ink" xmlns:am3d="http://schemas.microsoft.com/office/drawing/2017/model3d" xmlns:o="urn:schemas-microsoft-com:office:office" xmlns:oel="http://schemas.microsoft.com/office/2019/extlst" xmlns:r="http://schemas.openxmlformats.org/officeDocument/2006/relationships" xmlns:m="http://schemas.openxmlformats.org/officeDocument/2006/math" xmlns:v="urn:schemas-microsoft-com:vml" xmlns:wp14="http://schemas.microsoft.com/office/word/2010/wordprocessingDrawing" xmlns:wp="http://schemas.openxmlformats.org/drawingml/2006/wordprocessingDrawing" xmlns:w10="urn:schemas-microsoft-com:office:word" xmlns:w="http://schemas.openxmlformats.org/wordprocessingml/2006/main" xmlns:w14="http://schemas.microsoft.com/office/word/2010/wordml" xmlns:w15="http://schemas.microsoft.com/office/word/2012/wordml" xmlns:w16cex="http://schemas.microsoft.com/office/word/2018/wordml/cex" xmlns:w16cid="http://schemas.microsoft.com/office/word/2016/wordml/cid" xmlns:w16="http://schemas.microsoft.com/office/word/2018/wordml" xmlns:w16du="http://schemas.microsoft.com/office/word/2023/wordml/word16du" xmlns:w16sdtdh="http://schemas.microsoft.com/office/word/2020/wordml/sdtdatahash" xmlns:w16sdtfl="http://schemas.microsoft.com/office/word/2024/wordml/sdtformatlock" xmlns:w16se="http://schemas.microsoft.com/office/word/2015/wordml/symex" xmlns:wpg="http://schemas.microsoft.com/office/word/2010/wordprocessingGroup" xmlns:wpi="http://schemas.microsoft.com/office/word/2010/wordprocessingInk" xmlns:wne="http://schemas.microsoft.com/office/word/2006/wordml" xmlns:wps="http://schemas.microsoft.com/office/word/2010/wordprocessingShape" mc:Ignorable="w14 w15 w16se w16cid w16 w16cex w16sdtdh w16sdtfl w16du wp14">
   <w:body>
     <w:p>
       <w:pPr>
@@ -18,15 +18,49 @@
         <w:pStyle w:val="Heading2"/>
       </w:pPr>
       <w:r>
-        <w:t xml:space="preserve">2.0 </w:t>
-      </w:r>
-      <w:r>
-        <w:t>Literature Review</w:t>
+        <w:t>2.0 Literature Review</w:t>
+      </w:r>
+    </w:p>
+    <w:p>
+      <w:pPr>
+        <w:jc w:val="both"/>
+      </w:pPr>
+      <w:r>
+        <w:t xml:space="preserve">This chapter reviews the concepts, technologies, and prior research relevant to evaluating the efficiency of zero-knowledge proof generation and verification for attribute-based credentials implemented in Noir and verified on Ethereum. The review covers zero-knowledge proofs and ZK-SNARKs, attribute-based credentials, selective disclosure, Noir and the </w:t>
+      </w:r>
+      <w:proofErr w:type="spellStart"/>
+      <w:r>
+        <w:t>Barretenberg</w:t>
+      </w:r>
+      <w:proofErr w:type="spellEnd"/>
+      <w:r>
+        <w:t xml:space="preserve"> proving ecosystem, and Ethereum’s verification environment. It also examines the performance factors that affect off-chain proof generation and on-chain verification, before identifying the research gap addressed by this study.</w:t>
+      </w:r>
+    </w:p>
+    <w:p>
+      <w:pPr>
+        <w:jc w:val="both"/>
+      </w:pPr>
+      <w:r>
+        <w:t>The central concern is practical efficiency. Attribute-based credentials can improve privacy by enabling a holder to prove a property</w:t>
+      </w:r>
+      <w:r>
+        <w:t xml:space="preserve">, </w:t>
+      </w:r>
+      <w:r>
+        <w:t>for example, that they are above a required age or possess an approved credential</w:t>
+      </w:r>
+      <w:r>
+        <w:t xml:space="preserve">, </w:t>
+      </w:r>
+      <w:r>
+        <w:t>without revealing the underlying personal data. However, such privacy comes with computational costs. Proof generation may be expensive for users, while blockchain-based verification can incur gas costs that limit scalability. The study therefore focuses on the trade-off between privacy-preserving credential verification and deployable performance in an Ethereum environment.</w:t>
       </w:r>
     </w:p>
     <w:p>
       <w:pPr>
         <w:pStyle w:val="Heading3"/>
+        <w:jc w:val="both"/>
       </w:pPr>
       <w:r>
         <w:t xml:space="preserve">2.1 </w:t>
@@ -36,19 +70,146 @@
       </w:r>
     </w:p>
     <w:p>
-      <w:r>
-        <w:t>Zero-Knowledge Proofs (ZKPs) are cryptographic primitives enabling a prover to convince a verifier that a given statement is true without revealing any information beyond the statement's validity.</w:t>
+      <w:pPr>
+        <w:jc w:val="both"/>
+      </w:pPr>
+      <w:r>
+        <w:t>A zero-knowledge proof is a cryptographic protocol through which a prover convinces a verifier that a statement is true without disclosing information beyond the validity of that statement. In an attribute-based credential setting, the holder may prove that they possess a valid credential and meet a required condition without exposing the credential itself or all attributes contained in it.</w:t>
+      </w:r>
+    </w:p>
+    <w:p>
+      <w:pPr>
+        <w:jc w:val="both"/>
+      </w:pPr>
+      <w:r>
+        <w:t>Zero-Knowledge Proofs</w:t>
+      </w:r>
+      <w:r>
+        <w:t xml:space="preserve"> </w:t>
+      </w:r>
+      <w:r>
+        <w:t>is a practical and typical example of</w:t>
+      </w:r>
+      <w:r>
+        <w:t xml:space="preserve"> cryptographic primitives enabling a prover to convince a verifier that a given statement is true without revealing any information beyond the statement's validity.</w:t>
+      </w:r>
+      <w:r>
+        <w:t xml:space="preserve"> </w:t>
+      </w:r>
+      <w:r>
+        <w:t>A valid zero-knowledge proof system is normally expected to satisfy three properties:</w:t>
+      </w:r>
+    </w:p>
+    <w:p>
+      <w:pPr>
+        <w:pStyle w:val="ListParagraph"/>
+        <w:numPr>
+          <w:ilvl w:val="0"/>
+          <w:numId w:val="7"/>
+        </w:numPr>
+        <w:jc w:val="both"/>
+      </w:pPr>
+      <w:r>
+        <w:rPr>
+          <w:b/>
+          <w:bCs/>
+        </w:rPr>
+        <w:lastRenderedPageBreak/>
+        <w:t>Completeness</w:t>
+      </w:r>
+      <w:r>
+        <w:t>: If the statement is true and both participants follow the protocol correctly, the verifier accepts the proof.</w:t>
+      </w:r>
+    </w:p>
+    <w:p>
+      <w:pPr>
+        <w:pStyle w:val="ListParagraph"/>
+        <w:numPr>
+          <w:ilvl w:val="0"/>
+          <w:numId w:val="7"/>
+        </w:numPr>
+        <w:jc w:val="both"/>
+      </w:pPr>
+      <w:r>
+        <w:rPr>
+          <w:b/>
+          <w:bCs/>
+        </w:rPr>
+        <w:t>Soundness</w:t>
+      </w:r>
+      <w:r>
+        <w:t>: A dishonest prover should not be able to convince the verifier of a false statement except with negligible probability.</w:t>
+      </w:r>
+    </w:p>
+    <w:p>
+      <w:pPr>
+        <w:pStyle w:val="ListParagraph"/>
+        <w:numPr>
+          <w:ilvl w:val="0"/>
+          <w:numId w:val="7"/>
+        </w:numPr>
+        <w:jc w:val="both"/>
+      </w:pPr>
+      <w:r>
+        <w:rPr>
+          <w:b/>
+          <w:bCs/>
+        </w:rPr>
+        <w:t>Zero-knowledge</w:t>
+      </w:r>
+      <w:r>
+        <w:t>: The verifier learns no additional information about the secret inputs beyond the fact that the claimed statement is valid.</w:t>
+      </w:r>
+    </w:p>
+    <w:p>
+      <w:pPr>
+        <w:jc w:val="both"/>
+      </w:pPr>
+      <w:r>
+        <w:t>For example, a user may hold a credential containing a date of birth. Rather than submitting the date of birth to a service provider, the user can generate a proof that their age is at least 18. The verifier learns that the age requirement is satisfied but does not learn the actual date of birth. This property is especially valuable in identity systems because conventional digital identity processes often reveal more personal data than the verifier requires.</w:t>
+      </w:r>
+    </w:p>
+    <w:p>
+      <w:pPr>
+        <w:jc w:val="both"/>
+      </w:pPr>
+      <w:r>
+        <w:t xml:space="preserve">Zero-knowledge proofs are increasingly relevant to </w:t>
+      </w:r>
+      <w:r>
+        <w:t>decentralized</w:t>
+      </w:r>
+      <w:r>
+        <w:t xml:space="preserve"> applications because they enable public verification of private claims. However, the usefulness of a ZKP system depends not only on its privacy and security properties but also on its computational feasibility. A proof system that is mathematically secure but too slow to generate or too expensive to verify on-chain may be unsuitable for practical identity applications.</w:t>
       </w:r>
     </w:p>
     <w:p>
       <w:pPr>
         <w:pStyle w:val="Heading3"/>
-      </w:pPr>
-      <w:r>
-        <w:t>2.1 ZK-SNARKs Definition and Architecture</w:t>
-      </w:r>
-    </w:p>
-    <w:p>
+        <w:jc w:val="both"/>
+      </w:pPr>
+      <w:r>
+        <w:t>2.1</w:t>
+      </w:r>
+      <w:r>
+        <w:t>.1</w:t>
+      </w:r>
+      <w:r>
+        <w:t xml:space="preserve"> ZK-SNARKs Definition and Architecture</w:t>
+      </w:r>
+    </w:p>
+    <w:p>
+      <w:pPr>
+        <w:jc w:val="both"/>
+      </w:pPr>
+      <w:r>
+        <w:t>Zero-Knowledge Succinct Non-Interactive Arguments of Knowledge, commonly called ZK-SNARKs, are non-interactive zero-knowledge proof systems designed to produce compact proofs that can be verified efficiently. “Succinct” means that the proof is significantly smaller than the computation it represents and that verification is generally substantially cheaper than re-executing the full private computation. “Non-interactive” means that the prover can generate a proof without repeated communication with the verifier.</w:t>
+      </w:r>
+    </w:p>
+    <w:p>
+      <w:pPr>
+        <w:jc w:val="both"/>
+      </w:pPr>
       <w:r>
         <w:t>Zero-Knowledge Succinct Non-Interactive Arguments of Knowledge (ZK-SNARKs) enhance interactive zero-knowledge proofs by removing back-and-forth interaction and restricting proof size and verification time. A ZK-SNARK scheme consists of three polynomial-time algorithms</w:t>
       </w:r>
@@ -83,21 +244,159 @@
         <w:t>,</w:t>
       </w:r>
       <w:r>
-        <w:t xml:space="preserve"> operating independently of the circuit's computational complexity</w:t>
+        <w:t xml:space="preserve"> operating </w:t>
+      </w:r>
+      <w:r>
+        <w:lastRenderedPageBreak/>
+        <w:t>independently of the circuit's computational complexity</w:t>
       </w:r>
       <w:r>
         <w:t>.</w:t>
       </w:r>
+      <w:r>
+        <w:t xml:space="preserve"> </w:t>
+      </w:r>
+      <w:r>
+        <w:t>A typical ZK-SNARK workflow contains three main stages:</w:t>
+      </w:r>
+    </w:p>
+    <w:p>
+      <w:pPr>
+        <w:pStyle w:val="ListParagraph"/>
+        <w:numPr>
+          <w:ilvl w:val="0"/>
+          <w:numId w:val="8"/>
+        </w:numPr>
+        <w:jc w:val="both"/>
+      </w:pPr>
+      <w:r>
+        <w:rPr>
+          <w:b/>
+          <w:bCs/>
+        </w:rPr>
+        <w:t>Setup or key generation</w:t>
+      </w:r>
+      <w:r>
+        <w:t>: Public parameters, a proving key, and a verification key are generated. Depending on the protocol, this stage may require a trusted setup or may use a universal setup.</w:t>
+      </w:r>
+    </w:p>
+    <w:p>
+      <w:pPr>
+        <w:pStyle w:val="ListParagraph"/>
+        <w:numPr>
+          <w:ilvl w:val="0"/>
+          <w:numId w:val="8"/>
+        </w:numPr>
+        <w:jc w:val="both"/>
+      </w:pPr>
+      <w:r>
+        <w:rPr>
+          <w:b/>
+          <w:bCs/>
+        </w:rPr>
+        <w:t>Proof generation</w:t>
+      </w:r>
+      <w:r>
+        <w:t>: The prover uses private inputs, public inputs, and the proving key to construct a proof that the circuit’s constraints are satisfied.</w:t>
+      </w:r>
+    </w:p>
+    <w:p>
+      <w:pPr>
+        <w:pStyle w:val="ListParagraph"/>
+        <w:numPr>
+          <w:ilvl w:val="0"/>
+          <w:numId w:val="8"/>
+        </w:numPr>
+        <w:jc w:val="both"/>
+      </w:pPr>
+      <w:r>
+        <w:rPr>
+          <w:b/>
+          <w:bCs/>
+        </w:rPr>
+        <w:t>Proof verification</w:t>
+      </w:r>
+      <w:r>
+        <w:t>: The verifier uses the proof, public inputs, and verification key to determine whether the claim is valid.</w:t>
+      </w:r>
+    </w:p>
+    <w:p>
+      <w:pPr>
+        <w:jc w:val="both"/>
+      </w:pPr>
+      <w:r>
+        <w:t>In this study, the private inputs may include credential attributes, secrets associated with the holder, credential signatures or membership witnesses. The public inputs may include an issuer public key, an attribute commitment, a verification policy, a Merkle root, a nullifier, or a threshold such as the legal age requirement.</w:t>
+      </w:r>
+    </w:p>
+    <w:p>
+      <w:pPr>
+        <w:jc w:val="both"/>
+      </w:pPr>
+      <w:r>
+        <w:t>The performance of a ZK-SNARK system is not determined by proof size alone. It depends on several interacting factors</w:t>
+      </w:r>
+      <w:r>
+        <w:t xml:space="preserve"> such as c</w:t>
+      </w:r>
+      <w:r>
+        <w:t>ircuit size and number of constraints</w:t>
+      </w:r>
+      <w:r>
+        <w:t>, the c</w:t>
+      </w:r>
+      <w:r>
+        <w:t>omplexity of cryptographic operations embedded in the circuit</w:t>
+      </w:r>
+      <w:r>
+        <w:t>, the n</w:t>
+      </w:r>
+      <w:r>
+        <w:t>umber of private and public inputs</w:t>
+      </w:r>
+      <w:r>
+        <w:t>, p</w:t>
+      </w:r>
+      <w:r>
+        <w:t>roving system and polynomial-commitment scheme</w:t>
+      </w:r>
+      <w:r>
+        <w:t>, h</w:t>
+      </w:r>
+      <w:r>
+        <w:t>ardware resources available to the prover</w:t>
+      </w:r>
+      <w:r>
+        <w:t>, p</w:t>
+      </w:r>
+      <w:r>
+        <w:t>roof serialization and size</w:t>
+      </w:r>
+      <w:r>
+        <w:t xml:space="preserve"> and the c</w:t>
+      </w:r>
+      <w:r>
+        <w:t>ost of the verifier contract on Ethereum.</w:t>
+      </w:r>
+      <w:r>
+        <w:t xml:space="preserve"> </w:t>
+      </w:r>
+      <w:r>
+        <w:t>For this reason, a meaningful evaluation of ZK-SNARK efficiency must separately measure off-chain proving performance and on-chain verification performance.</w:t>
+      </w:r>
     </w:p>
     <w:p>
       <w:pPr>
         <w:pStyle w:val="Heading3"/>
+        <w:jc w:val="both"/>
       </w:pPr>
       <w:r>
         <w:t>2.2 Evolution of Cryptographic Identity and Attribute-Based Credentials</w:t>
       </w:r>
     </w:p>
     <w:p>
+      <w:pPr>
+        <w:jc w:val="both"/>
+      </w:pPr>
       <w:r>
         <w:t>Identity management on distributed networks has evolved from</w:t>
       </w:r>
@@ -123,14 +422,42 @@
     <w:p>
       <w:pPr>
         <w:pStyle w:val="Heading3"/>
+        <w:jc w:val="both"/>
       </w:pPr>
       <w:r>
         <w:t>2.2.1 Attribute-Based Credentials (ABCs)</w:t>
       </w:r>
     </w:p>
     <w:p>
-      <w:r>
-        <w:t xml:space="preserve">Attribute-Based Credentials allow a holder to acquire signed credentials containing individual attributes (e.g., </w:t>
+      <w:pPr>
+        <w:jc w:val="both"/>
+      </w:pPr>
+      <w:r>
+        <w:t xml:space="preserve">Attribute-based credentials are digital credentials that allow a holder to demonstrate possession of attributes issued by a trusted authority. The attributes may include age, nationality, membership status, qualification level, residence status, or a financial eligibility category. Unlike conventional identity documents, which often disclose </w:t>
+      </w:r>
+      <w:r>
+        <w:lastRenderedPageBreak/>
+        <w:t>complete identity records, attribute-based credentials enable disclosure of only what a verifier needs.</w:t>
+      </w:r>
+    </w:p>
+    <w:p>
+      <w:pPr>
+        <w:jc w:val="both"/>
+      </w:pPr>
+      <w:r>
+        <w:t>Attribute-</w:t>
+      </w:r>
+      <w:r>
+        <w:t>b</w:t>
+      </w:r>
+      <w:r>
+        <w:t xml:space="preserve">ased </w:t>
+      </w:r>
+      <w:r>
+        <w:t>c</w:t>
+      </w:r>
+      <w:r>
+        <w:t xml:space="preserve">redentials allow a holder to acquire signed credentials containing individual attributes (e.g., </w:t>
       </w:r>
       <w:r>
         <w:t>‘</w:t>
@@ -173,7 +500,10 @@
         <w:t>) from a trusted Issuer. During verification, the Holder generates a proof enabling selective disclosure (revealing only required fields) or predicate proving (verifying properties like Age</w:t>
       </w:r>
       <w:r>
-        <w:t xml:space="preserve"> =</w:t>
+        <w:t xml:space="preserve"> </w:t>
+      </w:r>
+      <w:r>
+        <w:t>&gt;</w:t>
       </w:r>
       <w:r>
         <w:t xml:space="preserve"> 18</w:t>
@@ -196,18 +526,215 @@
         <w:t>’)</w:t>
       </w:r>
       <w:r>
-        <w:t xml:space="preserve">.  </w:t>
+        <w:t>.</w:t>
+      </w:r>
+      <w:r>
+        <w:t xml:space="preserve"> </w:t>
+      </w:r>
+      <w:r>
+        <w:t>The main parties in an attribute-based credential system are:</w:t>
+      </w:r>
+    </w:p>
+    <w:p>
+      <w:pPr>
+        <w:pStyle w:val="ListParagraph"/>
+        <w:numPr>
+          <w:ilvl w:val="0"/>
+          <w:numId w:val="10"/>
+        </w:numPr>
+        <w:jc w:val="both"/>
+      </w:pPr>
+      <w:r>
+        <w:t>A trusted entity</w:t>
+      </w:r>
+      <w:r>
+        <w:t xml:space="preserve"> (issuer),</w:t>
+      </w:r>
+      <w:r>
+        <w:t xml:space="preserve"> that creates and signs a credential containing one or more attributes.</w:t>
+      </w:r>
+    </w:p>
+    <w:p>
+      <w:pPr>
+        <w:pStyle w:val="ListParagraph"/>
+        <w:numPr>
+          <w:ilvl w:val="0"/>
+          <w:numId w:val="10"/>
+        </w:numPr>
+        <w:jc w:val="both"/>
+      </w:pPr>
+      <w:r>
+        <w:t>The</w:t>
+      </w:r>
+      <w:r>
+        <w:t xml:space="preserve"> </w:t>
+      </w:r>
+      <w:r>
+        <w:t>h</w:t>
+      </w:r>
+      <w:r>
+        <w:t>older; a</w:t>
+      </w:r>
+      <w:r>
+        <w:t xml:space="preserve"> user who receives, stores, and later presents the credential.</w:t>
+      </w:r>
+    </w:p>
+    <w:p>
+      <w:pPr>
+        <w:pStyle w:val="ListParagraph"/>
+        <w:numPr>
+          <w:ilvl w:val="0"/>
+          <w:numId w:val="10"/>
+        </w:numPr>
+        <w:jc w:val="both"/>
+      </w:pPr>
+      <w:r>
+        <w:t xml:space="preserve">A </w:t>
+      </w:r>
+      <w:r>
+        <w:t>v</w:t>
+      </w:r>
+      <w:r>
+        <w:t>erifier</w:t>
+      </w:r>
+      <w:r>
+        <w:t>;</w:t>
+      </w:r>
+      <w:r>
+        <w:t xml:space="preserve"> </w:t>
+      </w:r>
+      <w:r>
+        <w:t>a</w:t>
+      </w:r>
+      <w:r>
+        <w:t xml:space="preserve"> service provider, smart contract, or </w:t>
+      </w:r>
+      <w:r>
+        <w:t>organization</w:t>
+      </w:r>
+      <w:r>
+        <w:t xml:space="preserve"> that checks whether the holder satisfies a policy.</w:t>
+      </w:r>
+    </w:p>
+    <w:p>
+      <w:pPr>
+        <w:pStyle w:val="ListParagraph"/>
+        <w:numPr>
+          <w:ilvl w:val="0"/>
+          <w:numId w:val="10"/>
+        </w:numPr>
+        <w:jc w:val="both"/>
+      </w:pPr>
+      <w:r>
+        <w:t xml:space="preserve">A </w:t>
+      </w:r>
+      <w:r>
+        <w:t>c</w:t>
+      </w:r>
+      <w:r>
+        <w:t>redential registry or revocation mechanism</w:t>
+      </w:r>
+      <w:r>
+        <w:t>, that is,</w:t>
+      </w:r>
+      <w:r>
+        <w:t xml:space="preserve"> </w:t>
+      </w:r>
+      <w:r>
+        <w:t>a</w:t>
+      </w:r>
+      <w:r>
+        <w:t>n optional component used to establish credential status, issuer legitimacy, or revocation information.</w:t>
+      </w:r>
+    </w:p>
+    <w:p>
+      <w:pPr>
+        <w:jc w:val="both"/>
+      </w:pPr>
+      <w:r>
+        <w:t>A credential presentation may involve selective disclosure or predicate proving. Selective disclosure means that a holder reveals only chosen attributes. Predicate proving is more privacy-preserving because it enables the holder to prove that an attribute satisfies a condition without exposing the attribute itself.</w:t>
+      </w:r>
+      <w:r>
+        <w:t xml:space="preserve"> </w:t>
+      </w:r>
+      <w:r>
+        <w:t>For instance, instead of revealing a date of birth, a holder may prove:</w:t>
+      </w:r>
+      <w:r>
+        <w:t xml:space="preserve"> </w:t>
+      </w:r>
+      <w:r>
+        <w:t>Age</w:t>
+      </w:r>
+      <w:r>
+        <w:t xml:space="preserve"> </w:t>
+      </w:r>
+      <w:r>
+        <w:t>&gt;</w:t>
+      </w:r>
+      <w:r>
+        <w:t xml:space="preserve"> </w:t>
+      </w:r>
+      <w:r>
+        <w:t>18</w:t>
+      </w:r>
+      <w:r>
+        <w:t xml:space="preserve">. </w:t>
+      </w:r>
+      <w:r>
+        <w:t xml:space="preserve">Similarly, a holder may prove that they are a citizen of an approved jurisdiction without revealing their name, passport number, address, or full credential record. Such capabilities are valuable in access-control systems, </w:t>
+      </w:r>
+      <w:r>
+        <w:t>decentralized</w:t>
+      </w:r>
+      <w:r>
+        <w:t xml:space="preserve"> finance, educational certification, electronic voting, healthcare </w:t>
+      </w:r>
+      <w:r>
+        <w:t>authorization</w:t>
+      </w:r>
+      <w:r>
+        <w:t>, and age-restricted services.</w:t>
+      </w:r>
+    </w:p>
+    <w:p>
+      <w:pPr>
+        <w:jc w:val="both"/>
+      </w:pPr>
+      <w:r>
+        <w:t>ETSI’s review of selective-disclosure mechanisms identifies BBS signatures, Camenisch-</w:t>
+      </w:r>
+      <w:proofErr w:type="spellStart"/>
+      <w:r>
+        <w:t>Lysyanskaya</w:t>
+      </w:r>
+      <w:proofErr w:type="spellEnd"/>
+      <w:r>
+        <w:t xml:space="preserve"> signatures, </w:t>
+      </w:r>
+      <w:proofErr w:type="spellStart"/>
+      <w:r>
+        <w:t>Idemix</w:t>
+      </w:r>
+      <w:proofErr w:type="spellEnd"/>
+      <w:r>
+        <w:t>, Merkle-based disclosure approaches, and related cryptographic mechanisms as technologies used to support privacy-preserving verifiable credentials. These schemes differ in their setup assumptions, proof size, disclosure capabilities, revocation support, and implementation complexity.</w:t>
       </w:r>
     </w:p>
     <w:p>
       <w:pPr>
         <w:pStyle w:val="Heading3"/>
-      </w:pPr>
-      <w:r>
+        <w:jc w:val="both"/>
+      </w:pPr>
+      <w:r>
+        <w:lastRenderedPageBreak/>
         <w:t>2.2.2 Comparative Cryptographic Frameworks</w:t>
       </w:r>
     </w:p>
     <w:p>
+      <w:pPr>
+        <w:jc w:val="both"/>
+      </w:pPr>
       <w:r>
         <w:t>Traditional anonymous credential systems rely on specific cryptographic</w:t>
       </w:r>
@@ -225,6 +752,7 @@
           <w:ilvl w:val="0"/>
           <w:numId w:val="1"/>
         </w:numPr>
+        <w:jc w:val="both"/>
       </w:pPr>
       <w:r>
         <w:rPr>
@@ -250,11 +778,35 @@
         <w:t xml:space="preserve"> (CL) Signatures:</w:t>
       </w:r>
       <w:r>
-        <w:t xml:space="preserve"> Built on strong RSA assumptions, supporting selective disclosure and efficient zero-knowledge proofs of signature </w:t>
-      </w:r>
-      <w:r>
-        <w:lastRenderedPageBreak/>
-        <w:t>knowledge. However, they rely on complex interactive pairings that are computationally expensive to verify on EVM-based blockchains.</w:t>
+        <w:t xml:space="preserve"> </w:t>
+      </w:r>
+      <w:r>
+        <w:t>Camenisch-</w:t>
+      </w:r>
+      <w:proofErr w:type="spellStart"/>
+      <w:r>
+        <w:t>Lysyanskaya</w:t>
+      </w:r>
+      <w:proofErr w:type="spellEnd"/>
+      <w:r>
+        <w:t xml:space="preserve">, or CL, signatures are among the foundational cryptographic constructions for anonymous credentials. They enable a holder to prove knowledge of a valid issuer signature while selectively disclosing attributes or proving relations over hidden attributes. CL-based systems have historically been associated with systems such as </w:t>
+      </w:r>
+      <w:proofErr w:type="spellStart"/>
+      <w:r>
+        <w:t>Idemix</w:t>
+      </w:r>
+      <w:proofErr w:type="spellEnd"/>
+      <w:r>
+        <w:t>.</w:t>
+      </w:r>
+    </w:p>
+    <w:p>
+      <w:pPr>
+        <w:pStyle w:val="ListParagraph"/>
+        <w:jc w:val="both"/>
+      </w:pPr>
+      <w:r>
+        <w:t>Their principal advantage is their rich support for privacy-preserving credential presentations. However, their use in smart-contract environments may be challenging because the associated proofs and cryptographic operations can be computationally demanding. Directly implementing all required operations in an Ethereum smart contract would generally be impractical. One approach is therefore to verify the credential signature and the required attribute policy inside a ZK-SNARK circuit, then submit only a succinct ZK proof to Ethereum.</w:t>
       </w:r>
     </w:p>
     <w:p>
@@ -264,6 +816,7 @@
           <w:ilvl w:val="0"/>
           <w:numId w:val="1"/>
         </w:numPr>
+        <w:jc w:val="both"/>
       </w:pPr>
       <w:r>
         <w:rPr>
@@ -273,7 +826,42 @@
         <w:t>BBS+ Signatures:</w:t>
       </w:r>
       <w:r>
-        <w:t xml:space="preserve"> Utilize bilinear pairings over pairing-friendly elliptic curves to provide short signatures and zero-knowledge proofs of unrevealed attributes. Verification remains relatively expensive on-chain due to the required pairing checks.</w:t>
+        <w:t xml:space="preserve"> </w:t>
+      </w:r>
+      <w:r>
+        <w:t xml:space="preserve">BBS+ signatures are pairing-based signatures that support selective disclosure and zero-knowledge proofs of possession. A holder can reveal selected messages in a signed credential while proving knowledge of the signature and the hidden messages. BBS+ is widely discussed in the context of privacy-preserving verifiable credentials and supports </w:t>
+      </w:r>
+      <w:proofErr w:type="spellStart"/>
+      <w:r>
+        <w:t>unlinkable</w:t>
+      </w:r>
+      <w:proofErr w:type="spellEnd"/>
+      <w:r>
+        <w:t xml:space="preserve"> presentations when correctly designed and implemented.</w:t>
+      </w:r>
+    </w:p>
+    <w:p>
+      <w:pPr>
+        <w:pStyle w:val="ListParagraph"/>
+        <w:jc w:val="both"/>
+      </w:pPr>
+      <w:r>
+        <w:t>The practical issue for Ethereum is that pairing-based cryptographic operations can be expensive if directly executed in a smart contract. Ethereum provides precompiled contracts for certain BN254 elliptic-curve operations, including point addition, scalar multiplication, and pairing checks, because these operations would otherwise be prohibitively expensive in EVM bytecode.</w:t>
+      </w:r>
+    </w:p>
+    <w:p>
+      <w:pPr>
+        <w:pStyle w:val="ListParagraph"/>
+        <w:jc w:val="both"/>
+      </w:pPr>
+      <w:r>
+        <w:t>However, even where precompiles are available, the gas cost of verification, transaction calldata, public-input handling, and verifier-contract logic must be measured. It is therefore inadequate to describe a credential scheme as “efficient” merely because it uses compact proofs. Efficiency must be established experimentally under a specified Ethereum execution environment.</w:t>
+      </w:r>
+      <w:r>
+        <w:t xml:space="preserve"> </w:t>
+      </w:r>
+      <w:r>
+        <w:t>Verification remains relatively expensive on-chain due to the required pairing checks.</w:t>
       </w:r>
     </w:p>
     <w:p>
@@ -283,12 +871,14 @@
           <w:ilvl w:val="0"/>
           <w:numId w:val="1"/>
         </w:numPr>
+        <w:jc w:val="both"/>
       </w:pPr>
       <w:r>
         <w:rPr>
           <w:b/>
           <w:bCs/>
         </w:rPr>
+        <w:lastRenderedPageBreak/>
         <w:t>ZK-SNARK Encapsulated Credentials:</w:t>
       </w:r>
       <w:r>
@@ -298,12 +888,19 @@
     <w:p>
       <w:pPr>
         <w:pStyle w:val="Heading3"/>
-      </w:pPr>
-      <w:r>
-        <w:t>2.3 The Noir DSL and the Aztec Cryptographic Stack</w:t>
-      </w:r>
-    </w:p>
-    <w:p>
+        <w:jc w:val="both"/>
+      </w:pPr>
+      <w:r>
+        <w:t xml:space="preserve">2.3 </w:t>
+      </w:r>
+      <w:r>
+        <w:t>Noir and Zero-Knowledge Circuit Development</w:t>
+      </w:r>
+    </w:p>
+    <w:p>
+      <w:pPr>
+        <w:jc w:val="both"/>
+      </w:pPr>
       <w:r>
         <w:t>Noir is a Rust-</w:t>
       </w:r>
@@ -316,21 +913,115 @@
     </w:p>
     <w:p>
       <w:pPr>
+        <w:jc w:val="both"/>
+      </w:pPr>
+      <w:r>
+        <w:t>Noir is a domain-specific language used to express zero-knowledge circuits at a higher level of abstraction than manually constructing arithmetic constraints. Rather than writing low-level gate constraints directly, developers define the intended computation using a language designed for privacy-preserving programs. Noir then compiles the program into an intermediate circuit representation, commonly referred to as ACIR, which can be processed by a compatible proving backend.</w:t>
+      </w:r>
+    </w:p>
+    <w:p>
+      <w:pPr>
+        <w:jc w:val="both"/>
+      </w:pPr>
+      <w:r>
+        <w:t>This distinction is essential. Noir is not itself a proving system. It describes the circuit, while a proving backend determines how the circuit is transformed into cryptographic proof operations. A rigorous study must therefore identify the exact Noir version, backend version, proving system, curve, hash function, and verifier-generation process used in the experiment.</w:t>
+      </w:r>
+      <w:r>
+        <w:t xml:space="preserve"> </w:t>
+      </w:r>
+      <w:r>
+        <w:t>Noir is attractive for attribute-based credential research for several reasons:</w:t>
+      </w:r>
+    </w:p>
+    <w:p>
+      <w:pPr>
+        <w:pStyle w:val="ListParagraph"/>
+        <w:numPr>
+          <w:ilvl w:val="0"/>
+          <w:numId w:val="11"/>
+        </w:numPr>
+        <w:jc w:val="both"/>
+      </w:pPr>
+      <w:r>
+        <w:t>It can reduce the development burden associated with manually expressed arithmetic circuits.</w:t>
+      </w:r>
+    </w:p>
+    <w:p>
+      <w:pPr>
+        <w:pStyle w:val="ListParagraph"/>
+        <w:numPr>
+          <w:ilvl w:val="0"/>
+          <w:numId w:val="11"/>
+        </w:numPr>
+        <w:jc w:val="both"/>
+      </w:pPr>
+      <w:r>
+        <w:t>Its type system and high-level syntax may improve code readability and maintainability.</w:t>
+      </w:r>
+    </w:p>
+    <w:p>
+      <w:pPr>
+        <w:pStyle w:val="ListParagraph"/>
+        <w:numPr>
+          <w:ilvl w:val="0"/>
+          <w:numId w:val="11"/>
+        </w:numPr>
+        <w:jc w:val="both"/>
+      </w:pPr>
+      <w:r>
+        <w:t>It enables structured representation of private inputs, public inputs, and credential-validation logic.</w:t>
+      </w:r>
+    </w:p>
+    <w:p>
+      <w:pPr>
+        <w:pStyle w:val="ListParagraph"/>
+        <w:numPr>
+          <w:ilvl w:val="0"/>
+          <w:numId w:val="11"/>
+        </w:numPr>
+        <w:jc w:val="both"/>
+      </w:pPr>
+      <w:r>
+        <w:t>It supports an experimental workflow in which the same circuit can be compiled and benchmarked under a defined proving backend.</w:t>
+      </w:r>
+    </w:p>
+    <w:p>
+      <w:pPr>
+        <w:pStyle w:val="ListParagraph"/>
+        <w:numPr>
+          <w:ilvl w:val="0"/>
+          <w:numId w:val="11"/>
+        </w:numPr>
+        <w:jc w:val="both"/>
+      </w:pPr>
+      <w:r>
+        <w:lastRenderedPageBreak/>
+        <w:t>It can generate artifacts that support off-chain proof generation and verifier deployment workflows.</w:t>
+      </w:r>
+    </w:p>
+    <w:p>
+      <w:pPr>
+        <w:jc w:val="both"/>
+      </w:pPr>
+      <w:r>
+        <w:t>In a credential circuit, Noir can encode operations such as hash commitments, range checks, equality tests, Merkle inclusion proofs, nullifier calculations, and verification of selected cryptographic relations. However, ease of writing a circuit does not necessarily mean low proving cost. A high-level implementation can still compile into a large and computationally expensive constraint system. This is precisely why empirical evaluation is required.</w:t>
+      </w:r>
+    </w:p>
+    <w:p>
+      <w:pPr>
         <w:pStyle w:val="Heading3"/>
+        <w:jc w:val="both"/>
       </w:pPr>
       <w:r>
         <w:t>2.3.1 Compiler Pipeline: Noir to ACIR</w:t>
       </w:r>
     </w:p>
     <w:p>
-      <w:r>
-        <w:t>Noir separates high-level language parsing from the low-level proving backend using Abstract</w:t>
-      </w:r>
-      <w:r>
-        <w:t xml:space="preserve"> </w:t>
-      </w:r>
-      <w:r>
-        <w:t>Circuit Intermediate Representation (ACIR):</w:t>
+      <w:pPr>
+        <w:jc w:val="both"/>
+      </w:pPr>
+      <w:r>
+        <w:t>Noir separates high-level language parsing from the low-level proving backend using Abstract Circuit Intermediate Representation (ACIR):</w:t>
       </w:r>
     </w:p>
     <w:p>
@@ -340,6 +1031,7 @@
           <w:ilvl w:val="0"/>
           <w:numId w:val="2"/>
         </w:numPr>
+        <w:jc w:val="both"/>
       </w:pPr>
       <w:r>
         <w:rPr>
@@ -359,6 +1051,7 @@
           <w:ilvl w:val="0"/>
           <w:numId w:val="2"/>
         </w:numPr>
+        <w:jc w:val="both"/>
       </w:pPr>
       <w:r>
         <w:rPr>
@@ -378,6 +1071,7 @@
           <w:ilvl w:val="0"/>
           <w:numId w:val="2"/>
         </w:numPr>
+        <w:jc w:val="both"/>
       </w:pPr>
       <w:r>
         <w:rPr>
@@ -418,27 +1112,388 @@
     <w:p>
       <w:pPr>
         <w:pStyle w:val="Heading3"/>
-      </w:pPr>
-      <w:r>
-        <w:t xml:space="preserve">2.3.2 </w:t>
-      </w:r>
+        <w:numPr>
+          <w:ilvl w:val="2"/>
+          <w:numId w:val="13"/>
+        </w:numPr>
+        <w:jc w:val="both"/>
+      </w:pPr>
       <w:proofErr w:type="spellStart"/>
       <w:r>
+        <w:lastRenderedPageBreak/>
         <w:t>Barretenberg</w:t>
       </w:r>
       <w:proofErr w:type="spellEnd"/>
       <w:r>
-        <w:t xml:space="preserve"> Proving Engine</w:t>
-      </w:r>
-    </w:p>
-    <w:p>
+        <w:t xml:space="preserve"> and Proving Backends</w:t>
+      </w:r>
+    </w:p>
+    <w:p>
+      <w:pPr>
+        <w:pStyle w:val="Heading3"/>
+        <w:jc w:val="both"/>
+        <w:rPr>
+          <w:rFonts w:eastAsiaTheme="minorHAnsi" w:cstheme="minorBidi"/>
+          <w:b w:val="0"/>
+          <w:szCs w:val="24"/>
+        </w:rPr>
+      </w:pPr>
       <w:proofErr w:type="spellStart"/>
       <w:r>
+        <w:rPr>
+          <w:rFonts w:eastAsiaTheme="minorHAnsi" w:cstheme="minorBidi"/>
+          <w:b w:val="0"/>
+          <w:szCs w:val="24"/>
+        </w:rPr>
         <w:t>Barretenberg</w:t>
       </w:r>
       <w:proofErr w:type="spellEnd"/>
       <w:r>
-        <w:t xml:space="preserve"> is a C++ C-API/WASM backend supporting multiple proving algorithms:</w:t>
+        <w:rPr>
+          <w:rFonts w:eastAsiaTheme="minorHAnsi" w:cstheme="minorBidi"/>
+          <w:b w:val="0"/>
+          <w:szCs w:val="24"/>
+        </w:rPr>
+        <w:t xml:space="preserve"> is a cryptographic proving backend associated with the Aztec ecosystem. It supports proof-generation and verification workflows for circuits represented in formats compatible with its toolchain. In a Noir-based workflow, the Noir compiler produces circuit artifacts, while </w:t>
+      </w:r>
+      <w:proofErr w:type="spellStart"/>
+      <w:r>
+        <w:rPr>
+          <w:rFonts w:eastAsiaTheme="minorHAnsi" w:cstheme="minorBidi"/>
+          <w:b w:val="0"/>
+          <w:szCs w:val="24"/>
+        </w:rPr>
+        <w:t>Barretenberg</w:t>
+      </w:r>
+      <w:proofErr w:type="spellEnd"/>
+      <w:r>
+        <w:rPr>
+          <w:rFonts w:eastAsiaTheme="minorHAnsi" w:cstheme="minorBidi"/>
+          <w:b w:val="0"/>
+          <w:szCs w:val="24"/>
+        </w:rPr>
+        <w:t xml:space="preserve"> or another compatible backend performs proof generation, verification-key operations, and proof verification.</w:t>
+      </w:r>
+      <w:r>
+        <w:rPr>
+          <w:rFonts w:eastAsiaTheme="minorHAnsi" w:cstheme="minorBidi"/>
+          <w:b w:val="0"/>
+          <w:szCs w:val="24"/>
+        </w:rPr>
+        <w:t xml:space="preserve"> </w:t>
+      </w:r>
+      <w:r>
+        <w:rPr>
+          <w:rFonts w:eastAsiaTheme="minorHAnsi" w:cstheme="minorBidi"/>
+          <w:b w:val="0"/>
+          <w:szCs w:val="24"/>
+        </w:rPr>
+        <w:t xml:space="preserve">The backend and proof system influence the </w:t>
+      </w:r>
+      <w:r>
+        <w:rPr>
+          <w:rFonts w:eastAsiaTheme="minorHAnsi" w:cstheme="minorBidi"/>
+          <w:b w:val="0"/>
+          <w:szCs w:val="24"/>
+        </w:rPr>
+        <w:t>p</w:t>
+      </w:r>
+      <w:r>
+        <w:rPr>
+          <w:rFonts w:eastAsiaTheme="minorHAnsi" w:cstheme="minorBidi"/>
+          <w:b w:val="0"/>
+          <w:szCs w:val="24"/>
+        </w:rPr>
+        <w:t>roving time</w:t>
+      </w:r>
+      <w:r>
+        <w:rPr>
+          <w:rFonts w:eastAsiaTheme="minorHAnsi" w:cstheme="minorBidi"/>
+          <w:b w:val="0"/>
+          <w:szCs w:val="24"/>
+        </w:rPr>
+        <w:t>, p</w:t>
+      </w:r>
+      <w:r>
+        <w:rPr>
+          <w:rFonts w:eastAsiaTheme="minorHAnsi" w:cstheme="minorBidi"/>
+          <w:b w:val="0"/>
+          <w:szCs w:val="24"/>
+        </w:rPr>
+        <w:t>eak memory requirement</w:t>
+      </w:r>
+      <w:r>
+        <w:rPr>
+          <w:rFonts w:eastAsiaTheme="minorHAnsi" w:cstheme="minorBidi"/>
+          <w:b w:val="0"/>
+          <w:szCs w:val="24"/>
+        </w:rPr>
+        <w:t>, p</w:t>
+      </w:r>
+      <w:r>
+        <w:rPr>
+          <w:rFonts w:eastAsiaTheme="minorHAnsi" w:cstheme="minorBidi"/>
+          <w:b w:val="0"/>
+          <w:szCs w:val="24"/>
+        </w:rPr>
+        <w:t>roof size</w:t>
+      </w:r>
+      <w:r>
+        <w:rPr>
+          <w:rFonts w:eastAsiaTheme="minorHAnsi" w:cstheme="minorBidi"/>
+          <w:b w:val="0"/>
+          <w:szCs w:val="24"/>
+        </w:rPr>
+        <w:t>, v</w:t>
+      </w:r>
+      <w:r>
+        <w:rPr>
+          <w:rFonts w:eastAsiaTheme="minorHAnsi" w:cstheme="minorBidi"/>
+          <w:b w:val="0"/>
+          <w:szCs w:val="24"/>
+        </w:rPr>
+        <w:t>erification-key size</w:t>
+      </w:r>
+      <w:r>
+        <w:rPr>
+          <w:rFonts w:eastAsiaTheme="minorHAnsi" w:cstheme="minorBidi"/>
+          <w:b w:val="0"/>
+          <w:szCs w:val="24"/>
+        </w:rPr>
+        <w:t>, t</w:t>
+      </w:r>
+      <w:r>
+        <w:rPr>
+          <w:rFonts w:eastAsiaTheme="minorHAnsi" w:cstheme="minorBidi"/>
+          <w:b w:val="0"/>
+          <w:szCs w:val="24"/>
+        </w:rPr>
+        <w:t>rusted-setup requirements</w:t>
+      </w:r>
+      <w:r>
+        <w:rPr>
+          <w:rFonts w:eastAsiaTheme="minorHAnsi" w:cstheme="minorBidi"/>
+          <w:b w:val="0"/>
+          <w:szCs w:val="24"/>
+        </w:rPr>
+        <w:t>, l</w:t>
+      </w:r>
+      <w:r>
+        <w:rPr>
+          <w:rFonts w:eastAsiaTheme="minorHAnsi" w:cstheme="minorBidi"/>
+          <w:b w:val="0"/>
+          <w:szCs w:val="24"/>
+        </w:rPr>
+        <w:t>ocal verification time</w:t>
+      </w:r>
+      <w:r>
+        <w:rPr>
+          <w:rFonts w:eastAsiaTheme="minorHAnsi" w:cstheme="minorBidi"/>
+          <w:b w:val="0"/>
+          <w:szCs w:val="24"/>
+        </w:rPr>
+        <w:t>, S</w:t>
+      </w:r>
+      <w:r>
+        <w:rPr>
+          <w:rFonts w:eastAsiaTheme="minorHAnsi" w:cstheme="minorBidi"/>
+          <w:b w:val="0"/>
+          <w:szCs w:val="24"/>
+        </w:rPr>
+        <w:t>olidity verifier size and complexity</w:t>
+      </w:r>
+      <w:r>
+        <w:rPr>
+          <w:rFonts w:eastAsiaTheme="minorHAnsi" w:cstheme="minorBidi"/>
+          <w:b w:val="0"/>
+          <w:szCs w:val="24"/>
+        </w:rPr>
+        <w:t xml:space="preserve"> and the </w:t>
+      </w:r>
+      <w:r>
+        <w:rPr>
+          <w:rFonts w:eastAsiaTheme="minorHAnsi" w:cstheme="minorBidi"/>
+          <w:b w:val="0"/>
+          <w:szCs w:val="24"/>
+        </w:rPr>
+        <w:t>Ethereum gas consumption.</w:t>
+      </w:r>
+    </w:p>
+    <w:p>
+      <w:pPr>
+        <w:pStyle w:val="Heading3"/>
+        <w:jc w:val="both"/>
+        <w:rPr>
+          <w:rFonts w:eastAsiaTheme="minorHAnsi" w:cstheme="minorBidi"/>
+          <w:b w:val="0"/>
+          <w:szCs w:val="24"/>
+        </w:rPr>
+      </w:pPr>
+      <w:proofErr w:type="spellStart"/>
+      <w:r>
+        <w:rPr>
+          <w:rFonts w:eastAsiaTheme="minorHAnsi" w:cstheme="minorBidi"/>
+          <w:b w:val="0"/>
+          <w:szCs w:val="24"/>
+        </w:rPr>
+        <w:t>UltraPlonk</w:t>
+      </w:r>
+      <w:proofErr w:type="spellEnd"/>
+      <w:r>
+        <w:rPr>
+          <w:rFonts w:eastAsiaTheme="minorHAnsi" w:cstheme="minorBidi"/>
+          <w:b w:val="0"/>
+          <w:szCs w:val="24"/>
+        </w:rPr>
+        <w:t xml:space="preserve"> and </w:t>
+      </w:r>
+      <w:proofErr w:type="spellStart"/>
+      <w:r>
+        <w:rPr>
+          <w:rFonts w:eastAsiaTheme="minorHAnsi" w:cstheme="minorBidi"/>
+          <w:b w:val="0"/>
+          <w:szCs w:val="24"/>
+        </w:rPr>
+        <w:t>UltraHonk</w:t>
+      </w:r>
+      <w:proofErr w:type="spellEnd"/>
+      <w:r>
+        <w:rPr>
+          <w:rFonts w:eastAsiaTheme="minorHAnsi" w:cstheme="minorBidi"/>
+          <w:b w:val="0"/>
+          <w:szCs w:val="24"/>
+        </w:rPr>
+        <w:t xml:space="preserve"> are examples of proving-system families commonly associated with modern </w:t>
+      </w:r>
+      <w:proofErr w:type="spellStart"/>
+      <w:r>
+        <w:rPr>
+          <w:rFonts w:eastAsiaTheme="minorHAnsi" w:cstheme="minorBidi"/>
+          <w:b w:val="0"/>
+          <w:szCs w:val="24"/>
+        </w:rPr>
+        <w:t>Plonkish</w:t>
+      </w:r>
+      <w:proofErr w:type="spellEnd"/>
+      <w:r>
+        <w:rPr>
+          <w:rFonts w:eastAsiaTheme="minorHAnsi" w:cstheme="minorBidi"/>
+          <w:b w:val="0"/>
+          <w:szCs w:val="24"/>
+        </w:rPr>
+        <w:t xml:space="preserve"> proof workflows. Their internal protocols differ, and these differences can affect proving speed, memory use, proof structure, and verifier cost. Therefore, if the project compares </w:t>
+      </w:r>
+      <w:proofErr w:type="spellStart"/>
+      <w:r>
+        <w:rPr>
+          <w:rFonts w:eastAsiaTheme="minorHAnsi" w:cstheme="minorBidi"/>
+          <w:b w:val="0"/>
+          <w:szCs w:val="24"/>
+        </w:rPr>
+        <w:t>UltraPlonk</w:t>
+      </w:r>
+      <w:proofErr w:type="spellEnd"/>
+      <w:r>
+        <w:rPr>
+          <w:rFonts w:eastAsiaTheme="minorHAnsi" w:cstheme="minorBidi"/>
+          <w:b w:val="0"/>
+          <w:szCs w:val="24"/>
+        </w:rPr>
+        <w:t xml:space="preserve"> and </w:t>
+      </w:r>
+      <w:proofErr w:type="spellStart"/>
+      <w:r>
+        <w:rPr>
+          <w:rFonts w:eastAsiaTheme="minorHAnsi" w:cstheme="minorBidi"/>
+          <w:b w:val="0"/>
+          <w:szCs w:val="24"/>
+        </w:rPr>
+        <w:t>UltraHonk</w:t>
+      </w:r>
+      <w:proofErr w:type="spellEnd"/>
+      <w:r>
+        <w:rPr>
+          <w:rFonts w:eastAsiaTheme="minorHAnsi" w:cstheme="minorBidi"/>
+          <w:b w:val="0"/>
+          <w:szCs w:val="24"/>
+        </w:rPr>
+        <w:t>, it should do so only under controlled conditions: equivalent circuit functionality, the same input distributions, fixed tool versions, and identical measurement procedures.</w:t>
+      </w:r>
+    </w:p>
+    <w:p>
+      <w:pPr>
+        <w:pStyle w:val="Heading3"/>
+        <w:jc w:val="both"/>
+        <w:rPr>
+          <w:rFonts w:eastAsiaTheme="minorHAnsi" w:cstheme="minorBidi"/>
+          <w:b w:val="0"/>
+          <w:szCs w:val="24"/>
+        </w:rPr>
+      </w:pPr>
+      <w:r>
+        <w:rPr>
+          <w:rFonts w:eastAsiaTheme="minorHAnsi" w:cstheme="minorBidi"/>
+          <w:b w:val="0"/>
+          <w:szCs w:val="24"/>
+        </w:rPr>
+        <w:t xml:space="preserve">The literature review should avoid stating that one proving system is universally faster or cheaper. Such a claim would be technically weak because performance depends on circuit composition, lookup tables, public inputs, transcript configuration, curve operations, compiler </w:t>
+      </w:r>
+      <w:proofErr w:type="spellStart"/>
+      <w:r>
+        <w:rPr>
+          <w:rFonts w:eastAsiaTheme="minorHAnsi" w:cstheme="minorBidi"/>
+          <w:b w:val="0"/>
+          <w:szCs w:val="24"/>
+        </w:rPr>
+        <w:t>optimisations</w:t>
+      </w:r>
+      <w:proofErr w:type="spellEnd"/>
+      <w:r>
+        <w:rPr>
+          <w:rFonts w:eastAsiaTheme="minorHAnsi" w:cstheme="minorBidi"/>
+          <w:b w:val="0"/>
+          <w:szCs w:val="24"/>
+        </w:rPr>
+        <w:t>, backend implementation, and hardware. The study should instead establish measured results for its selected attribute-credential circuit.</w:t>
+      </w:r>
+    </w:p>
+    <w:p>
+      <w:pPr>
+        <w:pStyle w:val="Heading3"/>
+        <w:jc w:val="both"/>
+      </w:pPr>
+      <w:r>
+        <w:t>2.4 Blockchain Integration: Ethereum Verification Environment</w:t>
+      </w:r>
+    </w:p>
+    <w:p>
+      <w:pPr>
+        <w:jc w:val="both"/>
+      </w:pPr>
+      <w:r>
+        <w:t>Verifying ZK-SNARK proofs on public blockchains requires balancing cryptographic execution against resource constraints.</w:t>
+      </w:r>
+      <w:r>
+        <w:t xml:space="preserve"> </w:t>
+      </w:r>
+      <w:r>
+        <w:t xml:space="preserve">Ethereum provides a </w:t>
+      </w:r>
+      <w:proofErr w:type="spellStart"/>
+      <w:r>
+        <w:t>decentralised</w:t>
+      </w:r>
+      <w:proofErr w:type="spellEnd"/>
+      <w:r>
+        <w:t xml:space="preserve"> environment for executing smart contracts, but all contract execution consumes gas. Gas represents the computational and storage resources required to process a transaction. In a zero-knowledge credential system, the user usually generates the proof off-chain, while Ethereum verifies the proof through a verifier smart contract.</w:t>
+      </w:r>
+    </w:p>
+    <w:p>
+      <w:pPr>
+        <w:jc w:val="both"/>
+      </w:pPr>
+      <w:r>
+        <w:t>The on-chain verification cost consists of more than the core cryptographic verification operation. It can include:</w:t>
       </w:r>
     </w:p>
     <w:p>
@@ -446,35 +1501,13 @@
         <w:pStyle w:val="ListParagraph"/>
         <w:numPr>
           <w:ilvl w:val="0"/>
-          <w:numId w:val="3"/>
+          <w:numId w:val="14"/>
         </w:numPr>
-      </w:pPr>
-      <w:proofErr w:type="spellStart"/>
-      <w:r>
-        <w:t>UltraPlonk</w:t>
-      </w:r>
-      <w:proofErr w:type="spellEnd"/>
-      <w:r>
-        <w:t xml:space="preserve">: Utilizes </w:t>
-      </w:r>
-      <w:proofErr w:type="spellStart"/>
-      <w:r>
-        <w:t>Plookup</w:t>
-      </w:r>
-      <w:proofErr w:type="spellEnd"/>
-      <w:r>
-        <w:t xml:space="preserve"> tables, custom gates, and KZG (Kate-</w:t>
-      </w:r>
-      <w:proofErr w:type="spellStart"/>
-      <w:r>
-        <w:t>Zaverucha</w:t>
-      </w:r>
-      <w:proofErr w:type="spellEnd"/>
-      <w:r>
-        <w:t>-Goldberg) polynomial commitments over the BN254 curve.</w:t>
-      </w:r>
-      <w:r>
-        <w:t xml:space="preserve"> </w:t>
+        <w:jc w:val="both"/>
+      </w:pPr>
+      <w:r>
+        <w:lastRenderedPageBreak/>
+        <w:t>Transaction calldata for the proof and public inputs.</w:t>
       </w:r>
     </w:p>
     <w:p>
@@ -482,57 +1515,993 @@
         <w:pStyle w:val="ListParagraph"/>
         <w:numPr>
           <w:ilvl w:val="0"/>
-          <w:numId w:val="3"/>
+          <w:numId w:val="14"/>
         </w:numPr>
-      </w:pPr>
-      <w:proofErr w:type="spellStart"/>
-      <w:r>
-        <w:lastRenderedPageBreak/>
-        <w:t>UltraHonk</w:t>
-      </w:r>
-      <w:proofErr w:type="spellEnd"/>
-      <w:r>
-        <w:t xml:space="preserve">: An advanced proving system that replaces standard </w:t>
-      </w:r>
-      <w:proofErr w:type="spellStart"/>
-      <w:r>
-        <w:t>PlonKish</w:t>
-      </w:r>
-      <w:proofErr w:type="spellEnd"/>
-      <w:r>
-        <w:t xml:space="preserve"> structures with </w:t>
-      </w:r>
-      <w:proofErr w:type="spellStart"/>
-      <w:r>
-        <w:t>sumcheck</w:t>
-      </w:r>
-      <w:proofErr w:type="spellEnd"/>
-      <w:r>
-        <w:t>-based polynomial protocols, decreasing client-side proving time and memory usage.</w:t>
+        <w:jc w:val="both"/>
+      </w:pPr>
+      <w:r>
+        <w:t>ABI decoding and memory expansion.</w:t>
+      </w:r>
+    </w:p>
+    <w:p>
+      <w:pPr>
+        <w:pStyle w:val="ListParagraph"/>
+        <w:numPr>
+          <w:ilvl w:val="0"/>
+          <w:numId w:val="14"/>
+        </w:numPr>
+        <w:jc w:val="both"/>
+      </w:pPr>
+      <w:r>
+        <w:t>Public-input validation.</w:t>
+      </w:r>
+    </w:p>
+    <w:p>
+      <w:pPr>
+        <w:pStyle w:val="ListParagraph"/>
+        <w:numPr>
+          <w:ilvl w:val="0"/>
+          <w:numId w:val="14"/>
+        </w:numPr>
+        <w:jc w:val="both"/>
+      </w:pPr>
+      <w:r>
+        <w:t>Elliptic-curve operations.</w:t>
+      </w:r>
+    </w:p>
+    <w:p>
+      <w:pPr>
+        <w:pStyle w:val="ListParagraph"/>
+        <w:numPr>
+          <w:ilvl w:val="0"/>
+          <w:numId w:val="14"/>
+        </w:numPr>
+        <w:jc w:val="both"/>
+      </w:pPr>
+      <w:r>
+        <w:t>Pairing checks.</w:t>
+      </w:r>
+    </w:p>
+    <w:p>
+      <w:pPr>
+        <w:pStyle w:val="ListParagraph"/>
+        <w:numPr>
+          <w:ilvl w:val="0"/>
+          <w:numId w:val="14"/>
+        </w:numPr>
+        <w:jc w:val="both"/>
+      </w:pPr>
+      <w:r>
+        <w:t>Contract control flow.</w:t>
+      </w:r>
+    </w:p>
+    <w:p>
+      <w:pPr>
+        <w:jc w:val="both"/>
+      </w:pPr>
+      <w:r>
+        <w:t>Storage reads or writes, where credential registries, issuer keys, revocation roots, or nullifiers are maintained.</w:t>
+      </w:r>
+    </w:p>
+    <w:p>
+      <w:pPr>
+        <w:jc w:val="both"/>
+      </w:pPr>
+      <w:r>
+        <w:t>Ethereum includes elliptic-curve precompiled contracts at standard addresses for BN254 point addition, scalar multiplication, and pairing checks. These precompiles are central to efficient on-chain verification of many SNARK constructions because executing equivalent elliptic-curve mathematics directly in Solidity would be substantially more expensive.</w:t>
+      </w:r>
+    </w:p>
+    <w:p>
+      <w:pPr>
+        <w:jc w:val="both"/>
+      </w:pPr>
+      <w:r>
+        <w:t xml:space="preserve">The gas costs often reported for precompiles </w:t>
+      </w:r>
+      <w:proofErr w:type="gramStart"/>
+      <w:r>
+        <w:t>require</w:t>
+      </w:r>
+      <w:proofErr w:type="gramEnd"/>
+      <w:r>
+        <w:t xml:space="preserve"> caution. EIP-196 originally proposed 500 </w:t>
+      </w:r>
+      <w:proofErr w:type="gramStart"/>
+      <w:r>
+        <w:t>gas</w:t>
+      </w:r>
+      <w:proofErr w:type="gramEnd"/>
+      <w:r>
+        <w:t xml:space="preserve"> for elliptic-curve addition and 40,000 </w:t>
+      </w:r>
+      <w:proofErr w:type="gramStart"/>
+      <w:r>
+        <w:t>gas</w:t>
+      </w:r>
+      <w:proofErr w:type="gramEnd"/>
+      <w:r>
+        <w:t xml:space="preserve"> for scalar multiplication</w:t>
+      </w:r>
+      <w:r>
+        <w:t xml:space="preserve"> and</w:t>
+      </w:r>
+      <w:r>
+        <w:t xml:space="preserve"> later protocol changes altered the effective gas schedule on Ethereum networks. A dissertation must state the network, hard-fork rules, execution client, verifier implementation, and measurement method used. It should not report a gas figure as universally applicable across all Ethereum environments</w:t>
+      </w:r>
+      <w:r>
+        <w:t>.</w:t>
       </w:r>
     </w:p>
     <w:p>
       <w:pPr>
         <w:pStyle w:val="Heading3"/>
-      </w:pPr>
-      <w:r>
-        <w:t>2.4 Blockchain Integration: Ethereum Verification Environment</w:t>
-      </w:r>
-    </w:p>
-    <w:p>
-      <w:r>
-        <w:t>Verifying ZK-SNARK proofs on public blockchains requires balancing cryptographic execution against resource constraints.</w:t>
+        <w:jc w:val="both"/>
+      </w:pPr>
+      <w:r>
+        <w:t xml:space="preserve">2.4.1 </w:t>
+      </w:r>
+      <w:r>
+        <w:t>Performance Evaluation Criteria</w:t>
+      </w:r>
+    </w:p>
+    <w:p>
+      <w:pPr>
+        <w:jc w:val="both"/>
+      </w:pPr>
+      <w:r>
+        <w:t xml:space="preserve">The study’s central contribution should be an empirical evaluation rather than a general statement that one technology is </w:t>
+      </w:r>
+      <w:r>
+        <w:t>“</w:t>
+      </w:r>
+      <w:r>
+        <w:t>efficient”</w:t>
+      </w:r>
+      <w:r>
+        <w:t>.</w:t>
+      </w:r>
+      <w:r>
+        <w:t xml:space="preserve"> The following metrics provide a suitable framework</w:t>
+      </w:r>
+      <w:r>
+        <w:t>:</w:t>
+      </w:r>
+    </w:p>
+    <w:tbl>
+      <w:tblPr>
+        <w:tblStyle w:val="TableGrid"/>
+        <w:tblW w:w="5000" w:type="pct"/>
+        <w:tblLook w:val="04A0" w:firstRow="1" w:lastRow="0" w:firstColumn="1" w:lastColumn="0" w:noHBand="0" w:noVBand="1"/>
+      </w:tblPr>
+      <w:tblGrid>
+        <w:gridCol w:w="1787"/>
+        <w:gridCol w:w="3286"/>
+        <w:gridCol w:w="3557"/>
+      </w:tblGrid>
+      <w:tr>
+        <w:tc>
+          <w:tcPr>
+            <w:tcW w:w="0" w:type="auto"/>
+            <w:hideMark/>
+          </w:tcPr>
+          <w:p>
+            <w:pPr>
+              <w:spacing w:line="240" w:lineRule="auto"/>
+              <w:jc w:val="both"/>
+              <w:rPr>
+                <w:rFonts w:eastAsia="Times New Roman" w:cs="Times New Roman"/>
+                <w:b/>
+                <w:bCs/>
+                <w:kern w:val="0"/>
+                <w14:ligatures w14:val="none"/>
+              </w:rPr>
+            </w:pPr>
+            <w:r>
+              <w:rPr>
+                <w:rFonts w:eastAsia="Times New Roman" w:cs="Times New Roman"/>
+                <w:b/>
+                <w:bCs/>
+                <w:kern w:val="0"/>
+                <w14:ligatures w14:val="none"/>
+              </w:rPr>
+              <w:t>Metric</w:t>
+            </w:r>
+          </w:p>
+        </w:tc>
+        <w:tc>
+          <w:tcPr>
+            <w:tcW w:w="0" w:type="auto"/>
+            <w:hideMark/>
+          </w:tcPr>
+          <w:p>
+            <w:pPr>
+              <w:spacing w:line="240" w:lineRule="auto"/>
+              <w:jc w:val="both"/>
+              <w:rPr>
+                <w:rFonts w:eastAsia="Times New Roman" w:cs="Times New Roman"/>
+                <w:b/>
+                <w:bCs/>
+                <w:kern w:val="0"/>
+                <w14:ligatures w14:val="none"/>
+              </w:rPr>
+            </w:pPr>
+            <w:r>
+              <w:rPr>
+                <w:rFonts w:eastAsia="Times New Roman" w:cs="Times New Roman"/>
+                <w:b/>
+                <w:bCs/>
+                <w:kern w:val="0"/>
+                <w14:ligatures w14:val="none"/>
+              </w:rPr>
+              <w:t>Meaning</w:t>
+            </w:r>
+          </w:p>
+        </w:tc>
+        <w:tc>
+          <w:tcPr>
+            <w:tcW w:w="0" w:type="auto"/>
+            <w:hideMark/>
+          </w:tcPr>
+          <w:p>
+            <w:pPr>
+              <w:spacing w:line="240" w:lineRule="auto"/>
+              <w:jc w:val="both"/>
+              <w:rPr>
+                <w:rFonts w:eastAsia="Times New Roman" w:cs="Times New Roman"/>
+                <w:b/>
+                <w:bCs/>
+                <w:kern w:val="0"/>
+                <w14:ligatures w14:val="none"/>
+              </w:rPr>
+            </w:pPr>
+            <w:r>
+              <w:rPr>
+                <w:rFonts w:eastAsia="Times New Roman" w:cs="Times New Roman"/>
+                <w:b/>
+                <w:bCs/>
+                <w:kern w:val="0"/>
+                <w14:ligatures w14:val="none"/>
+              </w:rPr>
+              <w:t>Relevance to the study</w:t>
+            </w:r>
+          </w:p>
+        </w:tc>
+      </w:tr>
+      <w:tr>
+        <w:tc>
+          <w:tcPr>
+            <w:tcW w:w="0" w:type="auto"/>
+            <w:hideMark/>
+          </w:tcPr>
+          <w:p>
+            <w:pPr>
+              <w:spacing w:line="240" w:lineRule="auto"/>
+              <w:jc w:val="both"/>
+              <w:rPr>
+                <w:rFonts w:eastAsia="Times New Roman" w:cs="Times New Roman"/>
+                <w:kern w:val="0"/>
+                <w14:ligatures w14:val="none"/>
+              </w:rPr>
+            </w:pPr>
+            <w:r>
+              <w:rPr>
+                <w:rFonts w:eastAsia="Times New Roman" w:cs="Times New Roman"/>
+                <w:kern w:val="0"/>
+                <w14:ligatures w14:val="none"/>
+              </w:rPr>
+              <w:t>Circuit size</w:t>
+            </w:r>
+          </w:p>
+        </w:tc>
+        <w:tc>
+          <w:tcPr>
+            <w:tcW w:w="0" w:type="auto"/>
+            <w:hideMark/>
+          </w:tcPr>
+          <w:p>
+            <w:pPr>
+              <w:spacing w:line="240" w:lineRule="auto"/>
+              <w:jc w:val="both"/>
+              <w:rPr>
+                <w:rFonts w:eastAsia="Times New Roman" w:cs="Times New Roman"/>
+                <w:kern w:val="0"/>
+                <w14:ligatures w14:val="none"/>
+              </w:rPr>
+            </w:pPr>
+            <w:r>
+              <w:rPr>
+                <w:rFonts w:eastAsia="Times New Roman" w:cs="Times New Roman"/>
+                <w:kern w:val="0"/>
+                <w14:ligatures w14:val="none"/>
+              </w:rPr>
+              <w:t>Number of constraints or equivalent backend complexity measure</w:t>
+            </w:r>
+          </w:p>
+        </w:tc>
+        <w:tc>
+          <w:tcPr>
+            <w:tcW w:w="0" w:type="auto"/>
+            <w:hideMark/>
+          </w:tcPr>
+          <w:p>
+            <w:pPr>
+              <w:spacing w:line="240" w:lineRule="auto"/>
+              <w:jc w:val="both"/>
+              <w:rPr>
+                <w:rFonts w:eastAsia="Times New Roman" w:cs="Times New Roman"/>
+                <w:kern w:val="0"/>
+                <w14:ligatures w14:val="none"/>
+              </w:rPr>
+            </w:pPr>
+            <w:r>
+              <w:rPr>
+                <w:rFonts w:eastAsia="Times New Roman" w:cs="Times New Roman"/>
+                <w:kern w:val="0"/>
+                <w14:ligatures w14:val="none"/>
+              </w:rPr>
+              <w:t>Indicates the computational complexity imposed on the proving system</w:t>
+            </w:r>
+          </w:p>
+        </w:tc>
+      </w:tr>
+      <w:tr>
+        <w:tc>
+          <w:tcPr>
+            <w:tcW w:w="0" w:type="auto"/>
+            <w:hideMark/>
+          </w:tcPr>
+          <w:p>
+            <w:pPr>
+              <w:spacing w:line="240" w:lineRule="auto"/>
+              <w:jc w:val="both"/>
+              <w:rPr>
+                <w:rFonts w:eastAsia="Times New Roman" w:cs="Times New Roman"/>
+                <w:kern w:val="0"/>
+                <w14:ligatures w14:val="none"/>
+              </w:rPr>
+            </w:pPr>
+            <w:r>
+              <w:rPr>
+                <w:rFonts w:eastAsia="Times New Roman" w:cs="Times New Roman"/>
+                <w:kern w:val="0"/>
+                <w14:ligatures w14:val="none"/>
+              </w:rPr>
+              <w:t>Witness-generation time</w:t>
+            </w:r>
+          </w:p>
+        </w:tc>
+        <w:tc>
+          <w:tcPr>
+            <w:tcW w:w="0" w:type="auto"/>
+            <w:hideMark/>
+          </w:tcPr>
+          <w:p>
+            <w:pPr>
+              <w:spacing w:line="240" w:lineRule="auto"/>
+              <w:jc w:val="both"/>
+              <w:rPr>
+                <w:rFonts w:eastAsia="Times New Roman" w:cs="Times New Roman"/>
+                <w:kern w:val="0"/>
+                <w14:ligatures w14:val="none"/>
+              </w:rPr>
+            </w:pPr>
+            <w:r>
+              <w:rPr>
+                <w:rFonts w:eastAsia="Times New Roman" w:cs="Times New Roman"/>
+                <w:kern w:val="0"/>
+                <w14:ligatures w14:val="none"/>
+              </w:rPr>
+              <w:t>Time required to compute valid circuit inputs</w:t>
+            </w:r>
+          </w:p>
+        </w:tc>
+        <w:tc>
+          <w:tcPr>
+            <w:tcW w:w="0" w:type="auto"/>
+            <w:hideMark/>
+          </w:tcPr>
+          <w:p>
+            <w:pPr>
+              <w:spacing w:line="240" w:lineRule="auto"/>
+              <w:jc w:val="both"/>
+              <w:rPr>
+                <w:rFonts w:eastAsia="Times New Roman" w:cs="Times New Roman"/>
+                <w:kern w:val="0"/>
+                <w14:ligatures w14:val="none"/>
+              </w:rPr>
+            </w:pPr>
+            <w:r>
+              <w:rPr>
+                <w:rFonts w:eastAsia="Times New Roman" w:cs="Times New Roman"/>
+                <w:kern w:val="0"/>
+                <w14:ligatures w14:val="none"/>
+              </w:rPr>
+              <w:t>Affects the client-side user experience</w:t>
+            </w:r>
+          </w:p>
+        </w:tc>
+      </w:tr>
+      <w:tr>
+        <w:tc>
+          <w:tcPr>
+            <w:tcW w:w="0" w:type="auto"/>
+            <w:hideMark/>
+          </w:tcPr>
+          <w:p>
+            <w:pPr>
+              <w:spacing w:line="240" w:lineRule="auto"/>
+              <w:jc w:val="both"/>
+              <w:rPr>
+                <w:rFonts w:eastAsia="Times New Roman" w:cs="Times New Roman"/>
+                <w:kern w:val="0"/>
+                <w14:ligatures w14:val="none"/>
+              </w:rPr>
+            </w:pPr>
+            <w:r>
+              <w:rPr>
+                <w:rFonts w:eastAsia="Times New Roman" w:cs="Times New Roman"/>
+                <w:kern w:val="0"/>
+                <w14:ligatures w14:val="none"/>
+              </w:rPr>
+              <w:t>Proof-generation time</w:t>
+            </w:r>
+          </w:p>
+        </w:tc>
+        <w:tc>
+          <w:tcPr>
+            <w:tcW w:w="0" w:type="auto"/>
+            <w:hideMark/>
+          </w:tcPr>
+          <w:p>
+            <w:pPr>
+              <w:spacing w:line="240" w:lineRule="auto"/>
+              <w:jc w:val="both"/>
+              <w:rPr>
+                <w:rFonts w:eastAsia="Times New Roman" w:cs="Times New Roman"/>
+                <w:kern w:val="0"/>
+                <w14:ligatures w14:val="none"/>
+              </w:rPr>
+            </w:pPr>
+            <w:r>
+              <w:rPr>
+                <w:rFonts w:eastAsia="Times New Roman" w:cs="Times New Roman"/>
+                <w:kern w:val="0"/>
+                <w14:ligatures w14:val="none"/>
+              </w:rPr>
+              <w:t>Time required to create a zero-knowledge proof</w:t>
+            </w:r>
+          </w:p>
+        </w:tc>
+        <w:tc>
+          <w:tcPr>
+            <w:tcW w:w="0" w:type="auto"/>
+            <w:hideMark/>
+          </w:tcPr>
+          <w:p>
+            <w:pPr>
+              <w:spacing w:line="240" w:lineRule="auto"/>
+              <w:jc w:val="both"/>
+              <w:rPr>
+                <w:rFonts w:eastAsia="Times New Roman" w:cs="Times New Roman"/>
+                <w:kern w:val="0"/>
+                <w14:ligatures w14:val="none"/>
+              </w:rPr>
+            </w:pPr>
+            <w:r>
+              <w:rPr>
+                <w:rFonts w:eastAsia="Times New Roman" w:cs="Times New Roman"/>
+                <w:kern w:val="0"/>
+                <w14:ligatures w14:val="none"/>
+              </w:rPr>
+              <w:t>Often the dominant off-chain cost</w:t>
+            </w:r>
+          </w:p>
+        </w:tc>
+      </w:tr>
+      <w:tr>
+        <w:tc>
+          <w:tcPr>
+            <w:tcW w:w="0" w:type="auto"/>
+            <w:hideMark/>
+          </w:tcPr>
+          <w:p>
+            <w:pPr>
+              <w:spacing w:line="240" w:lineRule="auto"/>
+              <w:jc w:val="both"/>
+              <w:rPr>
+                <w:rFonts w:eastAsia="Times New Roman" w:cs="Times New Roman"/>
+                <w:kern w:val="0"/>
+                <w14:ligatures w14:val="none"/>
+              </w:rPr>
+            </w:pPr>
+            <w:r>
+              <w:rPr>
+                <w:rFonts w:eastAsia="Times New Roman" w:cs="Times New Roman"/>
+                <w:kern w:val="0"/>
+                <w14:ligatures w14:val="none"/>
+              </w:rPr>
+              <w:lastRenderedPageBreak/>
+              <w:t>Peak memory use</w:t>
+            </w:r>
+          </w:p>
+        </w:tc>
+        <w:tc>
+          <w:tcPr>
+            <w:tcW w:w="0" w:type="auto"/>
+            <w:hideMark/>
+          </w:tcPr>
+          <w:p>
+            <w:pPr>
+              <w:spacing w:line="240" w:lineRule="auto"/>
+              <w:jc w:val="both"/>
+              <w:rPr>
+                <w:rFonts w:eastAsia="Times New Roman" w:cs="Times New Roman"/>
+                <w:kern w:val="0"/>
+                <w14:ligatures w14:val="none"/>
+              </w:rPr>
+            </w:pPr>
+            <w:r>
+              <w:rPr>
+                <w:rFonts w:eastAsia="Times New Roman" w:cs="Times New Roman"/>
+                <w:kern w:val="0"/>
+                <w14:ligatures w14:val="none"/>
+              </w:rPr>
+              <w:t>Highest memory consumed during proving</w:t>
+            </w:r>
+          </w:p>
+        </w:tc>
+        <w:tc>
+          <w:tcPr>
+            <w:tcW w:w="0" w:type="auto"/>
+            <w:hideMark/>
+          </w:tcPr>
+          <w:p>
+            <w:pPr>
+              <w:spacing w:line="240" w:lineRule="auto"/>
+              <w:jc w:val="both"/>
+              <w:rPr>
+                <w:rFonts w:eastAsia="Times New Roman" w:cs="Times New Roman"/>
+                <w:kern w:val="0"/>
+                <w14:ligatures w14:val="none"/>
+              </w:rPr>
+            </w:pPr>
+            <w:r>
+              <w:rPr>
+                <w:rFonts w:eastAsia="Times New Roman" w:cs="Times New Roman"/>
+                <w:kern w:val="0"/>
+                <w14:ligatures w14:val="none"/>
+              </w:rPr>
+              <w:t>Determines feasibility on laptops, browsers, and mobile-class devices</w:t>
+            </w:r>
+          </w:p>
+        </w:tc>
+      </w:tr>
+      <w:tr>
+        <w:tc>
+          <w:tcPr>
+            <w:tcW w:w="0" w:type="auto"/>
+            <w:hideMark/>
+          </w:tcPr>
+          <w:p>
+            <w:pPr>
+              <w:spacing w:line="240" w:lineRule="auto"/>
+              <w:jc w:val="both"/>
+              <w:rPr>
+                <w:rFonts w:eastAsia="Times New Roman" w:cs="Times New Roman"/>
+                <w:kern w:val="0"/>
+                <w14:ligatures w14:val="none"/>
+              </w:rPr>
+            </w:pPr>
+            <w:r>
+              <w:rPr>
+                <w:rFonts w:eastAsia="Times New Roman" w:cs="Times New Roman"/>
+                <w:kern w:val="0"/>
+                <w14:ligatures w14:val="none"/>
+              </w:rPr>
+              <w:t>Proof size</w:t>
+            </w:r>
+          </w:p>
+        </w:tc>
+        <w:tc>
+          <w:tcPr>
+            <w:tcW w:w="0" w:type="auto"/>
+            <w:hideMark/>
+          </w:tcPr>
+          <w:p>
+            <w:pPr>
+              <w:spacing w:line="240" w:lineRule="auto"/>
+              <w:jc w:val="both"/>
+              <w:rPr>
+                <w:rFonts w:eastAsia="Times New Roman" w:cs="Times New Roman"/>
+                <w:kern w:val="0"/>
+                <w14:ligatures w14:val="none"/>
+              </w:rPr>
+            </w:pPr>
+            <w:r>
+              <w:rPr>
+                <w:rFonts w:eastAsia="Times New Roman" w:cs="Times New Roman"/>
+                <w:kern w:val="0"/>
+                <w14:ligatures w14:val="none"/>
+              </w:rPr>
+              <w:t>Serialized size of the generated proof</w:t>
+            </w:r>
+          </w:p>
+        </w:tc>
+        <w:tc>
+          <w:tcPr>
+            <w:tcW w:w="0" w:type="auto"/>
+            <w:hideMark/>
+          </w:tcPr>
+          <w:p>
+            <w:pPr>
+              <w:spacing w:line="240" w:lineRule="auto"/>
+              <w:jc w:val="both"/>
+              <w:rPr>
+                <w:rFonts w:eastAsia="Times New Roman" w:cs="Times New Roman"/>
+                <w:kern w:val="0"/>
+                <w14:ligatures w14:val="none"/>
+              </w:rPr>
+            </w:pPr>
+            <w:r>
+              <w:rPr>
+                <w:rFonts w:eastAsia="Times New Roman" w:cs="Times New Roman"/>
+                <w:kern w:val="0"/>
+                <w14:ligatures w14:val="none"/>
+              </w:rPr>
+              <w:t>Influences storage, transmission, and Ethereum calldata cost</w:t>
+            </w:r>
+          </w:p>
+        </w:tc>
+      </w:tr>
+      <w:tr>
+        <w:tc>
+          <w:tcPr>
+            <w:tcW w:w="0" w:type="auto"/>
+            <w:hideMark/>
+          </w:tcPr>
+          <w:p>
+            <w:pPr>
+              <w:spacing w:line="240" w:lineRule="auto"/>
+              <w:jc w:val="both"/>
+              <w:rPr>
+                <w:rFonts w:eastAsia="Times New Roman" w:cs="Times New Roman"/>
+                <w:kern w:val="0"/>
+                <w14:ligatures w14:val="none"/>
+              </w:rPr>
+            </w:pPr>
+            <w:r>
+              <w:rPr>
+                <w:rFonts w:eastAsia="Times New Roman" w:cs="Times New Roman"/>
+                <w:kern w:val="0"/>
+                <w14:ligatures w14:val="none"/>
+              </w:rPr>
+              <w:t>Local verification time</w:t>
+            </w:r>
+          </w:p>
+        </w:tc>
+        <w:tc>
+          <w:tcPr>
+            <w:tcW w:w="0" w:type="auto"/>
+            <w:hideMark/>
+          </w:tcPr>
+          <w:p>
+            <w:pPr>
+              <w:spacing w:line="240" w:lineRule="auto"/>
+              <w:jc w:val="both"/>
+              <w:rPr>
+                <w:rFonts w:eastAsia="Times New Roman" w:cs="Times New Roman"/>
+                <w:kern w:val="0"/>
+                <w14:ligatures w14:val="none"/>
+              </w:rPr>
+            </w:pPr>
+            <w:r>
+              <w:rPr>
+                <w:rFonts w:eastAsia="Times New Roman" w:cs="Times New Roman"/>
+                <w:kern w:val="0"/>
+                <w14:ligatures w14:val="none"/>
+              </w:rPr>
+              <w:t>Time to verify the proof outside Ethereum</w:t>
+            </w:r>
+          </w:p>
+        </w:tc>
+        <w:tc>
+          <w:tcPr>
+            <w:tcW w:w="0" w:type="auto"/>
+            <w:hideMark/>
+          </w:tcPr>
+          <w:p>
+            <w:pPr>
+              <w:spacing w:line="240" w:lineRule="auto"/>
+              <w:jc w:val="both"/>
+              <w:rPr>
+                <w:rFonts w:eastAsia="Times New Roman" w:cs="Times New Roman"/>
+                <w:kern w:val="0"/>
+                <w14:ligatures w14:val="none"/>
+              </w:rPr>
+            </w:pPr>
+            <w:r>
+              <w:rPr>
+                <w:rFonts w:eastAsia="Times New Roman" w:cs="Times New Roman"/>
+                <w:kern w:val="0"/>
+                <w14:ligatures w14:val="none"/>
+              </w:rPr>
+              <w:t>Indicates the efficiency of the proof system’s verifier</w:t>
+            </w:r>
+          </w:p>
+        </w:tc>
+      </w:tr>
+      <w:tr>
+        <w:tc>
+          <w:tcPr>
+            <w:tcW w:w="0" w:type="auto"/>
+            <w:hideMark/>
+          </w:tcPr>
+          <w:p>
+            <w:pPr>
+              <w:spacing w:line="240" w:lineRule="auto"/>
+              <w:jc w:val="both"/>
+              <w:rPr>
+                <w:rFonts w:eastAsia="Times New Roman" w:cs="Times New Roman"/>
+                <w:kern w:val="0"/>
+                <w14:ligatures w14:val="none"/>
+              </w:rPr>
+            </w:pPr>
+            <w:r>
+              <w:rPr>
+                <w:rFonts w:eastAsia="Times New Roman" w:cs="Times New Roman"/>
+                <w:kern w:val="0"/>
+                <w14:ligatures w14:val="none"/>
+              </w:rPr>
+              <w:t>Ethereum gas usage</w:t>
+            </w:r>
+          </w:p>
+        </w:tc>
+        <w:tc>
+          <w:tcPr>
+            <w:tcW w:w="0" w:type="auto"/>
+            <w:hideMark/>
+          </w:tcPr>
+          <w:p>
+            <w:pPr>
+              <w:spacing w:line="240" w:lineRule="auto"/>
+              <w:jc w:val="both"/>
+              <w:rPr>
+                <w:rFonts w:eastAsia="Times New Roman" w:cs="Times New Roman"/>
+                <w:kern w:val="0"/>
+                <w14:ligatures w14:val="none"/>
+              </w:rPr>
+            </w:pPr>
+            <w:r>
+              <w:rPr>
+                <w:rFonts w:eastAsia="Times New Roman" w:cs="Times New Roman"/>
+                <w:kern w:val="0"/>
+                <w14:ligatures w14:val="none"/>
+              </w:rPr>
+              <w:t>Gas consumed by the verifier contract</w:t>
+            </w:r>
+          </w:p>
+        </w:tc>
+        <w:tc>
+          <w:tcPr>
+            <w:tcW w:w="0" w:type="auto"/>
+            <w:hideMark/>
+          </w:tcPr>
+          <w:p>
+            <w:pPr>
+              <w:spacing w:line="240" w:lineRule="auto"/>
+              <w:jc w:val="both"/>
+              <w:rPr>
+                <w:rFonts w:eastAsia="Times New Roman" w:cs="Times New Roman"/>
+                <w:kern w:val="0"/>
+                <w14:ligatures w14:val="none"/>
+              </w:rPr>
+            </w:pPr>
+            <w:r>
+              <w:rPr>
+                <w:rFonts w:eastAsia="Times New Roman" w:cs="Times New Roman"/>
+                <w:kern w:val="0"/>
+                <w14:ligatures w14:val="none"/>
+              </w:rPr>
+              <w:t>Determines on-chain transaction cost</w:t>
+            </w:r>
+          </w:p>
+        </w:tc>
+      </w:tr>
+      <w:tr>
+        <w:tc>
+          <w:tcPr>
+            <w:tcW w:w="0" w:type="auto"/>
+            <w:hideMark/>
+          </w:tcPr>
+          <w:p>
+            <w:pPr>
+              <w:spacing w:line="240" w:lineRule="auto"/>
+              <w:jc w:val="both"/>
+              <w:rPr>
+                <w:rFonts w:eastAsia="Times New Roman" w:cs="Times New Roman"/>
+                <w:kern w:val="0"/>
+                <w14:ligatures w14:val="none"/>
+              </w:rPr>
+            </w:pPr>
+            <w:r>
+              <w:rPr>
+                <w:rFonts w:eastAsia="Times New Roman" w:cs="Times New Roman"/>
+                <w:kern w:val="0"/>
+                <w14:ligatures w14:val="none"/>
+              </w:rPr>
+              <w:t>Transaction size</w:t>
+            </w:r>
+          </w:p>
+        </w:tc>
+        <w:tc>
+          <w:tcPr>
+            <w:tcW w:w="0" w:type="auto"/>
+            <w:hideMark/>
+          </w:tcPr>
+          <w:p>
+            <w:pPr>
+              <w:spacing w:line="240" w:lineRule="auto"/>
+              <w:jc w:val="both"/>
+              <w:rPr>
+                <w:rFonts w:eastAsia="Times New Roman" w:cs="Times New Roman"/>
+                <w:kern w:val="0"/>
+                <w14:ligatures w14:val="none"/>
+              </w:rPr>
+            </w:pPr>
+            <w:r>
+              <w:rPr>
+                <w:rFonts w:eastAsia="Times New Roman" w:cs="Times New Roman"/>
+                <w:kern w:val="0"/>
+                <w14:ligatures w14:val="none"/>
+              </w:rPr>
+              <w:t>Bytes submitted as calldata</w:t>
+            </w:r>
+          </w:p>
+        </w:tc>
+        <w:tc>
+          <w:tcPr>
+            <w:tcW w:w="0" w:type="auto"/>
+            <w:hideMark/>
+          </w:tcPr>
+          <w:p>
+            <w:pPr>
+              <w:spacing w:line="240" w:lineRule="auto"/>
+              <w:jc w:val="both"/>
+              <w:rPr>
+                <w:rFonts w:eastAsia="Times New Roman" w:cs="Times New Roman"/>
+                <w:kern w:val="0"/>
+                <w14:ligatures w14:val="none"/>
+              </w:rPr>
+            </w:pPr>
+            <w:r>
+              <w:rPr>
+                <w:rFonts w:eastAsia="Times New Roman" w:cs="Times New Roman"/>
+                <w:kern w:val="0"/>
+                <w14:ligatures w14:val="none"/>
+              </w:rPr>
+              <w:t>Affects gas cost and network overhead</w:t>
+            </w:r>
+          </w:p>
+        </w:tc>
+      </w:tr>
+      <w:tr>
+        <w:tc>
+          <w:tcPr>
+            <w:tcW w:w="0" w:type="auto"/>
+            <w:hideMark/>
+          </w:tcPr>
+          <w:p>
+            <w:pPr>
+              <w:spacing w:line="240" w:lineRule="auto"/>
+              <w:jc w:val="both"/>
+              <w:rPr>
+                <w:rFonts w:eastAsia="Times New Roman" w:cs="Times New Roman"/>
+                <w:kern w:val="0"/>
+                <w14:ligatures w14:val="none"/>
+              </w:rPr>
+            </w:pPr>
+            <w:r>
+              <w:rPr>
+                <w:rFonts w:eastAsia="Times New Roman" w:cs="Times New Roman"/>
+                <w:kern w:val="0"/>
+                <w14:ligatures w14:val="none"/>
+              </w:rPr>
+              <w:t>Scalability</w:t>
+            </w:r>
+          </w:p>
+        </w:tc>
+        <w:tc>
+          <w:tcPr>
+            <w:tcW w:w="0" w:type="auto"/>
+            <w:hideMark/>
+          </w:tcPr>
+          <w:p>
+            <w:pPr>
+              <w:spacing w:line="240" w:lineRule="auto"/>
+              <w:jc w:val="both"/>
+              <w:rPr>
+                <w:rFonts w:eastAsia="Times New Roman" w:cs="Times New Roman"/>
+                <w:kern w:val="0"/>
+                <w14:ligatures w14:val="none"/>
+              </w:rPr>
+            </w:pPr>
+            <w:r>
+              <w:rPr>
+                <w:rFonts w:eastAsia="Times New Roman" w:cs="Times New Roman"/>
+                <w:kern w:val="0"/>
+                <w14:ligatures w14:val="none"/>
+              </w:rPr>
+              <w:t>Change in performance as attributes or circuit complexity increase</w:t>
+            </w:r>
+          </w:p>
+        </w:tc>
+        <w:tc>
+          <w:tcPr>
+            <w:tcW w:w="0" w:type="auto"/>
+            <w:hideMark/>
+          </w:tcPr>
+          <w:p>
+            <w:pPr>
+              <w:spacing w:line="240" w:lineRule="auto"/>
+              <w:jc w:val="both"/>
+              <w:rPr>
+                <w:rFonts w:eastAsia="Times New Roman" w:cs="Times New Roman"/>
+                <w:kern w:val="0"/>
+                <w14:ligatures w14:val="none"/>
+              </w:rPr>
+            </w:pPr>
+            <w:r>
+              <w:rPr>
+                <w:rFonts w:eastAsia="Times New Roman" w:cs="Times New Roman"/>
+                <w:kern w:val="0"/>
+                <w14:ligatures w14:val="none"/>
+              </w:rPr>
+              <w:t>Shows whether the approach remains usable for realistic credentials</w:t>
+            </w:r>
+          </w:p>
+        </w:tc>
+      </w:tr>
+    </w:tbl>
+    <w:p>
+      <w:pPr>
+        <w:jc w:val="both"/>
+      </w:pPr>
+    </w:p>
+    <w:p>
+      <w:pPr>
+        <w:jc w:val="both"/>
+      </w:pPr>
+      <w:r>
+        <w:t>The project should run each benchmark repeatedly and report more than a single execution time. At minimum, it should state the number of trials and report a central measure such as median or mean, together with variability such as standard deviation, minimum and maximum values, or percentile ranges.</w:t>
+      </w:r>
+    </w:p>
+    <w:p>
+      <w:pPr>
+        <w:jc w:val="both"/>
+      </w:pPr>
+      <w:r>
+        <w:t>For example, if a circuit supports age verification, citizenship verification, and credential membership, the experiment could measure how proof-generation time changes as the circuit moves from one predicate to multiple predicates. A second experiment could evaluate how Ethereum gas changes as the number of public inputs increases. These results would reveal whether cost is driven primarily by private circuit complexity, public data, verifier design, or transaction encoding.</w:t>
       </w:r>
     </w:p>
     <w:p>
       <w:pPr>
         <w:pStyle w:val="Heading3"/>
-      </w:pPr>
-      <w:r>
-        <w:t>2.4.1 EVM Architecture and Gas Mechanics</w:t>
-      </w:r>
-    </w:p>
-    <w:p>
+        <w:jc w:val="both"/>
+      </w:pPr>
+      <w:r>
+        <w:t>2.4.</w:t>
+      </w:r>
+      <w:r>
+        <w:t>2</w:t>
+      </w:r>
+      <w:r>
+        <w:t xml:space="preserve"> EVM Architecture and Gas Mechanics</w:t>
+      </w:r>
+    </w:p>
+    <w:p>
+      <w:pPr>
+        <w:jc w:val="both"/>
+      </w:pPr>
       <w:r>
         <w:t>The Ethereum Virtual Machine (EVM) charges execution costs in Gas. Every operation (opcode) has a fixed or dynamic gas cost reflecting its computational overhead. On-chain ZK verification requires executing cryptographic primitives directly in EVM bytecode.  To reduce computational costs, Ethereum provides Precompiled Contracts—specialized state execution shortcuts implemented at fixed addresses:</w:t>
       </w:r>
@@ -544,6 +2513,7 @@
           <w:ilvl w:val="0"/>
           <w:numId w:val="4"/>
         </w:numPr>
+        <w:jc w:val="both"/>
       </w:pPr>
       <w:proofErr w:type="spellStart"/>
       <w:r>
@@ -571,6 +2541,7 @@
           <w:ilvl w:val="0"/>
           <w:numId w:val="4"/>
         </w:numPr>
+        <w:jc w:val="both"/>
       </w:pPr>
       <w:proofErr w:type="spellStart"/>
       <w:r>
@@ -595,6 +2566,7 @@
           <w:ilvl w:val="0"/>
           <w:numId w:val="4"/>
         </w:numPr>
+        <w:jc w:val="both"/>
       </w:pPr>
       <w:proofErr w:type="spellStart"/>
       <w:r>
@@ -602,6 +2574,7 @@
           <w:b/>
           <w:bCs/>
         </w:rPr>
+        <w:lastRenderedPageBreak/>
         <w:t>ecPairing</w:t>
       </w:r>
       <w:proofErr w:type="spellEnd"/>
@@ -612,42 +2585,47 @@
     <w:p>
       <w:pPr>
         <w:pStyle w:val="Heading3"/>
-      </w:pPr>
-      <w:r>
-        <w:t>2.4.2 Verification Cost Profiles across Proof Schemes</w:t>
+        <w:jc w:val="both"/>
+      </w:pPr>
+      <w:r>
+        <w:t>2.4.</w:t>
+      </w:r>
+      <w:r>
+        <w:t>3</w:t>
+      </w:r>
+      <w:r>
+        <w:t xml:space="preserve"> Verification Cost Profiles across Proof Schemes</w:t>
       </w:r>
     </w:p>
     <w:tbl>
       <w:tblPr>
         <w:tblStyle w:val="TableGrid"/>
-        <w:tblW w:w="11252" w:type="dxa"/>
-        <w:tblInd w:w="-3" w:type="dxa"/>
-        <w:tblLayout w:type="fixed"/>
+        <w:tblW w:w="0" w:type="auto"/>
         <w:tblLook w:val="04A0" w:firstRow="1" w:lastRow="0" w:firstColumn="1" w:lastColumn="0" w:noHBand="0" w:noVBand="1"/>
       </w:tblPr>
       <w:tblGrid>
-        <w:gridCol w:w="1417"/>
-        <w:gridCol w:w="1998"/>
-        <w:gridCol w:w="4050"/>
-        <w:gridCol w:w="3787"/>
+        <w:gridCol w:w="2139"/>
+        <w:gridCol w:w="2090"/>
+        <w:gridCol w:w="2234"/>
+        <w:gridCol w:w="2167"/>
       </w:tblGrid>
       <w:tr>
         <w:tc>
           <w:tcPr>
-            <w:tcW w:w="1417" w:type="dxa"/>
-            <w:tcBorders>
-              <w:top w:val="single" w:sz="6" w:space="0" w:color="C4C7C5"/>
-              <w:left w:val="single" w:sz="6" w:space="0" w:color="C4C7C5"/>
-              <w:bottom w:val="single" w:sz="6" w:space="0" w:color="C4C7C5"/>
-              <w:right w:val="single" w:sz="6" w:space="0" w:color="C4C7C5"/>
-            </w:tcBorders>
-            <w:vAlign w:val="center"/>
+            <w:tcW w:w="2337" w:type="dxa"/>
           </w:tcPr>
           <w:p>
+            <w:pPr>
+              <w:jc w:val="both"/>
+              <w:rPr>
+                <w:b/>
+                <w:bCs/>
+              </w:rPr>
+            </w:pPr>
             <w:r>
               <w:rPr>
-                <w:rStyle w:val="Strong"/>
-                <w:rFonts w:ascii="Arial" w:hAnsi="Arial" w:cs="Arial"/>
+                <w:b/>
+                <w:bCs/>
               </w:rPr>
               <w:t>Proof System</w:t>
             </w:r>
@@ -655,20 +2633,20 @@
         </w:tc>
         <w:tc>
           <w:tcPr>
-            <w:tcW w:w="1998" w:type="dxa"/>
-            <w:tcBorders>
-              <w:top w:val="single" w:sz="6" w:space="0" w:color="C4C7C5"/>
-              <w:left w:val="single" w:sz="6" w:space="0" w:color="C4C7C5"/>
-              <w:bottom w:val="single" w:sz="6" w:space="0" w:color="C4C7C5"/>
-              <w:right w:val="single" w:sz="6" w:space="0" w:color="C4C7C5"/>
-            </w:tcBorders>
-            <w:vAlign w:val="center"/>
+            <w:tcW w:w="2337" w:type="dxa"/>
           </w:tcPr>
           <w:p>
+            <w:pPr>
+              <w:jc w:val="both"/>
+              <w:rPr>
+                <w:b/>
+                <w:bCs/>
+              </w:rPr>
+            </w:pPr>
             <w:r>
               <w:rPr>
-                <w:rStyle w:val="Strong"/>
-                <w:rFonts w:ascii="Arial" w:hAnsi="Arial" w:cs="Arial"/>
+                <w:b/>
+                <w:bCs/>
               </w:rPr>
               <w:t>Proof Size (Bytes)</w:t>
             </w:r>
@@ -676,20 +2654,20 @@
         </w:tc>
         <w:tc>
           <w:tcPr>
-            <w:tcW w:w="4050" w:type="dxa"/>
-            <w:tcBorders>
-              <w:top w:val="single" w:sz="6" w:space="0" w:color="C4C7C5"/>
-              <w:left w:val="single" w:sz="6" w:space="0" w:color="C4C7C5"/>
-              <w:bottom w:val="single" w:sz="6" w:space="0" w:color="C4C7C5"/>
-              <w:right w:val="single" w:sz="6" w:space="0" w:color="C4C7C5"/>
-            </w:tcBorders>
-            <w:vAlign w:val="center"/>
+            <w:tcW w:w="2338" w:type="dxa"/>
           </w:tcPr>
           <w:p>
+            <w:pPr>
+              <w:jc w:val="both"/>
+              <w:rPr>
+                <w:b/>
+                <w:bCs/>
+              </w:rPr>
+            </w:pPr>
             <w:r>
               <w:rPr>
-                <w:rStyle w:val="Strong"/>
-                <w:rFonts w:ascii="Arial" w:hAnsi="Arial" w:cs="Arial"/>
+                <w:b/>
+                <w:bCs/>
               </w:rPr>
               <w:t>Dominant On-Chain Computations</w:t>
             </w:r>
@@ -697,20 +2675,20 @@
         </w:tc>
         <w:tc>
           <w:tcPr>
-            <w:tcW w:w="3787" w:type="dxa"/>
-            <w:tcBorders>
-              <w:top w:val="single" w:sz="6" w:space="0" w:color="C4C7C5"/>
-              <w:left w:val="single" w:sz="6" w:space="0" w:color="C4C7C5"/>
-              <w:bottom w:val="single" w:sz="6" w:space="0" w:color="C4C7C5"/>
-              <w:right w:val="single" w:sz="6" w:space="0" w:color="C4C7C5"/>
-            </w:tcBorders>
-            <w:vAlign w:val="center"/>
+            <w:tcW w:w="2338" w:type="dxa"/>
           </w:tcPr>
           <w:p>
+            <w:pPr>
+              <w:jc w:val="both"/>
+              <w:rPr>
+                <w:b/>
+                <w:bCs/>
+              </w:rPr>
+            </w:pPr>
             <w:r>
               <w:rPr>
-                <w:rStyle w:val="Strong"/>
-                <w:rFonts w:ascii="Arial" w:hAnsi="Arial" w:cs="Arial"/>
+                <w:b/>
+                <w:bCs/>
               </w:rPr>
               <w:t>Estimated EVM Verification Gas</w:t>
             </w:r>
@@ -720,148 +2698,80 @@
       <w:tr>
         <w:tc>
           <w:tcPr>
-            <w:tcW w:w="1417" w:type="dxa"/>
-            <w:tcBorders>
-              <w:top w:val="single" w:sz="6" w:space="0" w:color="C4C7C5"/>
-              <w:left w:val="single" w:sz="6" w:space="0" w:color="C4C7C5"/>
-              <w:bottom w:val="single" w:sz="6" w:space="0" w:color="C4C7C5"/>
-              <w:right w:val="single" w:sz="6" w:space="0" w:color="C4C7C5"/>
-            </w:tcBorders>
-            <w:vAlign w:val="center"/>
+            <w:tcW w:w="2337" w:type="dxa"/>
           </w:tcPr>
           <w:p>
+            <w:pPr>
+              <w:jc w:val="both"/>
+            </w:pPr>
             <w:r>
-              <w:rPr>
-                <w:rFonts w:ascii="Arial" w:hAnsi="Arial" w:cs="Arial"/>
-              </w:rPr>
               <w:t>Groth16</w:t>
             </w:r>
           </w:p>
         </w:tc>
         <w:tc>
           <w:tcPr>
-            <w:tcW w:w="1998" w:type="dxa"/>
-            <w:tcBorders>
-              <w:top w:val="single" w:sz="6" w:space="0" w:color="C4C7C5"/>
-              <w:left w:val="single" w:sz="6" w:space="0" w:color="C4C7C5"/>
-              <w:bottom w:val="single" w:sz="6" w:space="0" w:color="C4C7C5"/>
-              <w:right w:val="single" w:sz="6" w:space="0" w:color="C4C7C5"/>
-            </w:tcBorders>
-            <w:vAlign w:val="center"/>
+            <w:tcW w:w="2337" w:type="dxa"/>
           </w:tcPr>
           <w:p>
-            <m:oMathPara>
-              <m:oMath>
-                <m:r>
-                  <w:rPr>
-                    <w:rFonts w:ascii="Cambria Math" w:eastAsia="Times New Roman" w:hAnsi="Cambria Math" w:cs="Arial"/>
-                  </w:rPr>
-                  <m:t>∼128-256</m:t>
-                </m:r>
-              </m:oMath>
-            </m:oMathPara>
+            <w:pPr>
+              <w:jc w:val="both"/>
+            </w:pPr>
+            <w:r>
+              <w:rPr>
+                <w:rFonts w:ascii="Cambria Math" w:hAnsi="Cambria Math" w:cs="Cambria Math"/>
+              </w:rPr>
+              <w:t>∼</w:t>
+            </w:r>
+            <w:r>
+              <w:t>128-256</w:t>
+            </w:r>
           </w:p>
         </w:tc>
         <w:tc>
           <w:tcPr>
-            <w:tcW w:w="4050" w:type="dxa"/>
-            <w:tcBorders>
-              <w:top w:val="single" w:sz="6" w:space="0" w:color="C4C7C5"/>
-              <w:left w:val="single" w:sz="6" w:space="0" w:color="C4C7C5"/>
-              <w:bottom w:val="single" w:sz="6" w:space="0" w:color="C4C7C5"/>
-              <w:right w:val="single" w:sz="6" w:space="0" w:color="C4C7C5"/>
-            </w:tcBorders>
-            <w:vAlign w:val="center"/>
+            <w:tcW w:w="2338" w:type="dxa"/>
           </w:tcPr>
           <w:p>
-            <m:oMathPara>
-              <m:oMath>
-                <m:r>
-                  <w:rPr>
-                    <w:rFonts w:ascii="Cambria Math" w:eastAsia="Times New Roman" w:hAnsi="Cambria Math" w:cs="Arial"/>
-                  </w:rPr>
-                  <m:t>1</m:t>
-                </m:r>
-                <m:r>
-                  <m:rPr>
-                    <m:nor/>
-                  </m:rPr>
-                  <w:rPr>
-                    <w:rFonts w:ascii="Arial" w:eastAsia="Times New Roman" w:hAnsi="Arial" w:cs="Arial"/>
-                  </w:rPr>
-                  <m:t> Pairing check (4 pairs)</m:t>
-                </m:r>
-                <m:r>
-                  <w:rPr>
-                    <w:rFonts w:ascii="Cambria Math" w:eastAsia="Times New Roman" w:hAnsi="Cambria Math" w:cs="Arial"/>
-                  </w:rPr>
-                  <m:t>,</m:t>
-                </m:r>
-                <m:r>
-                  <m:rPr>
-                    <m:nor/>
-                  </m:rPr>
-                  <w:rPr>
-                    <w:rFonts w:ascii="Arial" w:eastAsia="Times New Roman" w:hAnsi="Arial" w:cs="Arial"/>
-                  </w:rPr>
-                  <m:t> Scalar Multiplications</m:t>
-                </m:r>
-              </m:oMath>
-            </m:oMathPara>
+            <w:pPr>
+              <w:jc w:val="both"/>
+            </w:pPr>
+            <w:r>
+              <w:t xml:space="preserve">1" Pairing check (4 pairs)"," Scalar Multiplications" </w:t>
+            </w:r>
           </w:p>
         </w:tc>
         <w:tc>
           <w:tcPr>
-            <w:tcW w:w="3787" w:type="dxa"/>
-            <w:tcBorders>
-              <w:top w:val="single" w:sz="6" w:space="0" w:color="C4C7C5"/>
-              <w:left w:val="single" w:sz="6" w:space="0" w:color="C4C7C5"/>
-              <w:bottom w:val="single" w:sz="6" w:space="0" w:color="C4C7C5"/>
-              <w:right w:val="single" w:sz="6" w:space="0" w:color="C4C7C5"/>
-            </w:tcBorders>
-            <w:vAlign w:val="center"/>
+            <w:tcW w:w="2338" w:type="dxa"/>
           </w:tcPr>
           <w:p>
-            <m:oMathPara>
-              <m:oMath>
-                <m:r>
-                  <w:rPr>
-                    <w:rFonts w:ascii="Cambria Math" w:eastAsia="Times New Roman" w:hAnsi="Cambria Math" w:cs="Arial"/>
-                  </w:rPr>
-                  <m:t>∼200,000-300,000</m:t>
-                </m:r>
-                <m:r>
-                  <m:rPr>
-                    <m:nor/>
-                  </m:rPr>
-                  <w:rPr>
-                    <w:rFonts w:ascii="Arial" w:eastAsia="Times New Roman" w:hAnsi="Arial" w:cs="Arial"/>
-                  </w:rPr>
-                  <m:t> gas</m:t>
-                </m:r>
-              </m:oMath>
-            </m:oMathPara>
+            <w:pPr>
+              <w:jc w:val="both"/>
+            </w:pPr>
+            <w:r>
+              <w:rPr>
+                <w:rFonts w:ascii="Cambria Math" w:hAnsi="Cambria Math" w:cs="Cambria Math"/>
+              </w:rPr>
+              <w:t>∼</w:t>
+            </w:r>
+            <w:r>
+              <w:t xml:space="preserve">200,000-300,000" gas" </w:t>
+            </w:r>
           </w:p>
         </w:tc>
       </w:tr>
       <w:tr>
         <w:tc>
           <w:tcPr>
-            <w:tcW w:w="1417" w:type="dxa"/>
-            <w:tcBorders>
-              <w:top w:val="single" w:sz="6" w:space="0" w:color="C4C7C5"/>
-              <w:left w:val="single" w:sz="6" w:space="0" w:color="C4C7C5"/>
-              <w:bottom w:val="single" w:sz="6" w:space="0" w:color="C4C7C5"/>
-              <w:right w:val="single" w:sz="6" w:space="0" w:color="C4C7C5"/>
-            </w:tcBorders>
-            <w:vAlign w:val="center"/>
+            <w:tcW w:w="2337" w:type="dxa"/>
           </w:tcPr>
           <w:p>
+            <w:pPr>
+              <w:jc w:val="both"/>
+            </w:pPr>
             <w:proofErr w:type="spellStart"/>
             <w:r>
-              <w:rPr>
-                <w:rFonts w:ascii="Arial" w:hAnsi="Arial" w:cs="Arial"/>
-              </w:rPr>
               <w:t>UltraPlonk</w:t>
             </w:r>
             <w:proofErr w:type="spellEnd"/>
@@ -869,143 +2779,67 @@
         </w:tc>
         <w:tc>
           <w:tcPr>
-            <w:tcW w:w="1998" w:type="dxa"/>
-            <w:tcBorders>
-              <w:top w:val="single" w:sz="6" w:space="0" w:color="C4C7C5"/>
-              <w:left w:val="single" w:sz="6" w:space="0" w:color="C4C7C5"/>
-              <w:bottom w:val="single" w:sz="6" w:space="0" w:color="C4C7C5"/>
-              <w:right w:val="single" w:sz="6" w:space="0" w:color="C4C7C5"/>
-            </w:tcBorders>
-            <w:vAlign w:val="center"/>
+            <w:tcW w:w="2337" w:type="dxa"/>
           </w:tcPr>
           <w:p>
-            <m:oMathPara>
-              <m:oMath>
-                <m:r>
-                  <w:rPr>
-                    <w:rFonts w:ascii="Cambria Math" w:eastAsia="Times New Roman" w:hAnsi="Cambria Math" w:cs="Arial"/>
-                  </w:rPr>
-                  <m:t>∼400-800</m:t>
-                </m:r>
-              </m:oMath>
-            </m:oMathPara>
+            <w:pPr>
+              <w:jc w:val="both"/>
+            </w:pPr>
+            <w:r>
+              <w:rPr>
+                <w:rFonts w:ascii="Cambria Math" w:hAnsi="Cambria Math" w:cs="Cambria Math"/>
+              </w:rPr>
+              <w:t>∼</w:t>
+            </w:r>
+            <w:r>
+              <w:t>400-800</w:t>
+            </w:r>
           </w:p>
         </w:tc>
         <w:tc>
           <w:tcPr>
-            <w:tcW w:w="4050" w:type="dxa"/>
-            <w:tcBorders>
-              <w:top w:val="single" w:sz="6" w:space="0" w:color="C4C7C5"/>
-              <w:left w:val="single" w:sz="6" w:space="0" w:color="C4C7C5"/>
-              <w:bottom w:val="single" w:sz="6" w:space="0" w:color="C4C7C5"/>
-              <w:right w:val="single" w:sz="6" w:space="0" w:color="C4C7C5"/>
-            </w:tcBorders>
-            <w:vAlign w:val="center"/>
+            <w:tcW w:w="2338" w:type="dxa"/>
           </w:tcPr>
           <w:p>
-            <m:oMathPara>
-              <m:oMath>
-                <m:r>
-                  <w:rPr>
-                    <w:rFonts w:ascii="Cambria Math" w:eastAsia="Times New Roman" w:hAnsi="Cambria Math" w:cs="Arial"/>
-                  </w:rPr>
-                  <m:t>1</m:t>
-                </m:r>
-                <m:r>
-                  <m:rPr>
-                    <m:nor/>
-                  </m:rPr>
-                  <w:rPr>
-                    <w:rFonts w:ascii="Arial" w:eastAsia="Times New Roman" w:hAnsi="Arial" w:cs="Arial"/>
-                  </w:rPr>
-                  <m:t> Pairing check</m:t>
-                </m:r>
-                <m:r>
-                  <w:rPr>
-                    <w:rFonts w:ascii="Cambria Math" w:eastAsia="Times New Roman" w:hAnsi="Cambria Math" w:cs="Arial"/>
-                  </w:rPr>
-                  <m:t>,</m:t>
-                </m:r>
-                <m:r>
-                  <m:rPr>
-                    <m:nor/>
-                  </m:rPr>
-                  <w:rPr>
-                    <w:rFonts w:ascii="Arial" w:eastAsia="Times New Roman" w:hAnsi="Arial" w:cs="Arial"/>
-                  </w:rPr>
-                  <m:t> Multiple KZG Openings</m:t>
-                </m:r>
-                <m:r>
-                  <w:rPr>
-                    <w:rFonts w:ascii="Cambria Math" w:eastAsia="Times New Roman" w:hAnsi="Cambria Math" w:cs="Arial"/>
-                  </w:rPr>
-                  <m:t>,</m:t>
-                </m:r>
-                <m:r>
-                  <m:rPr>
-                    <m:nor/>
-                  </m:rPr>
-                  <w:rPr>
-                    <w:rFonts w:ascii="Arial" w:eastAsia="Times New Roman" w:hAnsi="Arial" w:cs="Arial"/>
-                  </w:rPr>
-                  <m:t> Polynomial Evaluations</m:t>
-                </m:r>
-              </m:oMath>
-            </m:oMathPara>
+            <w:pPr>
+              <w:jc w:val="both"/>
+            </w:pPr>
+            <w:r>
+              <w:t xml:space="preserve">1" Pairing check"," Multiple KZG Openings"," Polynomial Evaluations" </w:t>
+            </w:r>
           </w:p>
         </w:tc>
         <w:tc>
           <w:tcPr>
-            <w:tcW w:w="3787" w:type="dxa"/>
-            <w:tcBorders>
-              <w:top w:val="single" w:sz="6" w:space="0" w:color="C4C7C5"/>
-              <w:left w:val="single" w:sz="6" w:space="0" w:color="C4C7C5"/>
-              <w:bottom w:val="single" w:sz="6" w:space="0" w:color="C4C7C5"/>
-              <w:right w:val="single" w:sz="6" w:space="0" w:color="C4C7C5"/>
-            </w:tcBorders>
-            <w:vAlign w:val="center"/>
+            <w:tcW w:w="2338" w:type="dxa"/>
           </w:tcPr>
           <w:p>
-            <m:oMathPara>
-              <m:oMath>
-                <m:r>
-                  <w:rPr>
-                    <w:rFonts w:ascii="Cambria Math" w:eastAsia="Times New Roman" w:hAnsi="Cambria Math" w:cs="Arial"/>
-                  </w:rPr>
-                  <m:t>∼300,000-500,000</m:t>
-                </m:r>
-                <m:r>
-                  <m:rPr>
-                    <m:nor/>
-                  </m:rPr>
-                  <w:rPr>
-                    <w:rFonts w:ascii="Arial" w:eastAsia="Times New Roman" w:hAnsi="Arial" w:cs="Arial"/>
-                  </w:rPr>
-                  <m:t> gas</m:t>
-                </m:r>
-              </m:oMath>
-            </m:oMathPara>
+            <w:pPr>
+              <w:jc w:val="both"/>
+            </w:pPr>
+            <w:r>
+              <w:rPr>
+                <w:rFonts w:ascii="Cambria Math" w:hAnsi="Cambria Math" w:cs="Cambria Math"/>
+              </w:rPr>
+              <w:t>∼</w:t>
+            </w:r>
+            <w:r>
+              <w:t xml:space="preserve">300,000-500,000" gas" </w:t>
+            </w:r>
           </w:p>
         </w:tc>
       </w:tr>
       <w:tr>
         <w:tc>
           <w:tcPr>
-            <w:tcW w:w="1417" w:type="dxa"/>
-            <w:tcBorders>
-              <w:top w:val="single" w:sz="6" w:space="0" w:color="C4C7C5"/>
-              <w:left w:val="single" w:sz="6" w:space="0" w:color="C4C7C5"/>
-              <w:bottom w:val="single" w:sz="6" w:space="0" w:color="C4C7C5"/>
-              <w:right w:val="single" w:sz="6" w:space="0" w:color="C4C7C5"/>
-            </w:tcBorders>
-            <w:vAlign w:val="center"/>
+            <w:tcW w:w="2337" w:type="dxa"/>
           </w:tcPr>
           <w:p>
+            <w:pPr>
+              <w:jc w:val="both"/>
+            </w:pPr>
             <w:proofErr w:type="spellStart"/>
             <w:r>
-              <w:rPr>
-                <w:rFonts w:ascii="Arial" w:hAnsi="Arial" w:cs="Arial"/>
-              </w:rPr>
               <w:t>UltraHonk</w:t>
             </w:r>
             <w:proofErr w:type="spellEnd"/>
@@ -1013,125 +2847,128 @@
         </w:tc>
         <w:tc>
           <w:tcPr>
-            <w:tcW w:w="1998" w:type="dxa"/>
-            <w:tcBorders>
-              <w:top w:val="single" w:sz="6" w:space="0" w:color="C4C7C5"/>
-              <w:left w:val="single" w:sz="6" w:space="0" w:color="C4C7C5"/>
-              <w:bottom w:val="single" w:sz="6" w:space="0" w:color="C4C7C5"/>
-              <w:right w:val="single" w:sz="6" w:space="0" w:color="C4C7C5"/>
-            </w:tcBorders>
-            <w:vAlign w:val="center"/>
+            <w:tcW w:w="2337" w:type="dxa"/>
           </w:tcPr>
           <w:p>
-            <m:oMathPara>
-              <m:oMath>
-                <m:r>
-                  <w:rPr>
-                    <w:rFonts w:ascii="Cambria Math" w:eastAsia="Times New Roman" w:hAnsi="Cambria Math" w:cs="Arial"/>
-                  </w:rPr>
-                  <m:t>∼1,000-2,000</m:t>
-                </m:r>
-              </m:oMath>
-            </m:oMathPara>
+            <w:pPr>
+              <w:jc w:val="both"/>
+            </w:pPr>
+            <w:r>
+              <w:rPr>
+                <w:rFonts w:ascii="Cambria Math" w:hAnsi="Cambria Math" w:cs="Cambria Math"/>
+              </w:rPr>
+              <w:t>∼</w:t>
+            </w:r>
+            <w:r>
+              <w:t>1,000-2,000</w:t>
+            </w:r>
           </w:p>
         </w:tc>
         <w:tc>
           <w:tcPr>
-            <w:tcW w:w="4050" w:type="dxa"/>
-            <w:tcBorders>
-              <w:top w:val="single" w:sz="6" w:space="0" w:color="C4C7C5"/>
-              <w:left w:val="single" w:sz="6" w:space="0" w:color="C4C7C5"/>
-              <w:bottom w:val="single" w:sz="6" w:space="0" w:color="C4C7C5"/>
-              <w:right w:val="single" w:sz="6" w:space="0" w:color="C4C7C5"/>
-            </w:tcBorders>
-            <w:vAlign w:val="center"/>
+            <w:tcW w:w="2338" w:type="dxa"/>
           </w:tcPr>
           <w:p>
+            <w:pPr>
+              <w:jc w:val="both"/>
+            </w:pPr>
+            <w:r>
+              <w:t>"</w:t>
+            </w:r>
             <w:proofErr w:type="spellStart"/>
-            <m:oMathPara>
-              <m:oMath>
-                <m:r>
-                  <m:rPr>
-                    <m:nor/>
-                  </m:rPr>
-                  <w:rPr>
-                    <w:rFonts w:ascii="Arial" w:eastAsia="Times New Roman" w:hAnsi="Arial" w:cs="Arial"/>
-                  </w:rPr>
-                  <m:t>Sumcheck</m:t>
-                </m:r>
-                <w:proofErr w:type="spellEnd"/>
-                <m:r>
-                  <m:rPr>
-                    <m:nor/>
-                  </m:rPr>
-                  <w:rPr>
-                    <w:rFonts w:ascii="Arial" w:eastAsia="Times New Roman" w:hAnsi="Arial" w:cs="Arial"/>
-                  </w:rPr>
-                  <m:t> evaluations</m:t>
-                </m:r>
-                <m:r>
-                  <w:rPr>
-                    <w:rFonts w:ascii="Cambria Math" w:eastAsia="Times New Roman" w:hAnsi="Cambria Math" w:cs="Arial"/>
-                  </w:rPr>
-                  <m:t>,</m:t>
-                </m:r>
-                <m:r>
-                  <m:rPr>
-                    <m:nor/>
-                  </m:rPr>
-                  <w:rPr>
-                    <w:rFonts w:ascii="Arial" w:eastAsia="Times New Roman" w:hAnsi="Arial" w:cs="Arial"/>
-                  </w:rPr>
-                  <m:t> KZG / IPA Opening checks</m:t>
-                </m:r>
-              </m:oMath>
-            </m:oMathPara>
+            <w:r>
+              <w:t>Sumcheck</w:t>
+            </w:r>
+            <w:proofErr w:type="spellEnd"/>
+            <w:r>
+              <w:t xml:space="preserve"> evaluations"," KZG / IPA Opening checks" </w:t>
+            </w:r>
           </w:p>
         </w:tc>
         <w:tc>
           <w:tcPr>
-            <w:tcW w:w="3787" w:type="dxa"/>
-            <w:tcBorders>
-              <w:top w:val="single" w:sz="6" w:space="0" w:color="C4C7C5"/>
-              <w:left w:val="single" w:sz="6" w:space="0" w:color="C4C7C5"/>
-              <w:bottom w:val="single" w:sz="6" w:space="0" w:color="C4C7C5"/>
-              <w:right w:val="single" w:sz="6" w:space="0" w:color="C4C7C5"/>
-            </w:tcBorders>
-            <w:vAlign w:val="center"/>
+            <w:tcW w:w="2338" w:type="dxa"/>
           </w:tcPr>
           <w:p>
-            <m:oMathPara>
-              <m:oMath>
-                <m:r>
-                  <w:rPr>
-                    <w:rFonts w:ascii="Cambria Math" w:eastAsia="Times New Roman" w:hAnsi="Cambria Math" w:cs="Arial"/>
-                  </w:rPr>
-                  <m:t>∼350,000-600,000</m:t>
-                </m:r>
-                <m:r>
-                  <m:rPr>
-                    <m:nor/>
-                  </m:rPr>
-                  <w:rPr>
-                    <w:rFonts w:ascii="Arial" w:eastAsia="Times New Roman" w:hAnsi="Arial" w:cs="Arial"/>
-                  </w:rPr>
-                  <m:t> gas</m:t>
-                </m:r>
-              </m:oMath>
-            </m:oMathPara>
+            <w:pPr>
+              <w:jc w:val="both"/>
+            </w:pPr>
+            <w:r>
+              <w:rPr>
+                <w:rFonts w:ascii="Cambria Math" w:hAnsi="Cambria Math" w:cs="Cambria Math"/>
+              </w:rPr>
+              <w:t>∼</w:t>
+            </w:r>
+            <w:r>
+              <w:t xml:space="preserve">350,000-600,000" gas" </w:t>
+            </w:r>
+          </w:p>
+        </w:tc>
+      </w:tr>
+      <w:tr>
+        <w:tc>
+          <w:tcPr>
+            <w:tcW w:w="2337" w:type="dxa"/>
+          </w:tcPr>
+          <w:p>
+            <w:pPr>
+              <w:jc w:val="both"/>
+            </w:pPr>
+            <w:r>
+              <w:t>Proof System</w:t>
+            </w:r>
+          </w:p>
+        </w:tc>
+        <w:tc>
+          <w:tcPr>
+            <w:tcW w:w="2337" w:type="dxa"/>
+          </w:tcPr>
+          <w:p>
+            <w:pPr>
+              <w:jc w:val="both"/>
+            </w:pPr>
+            <w:r>
+              <w:t>Proof Size (Bytes)</w:t>
+            </w:r>
+          </w:p>
+        </w:tc>
+        <w:tc>
+          <w:tcPr>
+            <w:tcW w:w="2338" w:type="dxa"/>
+          </w:tcPr>
+          <w:p>
+            <w:pPr>
+              <w:jc w:val="both"/>
+            </w:pPr>
+            <w:r>
+              <w:t>Dominant On-Chain Computations</w:t>
+            </w:r>
+          </w:p>
+        </w:tc>
+        <w:tc>
+          <w:tcPr>
+            <w:tcW w:w="2338" w:type="dxa"/>
+          </w:tcPr>
+          <w:p>
+            <w:pPr>
+              <w:jc w:val="both"/>
+            </w:pPr>
+            <w:r>
+              <w:t>Estimated EVM Verification Gas</w:t>
+            </w:r>
           </w:p>
         </w:tc>
       </w:tr>
     </w:tbl>
     <w:p>
-      <w:r>
-        <w:br w:type="page"/>
-      </w:r>
-    </w:p>
-    <w:p/>
+      <w:pPr>
+        <w:jc w:val="both"/>
+      </w:pPr>
+    </w:p>
     <w:p>
       <w:pPr>
         <w:pStyle w:val="Heading3"/>
+        <w:jc w:val="both"/>
       </w:pPr>
       <w:r>
         <w:t>2.5 Related Work and Research Gaps</w:t>
@@ -1140,12 +2977,65 @@
     <w:p>
       <w:pPr>
         <w:pStyle w:val="Heading3"/>
+        <w:jc w:val="both"/>
       </w:pPr>
       <w:r>
         <w:t>2.5.1 Review of Existing Literature</w:t>
       </w:r>
     </w:p>
     <w:p>
+      <w:pPr>
+        <w:jc w:val="both"/>
+      </w:pPr>
+      <w:r>
+        <w:t xml:space="preserve">Existing work has demonstrated that zero-knowledge proofs can support privacy-preserving attribute claims. </w:t>
+      </w:r>
+      <w:proofErr w:type="spellStart"/>
+      <w:r>
+        <w:t>ZKlaims</w:t>
+      </w:r>
+      <w:proofErr w:type="spellEnd"/>
+      <w:r>
+        <w:t>, for example, proposed a system for presenting privacy-preserving attribute-based credentials using zero-knowledge techniques. Its relevance lies in showing that credential-based claims can be constructed without exposing complete user information.</w:t>
+      </w:r>
+    </w:p>
+    <w:p>
+      <w:pPr>
+        <w:jc w:val="both"/>
+      </w:pPr>
+      <w:r>
+        <w:lastRenderedPageBreak/>
+        <w:t xml:space="preserve">Research and technical standards on verifiable credentials have also examined selective-disclosure mechanisms, including BBS signatures, CL signatures, </w:t>
+      </w:r>
+      <w:proofErr w:type="spellStart"/>
+      <w:r>
+        <w:t>Idemix</w:t>
+      </w:r>
+      <w:proofErr w:type="spellEnd"/>
+      <w:r>
+        <w:t>, and Merkle-based disclosure models. These approaches illustrate that selective disclosure can be achieved through several cryptographic designs, each with different assumptions and operational trade-offs.</w:t>
+      </w:r>
+    </w:p>
+    <w:p>
+      <w:pPr>
+        <w:jc w:val="both"/>
+      </w:pPr>
+      <w:r>
+        <w:t>More recent implementation work has explored general-purpose ZK proofs for verifiable credentials, including the use of circuits to prove signature possession and policy compliance. This direction is important because it shifts complex credential logic from direct verifier implementation toward proof generation performed by the holder.</w:t>
+      </w:r>
+    </w:p>
+    <w:p>
+      <w:pPr>
+        <w:jc w:val="both"/>
+      </w:pPr>
+      <w:r>
+        <w:t>However, much existing work has focused on demonstrating functionality, protocol design, or security properties rather than providing reproducible, full-stack measurements of a Noir-based attribute-credential circuit from compilation through off-chain proving to Ethereum verification. This leaves an important practical question unresolved: whether the developer productivity offered by a high-level circuit language can be achieved without unacceptable proving delay, memory usage, proof size, or Ethereum gas consumption.</w:t>
+      </w:r>
+    </w:p>
+    <w:p>
+      <w:pPr>
+        <w:jc w:val="both"/>
+      </w:pPr>
       <w:r>
         <w:t>Recent research has increasingly focused on combining zero-knowledge proofs with decentralized identity and access management:</w:t>
       </w:r>
@@ -1157,6 +3047,7 @@
           <w:ilvl w:val="0"/>
           <w:numId w:val="5"/>
         </w:numPr>
+        <w:jc w:val="both"/>
       </w:pPr>
       <w:proofErr w:type="spellStart"/>
       <w:r>
@@ -1201,6 +3092,7 @@
           <w:ilvl w:val="0"/>
           <w:numId w:val="5"/>
         </w:numPr>
+        <w:jc w:val="both"/>
       </w:pPr>
       <w:proofErr w:type="spellStart"/>
       <w:r>
@@ -1229,6 +3121,7 @@
           <w:ilvl w:val="0"/>
           <w:numId w:val="5"/>
         </w:numPr>
+        <w:jc w:val="both"/>
       </w:pPr>
       <w:r>
         <w:rPr>
@@ -1244,12 +3137,16 @@
     <w:p>
       <w:pPr>
         <w:pStyle w:val="Heading3"/>
+        <w:jc w:val="both"/>
       </w:pPr>
       <w:r>
         <w:t>2.5.2 Identified Research Gaps</w:t>
       </w:r>
     </w:p>
     <w:p>
+      <w:pPr>
+        <w:jc w:val="both"/>
+      </w:pPr>
       <w:r>
         <w:t>Despite these advancements, key gaps remain in existing literature:</w:t>
       </w:r>
@@ -1261,8 +3158,10 @@
           <w:ilvl w:val="0"/>
           <w:numId w:val="6"/>
         </w:numPr>
-      </w:pPr>
-      <w:r>
+        <w:jc w:val="both"/>
+      </w:pPr>
+      <w:r>
+        <w:lastRenderedPageBreak/>
         <w:t xml:space="preserve">Lack of Empirical Benchmarks for High-Level DSLs: Most published studies focus on lower-level languages (such as </w:t>
       </w:r>
       <w:proofErr w:type="spellStart"/>
@@ -1288,6 +3187,20 @@
       <w:proofErr w:type="spellEnd"/>
       <w:r>
         <w:t xml:space="preserve"> remains limited.</w:t>
+      </w:r>
+      <w:r>
+        <w:t xml:space="preserve"> </w:t>
+      </w:r>
+      <w:r>
+        <w:t xml:space="preserve">While Noir-based proof workflows and Ethereum verifier-generation processes are available, available demonstrations do not necessarily provide a </w:t>
+      </w:r>
+      <w:proofErr w:type="spellStart"/>
+      <w:r>
+        <w:t>standardised</w:t>
+      </w:r>
+      <w:proofErr w:type="spellEnd"/>
+      <w:r>
+        <w:t xml:space="preserve"> evaluation of credential size, attribute count, predicate complexity, proving latency, memory use, and gas consumption within one research design. Noir workflows can produce proof and verification-key artifacts that are subsequently used for local and smart-contract verification, making such an end-to-end evaluation technically feasible</w:t>
       </w:r>
     </w:p>
     <w:p>
@@ -1297,9 +3210,10 @@
           <w:ilvl w:val="0"/>
           <w:numId w:val="6"/>
         </w:numPr>
-      </w:pPr>
-      <w:r>
-        <w:t>Missing Granular Breakdown of On-Chain Costs: Existing research often reports overall gas usage without isolating specific factors like memory allocation, payload decoding, precompile consumption, and public input size.</w:t>
+        <w:jc w:val="both"/>
+      </w:pPr>
+      <w:r>
+        <w:t>Existing research often reports overall gas usage without isolating specific factors like memory allocation, payload decoding, precompile consumption, and public input size.</w:t>
       </w:r>
     </w:p>
     <w:p>
@@ -1309,14 +3223,426 @@
           <w:ilvl w:val="0"/>
           <w:numId w:val="6"/>
         </w:numPr>
-      </w:pPr>
-      <w:r>
-        <w:t>Trade-Off Analysis in Client-Side Environments: There is limited quantitative analysis evaluating how circuit optimization in domain-specific languages affects proving speed and memory usage on resource-constrained client devices.</w:t>
+        <w:jc w:val="both"/>
+      </w:pPr>
+      <w:r>
+        <w:t>There is limited quantitative analysis evaluating how circuit optimization in domain-specific languages affects proving speed and memory usage on resource-constrained client devices.</w:t>
+      </w:r>
+    </w:p>
+    <w:p>
+      <w:pPr>
+        <w:pStyle w:val="ListParagraph"/>
+        <w:numPr>
+          <w:ilvl w:val="0"/>
+          <w:numId w:val="6"/>
+        </w:numPr>
+        <w:jc w:val="both"/>
+      </w:pPr>
+      <w:r>
+        <w:t>P</w:t>
+      </w:r>
+      <w:r>
+        <w:t xml:space="preserve">rior discussions often treat off-chain proving and on-chain verification as separate concerns. This separation is incomplete for </w:t>
+      </w:r>
+      <w:r>
+        <w:t>decentralized</w:t>
+      </w:r>
+      <w:r>
+        <w:t xml:space="preserve"> identity applications. A system with low Ethereum verification gas but excessive client-side proving time may be unsuitable for users. Conversely, a fast proof generator may be unattractive if verification requires excessive calldata or costly smart-contract execution. The study addresses this gap by evaluating both sides of the workflow.</w:t>
+      </w:r>
+    </w:p>
+    <w:p>
+      <w:pPr>
+        <w:pStyle w:val="ListParagraph"/>
+        <w:numPr>
+          <w:ilvl w:val="0"/>
+          <w:numId w:val="6"/>
+        </w:numPr>
+        <w:jc w:val="both"/>
+      </w:pPr>
+      <w:r>
+        <w:t>Third, performance claims are frequently difficult to compare because they use different circuits, different proof systems, different hardware, and different Ethereum configurations. This study aims to provide a controlled benchmark design in which the circuit function, input characteristics, tool versions, hardware environment, and measurement procedure are explicitly documented.</w:t>
+      </w:r>
+    </w:p>
+    <w:p>
+      <w:pPr>
+        <w:pStyle w:val="ListParagraph"/>
+        <w:numPr>
+          <w:ilvl w:val="0"/>
+          <w:numId w:val="6"/>
+        </w:numPr>
+        <w:jc w:val="both"/>
+      </w:pPr>
+      <w:r>
+        <w:t xml:space="preserve">Fourth, the relationship between credential complexity and practical cost remains insufficiently quantified in many implementation studies. A simple proof of age may behave very differently from a proof that combines issuer-authenticated credentials, multiple private attributes, revocation membership, and nullifier </w:t>
+      </w:r>
+      <w:r>
+        <w:lastRenderedPageBreak/>
+        <w:t>generation. This research therefore evaluates how relevant credential parameters affect proving and verification efficiency.</w:t>
+      </w:r>
+    </w:p>
+    <w:p>
+      <w:pPr>
+        <w:pStyle w:val="Heading3"/>
+        <w:jc w:val="both"/>
+      </w:pPr>
+      <w:r>
+        <w:t>2.11 Conceptual Framework</w:t>
+      </w:r>
+    </w:p>
+    <w:p>
+      <w:pPr>
+        <w:jc w:val="both"/>
+      </w:pPr>
+      <w:r>
+        <w:t>The study is guided by the relationship between attribute-credential complexity, proof-generation performance, and Ethereum verification cost.</w:t>
+      </w:r>
+      <w:r>
+        <w:t xml:space="preserve"> </w:t>
+      </w:r>
+      <w:r>
+        <w:t>The independent variables may include</w:t>
+      </w:r>
+      <w:r>
+        <w:t xml:space="preserve"> the n</w:t>
+      </w:r>
+      <w:r>
+        <w:t>umber of credential attributes</w:t>
+      </w:r>
+      <w:r>
+        <w:t>, the n</w:t>
+      </w:r>
+      <w:r>
+        <w:t>umber of private attributes</w:t>
+      </w:r>
+      <w:r>
+        <w:t>, the n</w:t>
+      </w:r>
+      <w:r>
+        <w:t>umber of disclosed attributes</w:t>
+      </w:r>
+      <w:r>
+        <w:t>, t</w:t>
+      </w:r>
+      <w:r>
+        <w:t>ype and number of predicates</w:t>
+      </w:r>
+      <w:r>
+        <w:t>, s</w:t>
+      </w:r>
+      <w:r>
+        <w:t>ignature or commitment-verification logic included in the circuit</w:t>
+      </w:r>
+      <w:r>
+        <w:t xml:space="preserve">, </w:t>
+      </w:r>
+      <w:r>
+        <w:t>Merkle-tree depth, where credential membership or revocation is modelled</w:t>
+      </w:r>
+      <w:r>
+        <w:t>, n</w:t>
+      </w:r>
+      <w:r>
+        <w:t>umber of public inputs</w:t>
+      </w:r>
+      <w:r>
+        <w:t xml:space="preserve"> and s</w:t>
+      </w:r>
+      <w:r>
+        <w:t>elected Noir and proving-backend configuration.</w:t>
+      </w:r>
+    </w:p>
+    <w:p>
+      <w:pPr>
+        <w:jc w:val="both"/>
+      </w:pPr>
+      <w:r>
+        <w:t>The dependent variables are expected to include</w:t>
+      </w:r>
+      <w:r>
+        <w:t xml:space="preserve"> w</w:t>
+      </w:r>
+      <w:r>
+        <w:t>itness-generation time</w:t>
+      </w:r>
+      <w:r>
+        <w:t>, p</w:t>
+      </w:r>
+      <w:r>
+        <w:t>roof-generation time</w:t>
+      </w:r>
+      <w:r>
+        <w:t>, p</w:t>
+      </w:r>
+      <w:r>
+        <w:t>eak memory consumption</w:t>
+      </w:r>
+      <w:r>
+        <w:t xml:space="preserve">, </w:t>
+      </w:r>
+      <w:r>
+        <w:t>c</w:t>
+      </w:r>
+      <w:r>
+        <w:t>ircuit size</w:t>
+      </w:r>
+      <w:r>
+        <w:t xml:space="preserve">, </w:t>
+      </w:r>
+      <w:r>
+        <w:t>p</w:t>
+      </w:r>
+      <w:r>
+        <w:t>roof size</w:t>
+      </w:r>
+      <w:r>
+        <w:t>, l</w:t>
+      </w:r>
+      <w:r>
+        <w:t>ocal proof-verification time</w:t>
+      </w:r>
+      <w:r>
+        <w:t xml:space="preserve">, </w:t>
+      </w:r>
+      <w:r>
+        <w:t>Ethereum gas consumption</w:t>
+      </w:r>
+      <w:r>
+        <w:t xml:space="preserve"> and the t</w:t>
+      </w:r>
+      <w:r>
+        <w:t>ransaction calldata size.</w:t>
+      </w:r>
+    </w:p>
+    <w:p>
+      <w:pPr>
+        <w:jc w:val="both"/>
+      </w:pPr>
+      <w:r>
+        <w:t xml:space="preserve">The framework assumes that increased credential complexity generally increases circuit complexity and may increase witness-generation time, proof-generation time, and memory use. Ethereum gas consumption may be influenced by proof format, verifier design, number of public inputs, and calldata size, rather than directly tracking circuit size. This distinction is important: a substantially more complex private computation can sometimes produce a proof </w:t>
+      </w:r>
+      <w:r>
+        <w:t>who’s</w:t>
+      </w:r>
+      <w:r>
+        <w:t xml:space="preserve"> on-chain verification cost changes only modestly, depending on the proof system and verifier architecture.</w:t>
+      </w:r>
+    </w:p>
+    <w:p>
+      <w:pPr>
+        <w:pStyle w:val="Heading3"/>
+        <w:jc w:val="both"/>
+      </w:pPr>
+      <w:r>
+        <w:t xml:space="preserve">2.12 </w:t>
+      </w:r>
+      <w:r>
+        <w:t>Ethereum verification gas cost affect system scalability</w:t>
+      </w:r>
+    </w:p>
+    <w:p>
+      <w:pPr>
+        <w:jc w:val="both"/>
+      </w:pPr>
+      <w:r>
+        <w:t>Ethereum verification gas cost affects scalability because each proof-verification transaction consumes a portion of Ethereum’s limited per-block gas capacity. Higher gas per proof means fewer credential verifications can be included in a block, greater transaction fees during congestion, and weaker feasibility for high-volume identity systems</w:t>
+      </w:r>
+      <w:r>
+        <w:t>.</w:t>
+      </w:r>
+    </w:p>
+    <w:p>
+      <w:pPr>
+        <w:jc w:val="both"/>
+        <w:rPr>
+          <w:b/>
+          <w:bCs/>
+        </w:rPr>
+      </w:pPr>
+      <w:r>
+        <w:t>Ethereum blocks have a finite gas budget.</w:t>
+      </w:r>
+      <w:r>
+        <w:t xml:space="preserve"> If</w:t>
+      </w:r>
+      <w:r>
+        <w:t xml:space="preserve"> a verifier consumes 300,000 gas and the block permits 30,000,000 </w:t>
+      </w:r>
+      <w:proofErr w:type="gramStart"/>
+      <w:r>
+        <w:t>gas</w:t>
+      </w:r>
+      <w:proofErr w:type="gramEnd"/>
+      <w:r>
+        <w:t xml:space="preserve"> at maximum capacity, then no more than approximately</w:t>
+      </w:r>
+      <w:r>
+        <w:t xml:space="preserve"> 30,000,000 divided by 300,000 which equals 100</w:t>
+      </w:r>
+      <w:r>
+        <w:t>. S</w:t>
+      </w:r>
+      <w:r>
+        <w:t xml:space="preserve">uch </w:t>
+      </w:r>
+      <w:r>
+        <w:t xml:space="preserve">a </w:t>
+      </w:r>
+      <w:r>
+        <w:t xml:space="preserve">transaction could fit in one fully used block. This is only an upper bound because blocks also include many other transactions, and each </w:t>
+      </w:r>
+      <w:r>
+        <w:lastRenderedPageBreak/>
+        <w:t>credential transaction may require extra gas for calldata processing, storage access, event logs, nullifier recording, or revocation checks.</w:t>
+      </w:r>
+      <w:r>
+        <w:t xml:space="preserve"> </w:t>
+      </w:r>
+      <w:r>
+        <w:t>Therefore, a reduction from 300,000 gas to 150,000 gas per verification can approximately double the number of verifier transactions that could share the same block capacity, assuming other conditions remain constant.</w:t>
+      </w:r>
+      <w:r>
+        <w:t xml:space="preserve"> </w:t>
+      </w:r>
+      <w:r>
+        <w:t>The actual transaction fee is</w:t>
+      </w:r>
+      <w:r>
+        <w:t xml:space="preserve"> </w:t>
+      </w:r>
+      <w:r>
+        <w:rPr>
+          <w:b/>
+          <w:bCs/>
+        </w:rPr>
+        <w:t>Transaction fee</w:t>
+      </w:r>
+      <w:r>
+        <w:rPr>
+          <w:b/>
+          <w:bCs/>
+        </w:rPr>
+        <w:t xml:space="preserve"> </w:t>
+      </w:r>
+      <w:r>
+        <w:rPr>
+          <w:b/>
+          <w:bCs/>
+        </w:rPr>
+        <w:t>=</w:t>
+      </w:r>
+      <w:r>
+        <w:rPr>
+          <w:b/>
+          <w:bCs/>
+        </w:rPr>
+        <w:t xml:space="preserve"> </w:t>
+      </w:r>
+      <w:r>
+        <w:rPr>
+          <w:b/>
+          <w:bCs/>
+        </w:rPr>
+        <w:t>gas used</w:t>
+      </w:r>
+      <w:r>
+        <w:rPr>
+          <w:b/>
+          <w:bCs/>
+        </w:rPr>
+        <w:t xml:space="preserve"> </w:t>
+      </w:r>
+      <w:r>
+        <w:rPr>
+          <w:b/>
+          <w:bCs/>
+        </w:rPr>
+        <w:t>×</w:t>
+      </w:r>
+      <w:r>
+        <w:rPr>
+          <w:b/>
+          <w:bCs/>
+        </w:rPr>
+        <w:t xml:space="preserve"> </w:t>
+      </w:r>
+      <w:r>
+        <w:rPr>
+          <w:b/>
+          <w:bCs/>
+        </w:rPr>
+        <w:t>effective gas </w:t>
+      </w:r>
+      <w:proofErr w:type="spellStart"/>
+      <w:r>
+        <w:rPr>
+          <w:b/>
+          <w:bCs/>
+        </w:rPr>
+        <w:t>price</w:t>
+      </w:r>
+      <w:proofErr w:type="spellEnd"/>
+    </w:p>
+    <w:p>
+      <w:pPr>
+        <w:jc w:val="both"/>
+      </w:pPr>
+      <w:r>
+        <w:t>Under EIP-1559, the effective gas price includes Ethereum’s dynamically adjusted base fee plus the priority fee. The base fee rises when blocks are used above the target gas level and falls when they are below it.</w:t>
+      </w:r>
+      <w:r>
+        <w:t xml:space="preserve"> </w:t>
+      </w:r>
+      <w:r>
+        <w:t>This means a verifier that uses more gas is more expensive at every gas-price level.</w:t>
+      </w:r>
+      <w:r>
+        <w:t xml:space="preserve"> </w:t>
+      </w:r>
+      <w:r>
+        <w:t>For an attribute-based credential system, high verification cost can undermine the privacy benefit: a technically private system that users cannot afford to use is not operationally scalable.</w:t>
+      </w:r>
+    </w:p>
+    <w:p>
+      <w:pPr>
+        <w:pStyle w:val="Heading3"/>
+        <w:jc w:val="both"/>
+      </w:pPr>
+      <w:r>
+        <w:t>2.1</w:t>
+      </w:r>
+      <w:r>
+        <w:t>3</w:t>
+      </w:r>
+      <w:r>
+        <w:t xml:space="preserve"> Chapter Summary</w:t>
+      </w:r>
+    </w:p>
+    <w:p>
+      <w:pPr>
+        <w:jc w:val="both"/>
+      </w:pPr>
+      <w:r>
+        <w:t>This chapter reviewed the theoretical and technical foundations of zero-knowledge proofs, ZK-SNARKs, attribute-based credentials, selective disclosure, Noir-based circuit development, proving backends, and Ethereum verifier execution. The review established that privacy-preserving credential presentation can reduce unnecessary disclosure of personal data, but its practical adoption depends on the performance of both off-chain proving and on-chain verification.</w:t>
+      </w:r>
+    </w:p>
+    <w:p>
+      <w:pPr>
+        <w:jc w:val="both"/>
+      </w:pPr>
+      <w:r>
+        <w:t xml:space="preserve">The literature also indicates that attribute-based credentials can be </w:t>
+      </w:r>
+      <w:r>
+        <w:t>realized</w:t>
+      </w:r>
+      <w:r>
+        <w:t xml:space="preserve"> through several cryptographic approaches, including CL signatures, BBS+ signatures, Merkle-based commitments, and general-purpose ZK-SNARK circuits. Yet there remains a need for controlled, reproducible empirical evaluation of Noir-based attribute-credential circuits across proof generation, local verification, proof size, memory consumption, and Ethereum gas usage. The next chapter should therefore present the research methodology, circuit design, experimental environment, benchmark scenarios, measurement metrics, and analysis procedure.</w:t>
       </w:r>
     </w:p>
     <w:sectPr>
       <w:pgSz w:w="12240" w:h="15840"/>
-      <w:pgMar w:top="1440" w:right="1440" w:bottom="1440" w:left="1440" w:header="720" w:footer="720" w:gutter="0"/>
+      <w:pgMar w:top="1440" w:right="1440" w:bottom="1440" w:left="2160" w:header="720" w:footer="720" w:gutter="0"/>
       <w:cols w:space="720"/>
       <w:docGrid w:linePitch="360"/>
     </w:sectPr>
@@ -1325,8 +3651,320 @@
 </file>
 
 <file path=word/numbering.xml><?xml version="1.0" encoding="utf-8"?>
-<w:numbering xmlns:wpc="http://schemas.microsoft.com/office/word/2010/wordprocessingCanvas" xmlns:cx="http://schemas.microsoft.com/office/drawing/2014/chartex" xmlns:cx1="http://schemas.microsoft.com/office/drawing/2015/9/8/chartex" xmlns:cx2="http://schemas.microsoft.com/office/drawing/2015/10/21/chartex" xmlns:cx3="http://schemas.microsoft.com/office/drawing/2016/5/9/chartex" xmlns:cx4="http://schemas.microsoft.com/office/drawing/2016/5/10/chartex" xmlns:cx5="http://schemas.microsoft.com/office/drawing/2016/5/11/chartex" xmlns:cx6="http://schemas.microsoft.com/office/drawing/2016/5/12/chartex" xmlns:cx7="http://schemas.microsoft.com/office/drawing/2016/5/13/chartex" xmlns:cx8="http://schemas.microsoft.com/office/drawing/2016/5/14/chartex" xmlns:mc="http://schemas.openxmlformats.org/markup-compatibility/2006" xmlns:aink="http://schemas.microsoft.com/office/drawing/2016/ink" xmlns:am3d="http://schemas.microsoft.com/office/drawing/2017/model3d" xmlns:o="urn:schemas-microsoft-com:office:office" xmlns:oel="http://schemas.microsoft.com/office/2019/extlst" xmlns:r="http://schemas.openxmlformats.org/officeDocument/2006/relationships" xmlns:m="http://schemas.openxmlformats.org/officeDocument/2006/math" xmlns:v="urn:schemas-microsoft-com:vml" xmlns:wp14="http://schemas.microsoft.com/office/word/2010/wordprocessingDrawing" xmlns:wp="http://schemas.openxmlformats.org/drawingml/2006/wordprocessingDrawing" xmlns:w10="urn:schemas-microsoft-com:office:word" xmlns:w="http://schemas.openxmlformats.org/wordprocessingml/2006/main" xmlns:w14="http://schemas.microsoft.com/office/word/2010/wordml" xmlns:w15="http://schemas.microsoft.com/office/word/2012/wordml" xmlns:w16cei="http://schemas.microsoft.com/office/word/2026/wordml/cei" xmlns:w16cex="http://schemas.microsoft.com/office/word/2018/wordml/cex" xmlns:w16cid="http://schemas.microsoft.com/office/word/2016/wordml/cid" xmlns:w16="http://schemas.microsoft.com/office/word/2018/wordml" xmlns:w16du="http://schemas.microsoft.com/office/word/2023/wordml/word16du" xmlns:w16sdtdh="http://schemas.microsoft.com/office/word/2020/wordml/sdtdatahash" xmlns:w16sdtfl="http://schemas.microsoft.com/office/word/2024/wordml/sdtformatlock" xmlns:w16se="http://schemas.microsoft.com/office/word/2015/wordml/symex" xmlns:wpg="http://schemas.microsoft.com/office/word/2010/wordprocessingGroup" xmlns:wpi="http://schemas.microsoft.com/office/word/2010/wordprocessingInk" xmlns:wne="http://schemas.microsoft.com/office/word/2006/wordml" xmlns:wps="http://schemas.microsoft.com/office/word/2010/wordprocessingShape" mc:Ignorable="w14 w15 w16se w16cid w16 w16cex w16sdtdh w16sdtfl w16du wp14">
+<w:numbering xmlns:wpc="http://schemas.microsoft.com/office/word/2010/wordprocessingCanvas" xmlns:cx="http://schemas.microsoft.com/office/drawing/2014/chartex" xmlns:cx1="http://schemas.microsoft.com/office/drawing/2015/9/8/chartex" xmlns:cx2="http://schemas.microsoft.com/office/drawing/2015/10/21/chartex" xmlns:cx3="http://schemas.microsoft.com/office/drawing/2016/5/9/chartex" xmlns:cx4="http://schemas.microsoft.com/office/drawing/2016/5/10/chartex" xmlns:cx5="http://schemas.microsoft.com/office/drawing/2016/5/11/chartex" xmlns:cx6="http://schemas.microsoft.com/office/drawing/2016/5/12/chartex" xmlns:cx7="http://schemas.microsoft.com/office/drawing/2016/5/13/chartex" xmlns:cx8="http://schemas.microsoft.com/office/drawing/2016/5/14/chartex" xmlns:mc="http://schemas.openxmlformats.org/markup-compatibility/2006" xmlns:aink="http://schemas.microsoft.com/office/drawing/2016/ink" xmlns:am3d="http://schemas.microsoft.com/office/drawing/2017/model3d" xmlns:o="urn:schemas-microsoft-com:office:office" xmlns:oel="http://schemas.microsoft.com/office/2019/extlst" xmlns:r="http://schemas.openxmlformats.org/officeDocument/2006/relationships" xmlns:m="http://schemas.openxmlformats.org/officeDocument/2006/math" xmlns:v="urn:schemas-microsoft-com:vml" xmlns:wp14="http://schemas.microsoft.com/office/word/2010/wordprocessingDrawing" xmlns:wp="http://schemas.openxmlformats.org/drawingml/2006/wordprocessingDrawing" xmlns:w10="urn:schemas-microsoft-com:office:word" xmlns:w="http://schemas.openxmlformats.org/wordprocessingml/2006/main" xmlns:w14="http://schemas.microsoft.com/office/word/2010/wordml" xmlns:w15="http://schemas.microsoft.com/office/word/2012/wordml" xmlns:w16cex="http://schemas.microsoft.com/office/word/2018/wordml/cex" xmlns:w16cid="http://schemas.microsoft.com/office/word/2016/wordml/cid" xmlns:w16="http://schemas.microsoft.com/office/word/2018/wordml" xmlns:w16du="http://schemas.microsoft.com/office/word/2023/wordml/word16du" xmlns:w16sdtdh="http://schemas.microsoft.com/office/word/2020/wordml/sdtdatahash" xmlns:w16sdtfl="http://schemas.microsoft.com/office/word/2024/wordml/sdtformatlock" xmlns:w16se="http://schemas.microsoft.com/office/word/2015/wordml/symex" xmlns:wpg="http://schemas.microsoft.com/office/word/2010/wordprocessingGroup" xmlns:wpi="http://schemas.microsoft.com/office/word/2010/wordprocessingInk" xmlns:wne="http://schemas.microsoft.com/office/word/2006/wordml" xmlns:wps="http://schemas.microsoft.com/office/word/2010/wordprocessingShape" mc:Ignorable="w14 w15 w16se w16cid w16 w16cex w16sdtdh w16sdtfl w16du wp14">
   <w:abstractNum w:abstractNumId="0" w15:restartNumberingAfterBreak="0">
+    <w:nsid w:val="04E44773"/>
+    <w:multiLevelType w:val="multilevel"/>
+    <w:tmpl w:val="9E5A75FE"/>
+    <w:lvl w:ilvl="0">
+      <w:start w:val="2"/>
+      <w:numFmt w:val="decimal"/>
+      <w:lvlText w:val="%1"/>
+      <w:lvlJc w:val="left"/>
+      <w:pPr>
+        <w:ind w:left="480" w:hanging="480"/>
+      </w:pPr>
+      <w:rPr>
+        <w:rFonts w:hint="default"/>
+      </w:rPr>
+    </w:lvl>
+    <w:lvl w:ilvl="1">
+      <w:start w:val="3"/>
+      <w:numFmt w:val="decimal"/>
+      <w:lvlText w:val="%1.%2"/>
+      <w:lvlJc w:val="left"/>
+      <w:pPr>
+        <w:ind w:left="480" w:hanging="480"/>
+      </w:pPr>
+      <w:rPr>
+        <w:rFonts w:hint="default"/>
+      </w:rPr>
+    </w:lvl>
+    <w:lvl w:ilvl="2">
+      <w:start w:val="2"/>
+      <w:numFmt w:val="decimal"/>
+      <w:lvlText w:val="%1.%2.%3"/>
+      <w:lvlJc w:val="left"/>
+      <w:pPr>
+        <w:ind w:left="720" w:hanging="720"/>
+      </w:pPr>
+      <w:rPr>
+        <w:rFonts w:hint="default"/>
+      </w:rPr>
+    </w:lvl>
+    <w:lvl w:ilvl="3">
+      <w:start w:val="1"/>
+      <w:numFmt w:val="decimal"/>
+      <w:lvlText w:val="%1.%2.%3.%4"/>
+      <w:lvlJc w:val="left"/>
+      <w:pPr>
+        <w:ind w:left="720" w:hanging="720"/>
+      </w:pPr>
+      <w:rPr>
+        <w:rFonts w:hint="default"/>
+      </w:rPr>
+    </w:lvl>
+    <w:lvl w:ilvl="4">
+      <w:start w:val="1"/>
+      <w:numFmt w:val="decimal"/>
+      <w:lvlText w:val="%1.%2.%3.%4.%5"/>
+      <w:lvlJc w:val="left"/>
+      <w:pPr>
+        <w:ind w:left="1080" w:hanging="1080"/>
+      </w:pPr>
+      <w:rPr>
+        <w:rFonts w:hint="default"/>
+      </w:rPr>
+    </w:lvl>
+    <w:lvl w:ilvl="5">
+      <w:start w:val="1"/>
+      <w:numFmt w:val="decimal"/>
+      <w:lvlText w:val="%1.%2.%3.%4.%5.%6"/>
+      <w:lvlJc w:val="left"/>
+      <w:pPr>
+        <w:ind w:left="1080" w:hanging="1080"/>
+      </w:pPr>
+      <w:rPr>
+        <w:rFonts w:hint="default"/>
+      </w:rPr>
+    </w:lvl>
+    <w:lvl w:ilvl="6">
+      <w:start w:val="1"/>
+      <w:numFmt w:val="decimal"/>
+      <w:lvlText w:val="%1.%2.%3.%4.%5.%6.%7"/>
+      <w:lvlJc w:val="left"/>
+      <w:pPr>
+        <w:ind w:left="1440" w:hanging="1440"/>
+      </w:pPr>
+      <w:rPr>
+        <w:rFonts w:hint="default"/>
+      </w:rPr>
+    </w:lvl>
+    <w:lvl w:ilvl="7">
+      <w:start w:val="1"/>
+      <w:numFmt w:val="decimal"/>
+      <w:lvlText w:val="%1.%2.%3.%4.%5.%6.%7.%8"/>
+      <w:lvlJc w:val="left"/>
+      <w:pPr>
+        <w:ind w:left="1440" w:hanging="1440"/>
+      </w:pPr>
+      <w:rPr>
+        <w:rFonts w:hint="default"/>
+      </w:rPr>
+    </w:lvl>
+    <w:lvl w:ilvl="8">
+      <w:start w:val="1"/>
+      <w:numFmt w:val="decimal"/>
+      <w:lvlText w:val="%1.%2.%3.%4.%5.%6.%7.%8.%9"/>
+      <w:lvlJc w:val="left"/>
+      <w:pPr>
+        <w:ind w:left="1800" w:hanging="1800"/>
+      </w:pPr>
+      <w:rPr>
+        <w:rFonts w:hint="default"/>
+      </w:rPr>
+    </w:lvl>
+  </w:abstractNum>
+  <w:abstractNum w:abstractNumId="1" w15:restartNumberingAfterBreak="0">
+    <w:nsid w:val="05704831"/>
+    <w:multiLevelType w:val="hybridMultilevel"/>
+    <w:tmpl w:val="8D4C2DAC"/>
+    <w:lvl w:ilvl="0" w:tplc="0409000F">
+      <w:start w:val="1"/>
+      <w:numFmt w:val="decimal"/>
+      <w:lvlText w:val="%1."/>
+      <w:lvlJc w:val="left"/>
+      <w:pPr>
+        <w:ind w:left="720" w:hanging="360"/>
+      </w:pPr>
+    </w:lvl>
+    <w:lvl w:ilvl="1" w:tplc="04090019" w:tentative="1">
+      <w:start w:val="1"/>
+      <w:numFmt w:val="lowerLetter"/>
+      <w:lvlText w:val="%2."/>
+      <w:lvlJc w:val="left"/>
+      <w:pPr>
+        <w:ind w:left="1440" w:hanging="360"/>
+      </w:pPr>
+    </w:lvl>
+    <w:lvl w:ilvl="2" w:tplc="0409001B" w:tentative="1">
+      <w:start w:val="1"/>
+      <w:numFmt w:val="lowerRoman"/>
+      <w:lvlText w:val="%3."/>
+      <w:lvlJc w:val="right"/>
+      <w:pPr>
+        <w:ind w:left="2160" w:hanging="180"/>
+      </w:pPr>
+    </w:lvl>
+    <w:lvl w:ilvl="3" w:tplc="0409000F" w:tentative="1">
+      <w:start w:val="1"/>
+      <w:numFmt w:val="decimal"/>
+      <w:lvlText w:val="%4."/>
+      <w:lvlJc w:val="left"/>
+      <w:pPr>
+        <w:ind w:left="2880" w:hanging="360"/>
+      </w:pPr>
+    </w:lvl>
+    <w:lvl w:ilvl="4" w:tplc="04090019" w:tentative="1">
+      <w:start w:val="1"/>
+      <w:numFmt w:val="lowerLetter"/>
+      <w:lvlText w:val="%5."/>
+      <w:lvlJc w:val="left"/>
+      <w:pPr>
+        <w:ind w:left="3600" w:hanging="360"/>
+      </w:pPr>
+    </w:lvl>
+    <w:lvl w:ilvl="5" w:tplc="0409001B" w:tentative="1">
+      <w:start w:val="1"/>
+      <w:numFmt w:val="lowerRoman"/>
+      <w:lvlText w:val="%6."/>
+      <w:lvlJc w:val="right"/>
+      <w:pPr>
+        <w:ind w:left="4320" w:hanging="180"/>
+      </w:pPr>
+    </w:lvl>
+    <w:lvl w:ilvl="6" w:tplc="0409000F" w:tentative="1">
+      <w:start w:val="1"/>
+      <w:numFmt w:val="decimal"/>
+      <w:lvlText w:val="%7."/>
+      <w:lvlJc w:val="left"/>
+      <w:pPr>
+        <w:ind w:left="5040" w:hanging="360"/>
+      </w:pPr>
+    </w:lvl>
+    <w:lvl w:ilvl="7" w:tplc="04090019" w:tentative="1">
+      <w:start w:val="1"/>
+      <w:numFmt w:val="lowerLetter"/>
+      <w:lvlText w:val="%8."/>
+      <w:lvlJc w:val="left"/>
+      <w:pPr>
+        <w:ind w:left="5760" w:hanging="360"/>
+      </w:pPr>
+    </w:lvl>
+    <w:lvl w:ilvl="8" w:tplc="0409001B" w:tentative="1">
+      <w:start w:val="1"/>
+      <w:numFmt w:val="lowerRoman"/>
+      <w:lvlText w:val="%9."/>
+      <w:lvlJc w:val="right"/>
+      <w:pPr>
+        <w:ind w:left="6480" w:hanging="180"/>
+      </w:pPr>
+    </w:lvl>
+  </w:abstractNum>
+  <w:abstractNum w:abstractNumId="2" w15:restartNumberingAfterBreak="0">
+    <w:nsid w:val="0FD215D9"/>
+    <w:multiLevelType w:val="multilevel"/>
+    <w:tmpl w:val="BD04EF74"/>
+    <w:lvl w:ilvl="0">
+      <w:start w:val="1"/>
+      <w:numFmt w:val="decimal"/>
+      <w:lvlText w:val="%1"/>
+      <w:lvlJc w:val="left"/>
+      <w:pPr>
+        <w:ind w:left="480" w:hanging="480"/>
+      </w:pPr>
+      <w:rPr>
+        <w:rFonts w:hint="default"/>
+      </w:rPr>
+    </w:lvl>
+    <w:lvl w:ilvl="1">
+      <w:start w:val="3"/>
+      <w:numFmt w:val="decimal"/>
+      <w:lvlText w:val="%1.%2"/>
+      <w:lvlJc w:val="left"/>
+      <w:pPr>
+        <w:ind w:left="480" w:hanging="480"/>
+      </w:pPr>
+      <w:rPr>
+        <w:rFonts w:hint="default"/>
+      </w:rPr>
+    </w:lvl>
+    <w:lvl w:ilvl="2">
+      <w:start w:val="2"/>
+      <w:numFmt w:val="decimal"/>
+      <w:lvlText w:val="%1.%2.%3"/>
+      <w:lvlJc w:val="left"/>
+      <w:pPr>
+        <w:ind w:left="720" w:hanging="720"/>
+      </w:pPr>
+      <w:rPr>
+        <w:rFonts w:hint="default"/>
+      </w:rPr>
+    </w:lvl>
+    <w:lvl w:ilvl="3">
+      <w:start w:val="1"/>
+      <w:numFmt w:val="decimal"/>
+      <w:lvlText w:val="%1.%2.%3.%4"/>
+      <w:lvlJc w:val="left"/>
+      <w:pPr>
+        <w:ind w:left="720" w:hanging="720"/>
+      </w:pPr>
+      <w:rPr>
+        <w:rFonts w:hint="default"/>
+      </w:rPr>
+    </w:lvl>
+    <w:lvl w:ilvl="4">
+      <w:start w:val="1"/>
+      <w:numFmt w:val="decimal"/>
+      <w:lvlText w:val="%1.%2.%3.%4.%5"/>
+      <w:lvlJc w:val="left"/>
+      <w:pPr>
+        <w:ind w:left="1080" w:hanging="1080"/>
+      </w:pPr>
+      <w:rPr>
+        <w:rFonts w:hint="default"/>
+      </w:rPr>
+    </w:lvl>
+    <w:lvl w:ilvl="5">
+      <w:start w:val="1"/>
+      <w:numFmt w:val="decimal"/>
+      <w:lvlText w:val="%1.%2.%3.%4.%5.%6"/>
+      <w:lvlJc w:val="left"/>
+      <w:pPr>
+        <w:ind w:left="1080" w:hanging="1080"/>
+      </w:pPr>
+      <w:rPr>
+        <w:rFonts w:hint="default"/>
+      </w:rPr>
+    </w:lvl>
+    <w:lvl w:ilvl="6">
+      <w:start w:val="1"/>
+      <w:numFmt w:val="decimal"/>
+      <w:lvlText w:val="%1.%2.%3.%4.%5.%6.%7"/>
+      <w:lvlJc w:val="left"/>
+      <w:pPr>
+        <w:ind w:left="1440" w:hanging="1440"/>
+      </w:pPr>
+      <w:rPr>
+        <w:rFonts w:hint="default"/>
+      </w:rPr>
+    </w:lvl>
+    <w:lvl w:ilvl="7">
+      <w:start w:val="1"/>
+      <w:numFmt w:val="decimal"/>
+      <w:lvlText w:val="%1.%2.%3.%4.%5.%6.%7.%8"/>
+      <w:lvlJc w:val="left"/>
+      <w:pPr>
+        <w:ind w:left="1440" w:hanging="1440"/>
+      </w:pPr>
+      <w:rPr>
+        <w:rFonts w:hint="default"/>
+      </w:rPr>
+    </w:lvl>
+    <w:lvl w:ilvl="8">
+      <w:start w:val="1"/>
+      <w:numFmt w:val="decimal"/>
+      <w:lvlText w:val="%1.%2.%3.%4.%5.%6.%7.%8.%9"/>
+      <w:lvlJc w:val="left"/>
+      <w:pPr>
+        <w:ind w:left="1800" w:hanging="1800"/>
+      </w:pPr>
+      <w:rPr>
+        <w:rFonts w:hint="default"/>
+      </w:rPr>
+    </w:lvl>
+  </w:abstractNum>
+  <w:abstractNum w:abstractNumId="3" w15:restartNumberingAfterBreak="0">
     <w:nsid w:val="26F67841"/>
     <w:multiLevelType w:val="hybridMultilevel"/>
     <w:tmpl w:val="5380E572"/>
@@ -1412,7 +4050,7 @@
       </w:pPr>
     </w:lvl>
   </w:abstractNum>
-  <w:abstractNum w:abstractNumId="1" w15:restartNumberingAfterBreak="0">
+  <w:abstractNum w:abstractNumId="4" w15:restartNumberingAfterBreak="0">
     <w:nsid w:val="27192001"/>
     <w:multiLevelType w:val="hybridMultilevel"/>
     <w:tmpl w:val="02F0FE36"/>
@@ -1498,7 +4136,7 @@
       </w:pPr>
     </w:lvl>
   </w:abstractNum>
-  <w:abstractNum w:abstractNumId="2" w15:restartNumberingAfterBreak="0">
+  <w:abstractNum w:abstractNumId="5" w15:restartNumberingAfterBreak="0">
     <w:nsid w:val="2BEB17C6"/>
     <w:multiLevelType w:val="hybridMultilevel"/>
     <w:tmpl w:val="9828A7D6"/>
@@ -1584,7 +4222,319 @@
       </w:pPr>
     </w:lvl>
   </w:abstractNum>
-  <w:abstractNum w:abstractNumId="3" w15:restartNumberingAfterBreak="0">
+  <w:abstractNum w:abstractNumId="6" w15:restartNumberingAfterBreak="0">
+    <w:nsid w:val="2EC56B39"/>
+    <w:multiLevelType w:val="multilevel"/>
+    <w:tmpl w:val="BD04EF74"/>
+    <w:lvl w:ilvl="0">
+      <w:start w:val="1"/>
+      <w:numFmt w:val="decimal"/>
+      <w:lvlText w:val="%1"/>
+      <w:lvlJc w:val="left"/>
+      <w:pPr>
+        <w:ind w:left="480" w:hanging="480"/>
+      </w:pPr>
+      <w:rPr>
+        <w:rFonts w:hint="default"/>
+      </w:rPr>
+    </w:lvl>
+    <w:lvl w:ilvl="1">
+      <w:start w:val="3"/>
+      <w:numFmt w:val="decimal"/>
+      <w:lvlText w:val="%1.%2"/>
+      <w:lvlJc w:val="left"/>
+      <w:pPr>
+        <w:ind w:left="480" w:hanging="480"/>
+      </w:pPr>
+      <w:rPr>
+        <w:rFonts w:hint="default"/>
+      </w:rPr>
+    </w:lvl>
+    <w:lvl w:ilvl="2">
+      <w:start w:val="2"/>
+      <w:numFmt w:val="decimal"/>
+      <w:lvlText w:val="%1.%2.%3"/>
+      <w:lvlJc w:val="left"/>
+      <w:pPr>
+        <w:ind w:left="720" w:hanging="720"/>
+      </w:pPr>
+      <w:rPr>
+        <w:rFonts w:hint="default"/>
+      </w:rPr>
+    </w:lvl>
+    <w:lvl w:ilvl="3">
+      <w:start w:val="1"/>
+      <w:numFmt w:val="decimal"/>
+      <w:lvlText w:val="%1.%2.%3.%4"/>
+      <w:lvlJc w:val="left"/>
+      <w:pPr>
+        <w:ind w:left="720" w:hanging="720"/>
+      </w:pPr>
+      <w:rPr>
+        <w:rFonts w:hint="default"/>
+      </w:rPr>
+    </w:lvl>
+    <w:lvl w:ilvl="4">
+      <w:start w:val="1"/>
+      <w:numFmt w:val="decimal"/>
+      <w:lvlText w:val="%1.%2.%3.%4.%5"/>
+      <w:lvlJc w:val="left"/>
+      <w:pPr>
+        <w:ind w:left="1080" w:hanging="1080"/>
+      </w:pPr>
+      <w:rPr>
+        <w:rFonts w:hint="default"/>
+      </w:rPr>
+    </w:lvl>
+    <w:lvl w:ilvl="5">
+      <w:start w:val="1"/>
+      <w:numFmt w:val="decimal"/>
+      <w:lvlText w:val="%1.%2.%3.%4.%5.%6"/>
+      <w:lvlJc w:val="left"/>
+      <w:pPr>
+        <w:ind w:left="1080" w:hanging="1080"/>
+      </w:pPr>
+      <w:rPr>
+        <w:rFonts w:hint="default"/>
+      </w:rPr>
+    </w:lvl>
+    <w:lvl w:ilvl="6">
+      <w:start w:val="1"/>
+      <w:numFmt w:val="decimal"/>
+      <w:lvlText w:val="%1.%2.%3.%4.%5.%6.%7"/>
+      <w:lvlJc w:val="left"/>
+      <w:pPr>
+        <w:ind w:left="1440" w:hanging="1440"/>
+      </w:pPr>
+      <w:rPr>
+        <w:rFonts w:hint="default"/>
+      </w:rPr>
+    </w:lvl>
+    <w:lvl w:ilvl="7">
+      <w:start w:val="1"/>
+      <w:numFmt w:val="decimal"/>
+      <w:lvlText w:val="%1.%2.%3.%4.%5.%6.%7.%8"/>
+      <w:lvlJc w:val="left"/>
+      <w:pPr>
+        <w:ind w:left="1440" w:hanging="1440"/>
+      </w:pPr>
+      <w:rPr>
+        <w:rFonts w:hint="default"/>
+      </w:rPr>
+    </w:lvl>
+    <w:lvl w:ilvl="8">
+      <w:start w:val="1"/>
+      <w:numFmt w:val="decimal"/>
+      <w:lvlText w:val="%1.%2.%3.%4.%5.%6.%7.%8.%9"/>
+      <w:lvlJc w:val="left"/>
+      <w:pPr>
+        <w:ind w:left="1800" w:hanging="1800"/>
+      </w:pPr>
+      <w:rPr>
+        <w:rFonts w:hint="default"/>
+      </w:rPr>
+    </w:lvl>
+  </w:abstractNum>
+  <w:abstractNum w:abstractNumId="7" w15:restartNumberingAfterBreak="0">
+    <w:nsid w:val="356241FB"/>
+    <w:multiLevelType w:val="multilevel"/>
+    <w:tmpl w:val="BD04EF74"/>
+    <w:lvl w:ilvl="0">
+      <w:start w:val="1"/>
+      <w:numFmt w:val="decimal"/>
+      <w:lvlText w:val="%1"/>
+      <w:lvlJc w:val="left"/>
+      <w:pPr>
+        <w:ind w:left="480" w:hanging="480"/>
+      </w:pPr>
+      <w:rPr>
+        <w:rFonts w:hint="default"/>
+      </w:rPr>
+    </w:lvl>
+    <w:lvl w:ilvl="1">
+      <w:start w:val="3"/>
+      <w:numFmt w:val="decimal"/>
+      <w:lvlText w:val="%1.%2"/>
+      <w:lvlJc w:val="left"/>
+      <w:pPr>
+        <w:ind w:left="480" w:hanging="480"/>
+      </w:pPr>
+      <w:rPr>
+        <w:rFonts w:hint="default"/>
+      </w:rPr>
+    </w:lvl>
+    <w:lvl w:ilvl="2">
+      <w:start w:val="2"/>
+      <w:numFmt w:val="decimal"/>
+      <w:lvlText w:val="%1.%2.%3"/>
+      <w:lvlJc w:val="left"/>
+      <w:pPr>
+        <w:ind w:left="720" w:hanging="720"/>
+      </w:pPr>
+      <w:rPr>
+        <w:rFonts w:hint="default"/>
+      </w:rPr>
+    </w:lvl>
+    <w:lvl w:ilvl="3">
+      <w:start w:val="1"/>
+      <w:numFmt w:val="decimal"/>
+      <w:lvlText w:val="%1.%2.%3.%4"/>
+      <w:lvlJc w:val="left"/>
+      <w:pPr>
+        <w:ind w:left="720" w:hanging="720"/>
+      </w:pPr>
+      <w:rPr>
+        <w:rFonts w:hint="default"/>
+      </w:rPr>
+    </w:lvl>
+    <w:lvl w:ilvl="4">
+      <w:start w:val="1"/>
+      <w:numFmt w:val="decimal"/>
+      <w:lvlText w:val="%1.%2.%3.%4.%5"/>
+      <w:lvlJc w:val="left"/>
+      <w:pPr>
+        <w:ind w:left="1080" w:hanging="1080"/>
+      </w:pPr>
+      <w:rPr>
+        <w:rFonts w:hint="default"/>
+      </w:rPr>
+    </w:lvl>
+    <w:lvl w:ilvl="5">
+      <w:start w:val="1"/>
+      <w:numFmt w:val="decimal"/>
+      <w:lvlText w:val="%1.%2.%3.%4.%5.%6"/>
+      <w:lvlJc w:val="left"/>
+      <w:pPr>
+        <w:ind w:left="1080" w:hanging="1080"/>
+      </w:pPr>
+      <w:rPr>
+        <w:rFonts w:hint="default"/>
+      </w:rPr>
+    </w:lvl>
+    <w:lvl w:ilvl="6">
+      <w:start w:val="1"/>
+      <w:numFmt w:val="decimal"/>
+      <w:lvlText w:val="%1.%2.%3.%4.%5.%6.%7"/>
+      <w:lvlJc w:val="left"/>
+      <w:pPr>
+        <w:ind w:left="1440" w:hanging="1440"/>
+      </w:pPr>
+      <w:rPr>
+        <w:rFonts w:hint="default"/>
+      </w:rPr>
+    </w:lvl>
+    <w:lvl w:ilvl="7">
+      <w:start w:val="1"/>
+      <w:numFmt w:val="decimal"/>
+      <w:lvlText w:val="%1.%2.%3.%4.%5.%6.%7.%8"/>
+      <w:lvlJc w:val="left"/>
+      <w:pPr>
+        <w:ind w:left="1440" w:hanging="1440"/>
+      </w:pPr>
+      <w:rPr>
+        <w:rFonts w:hint="default"/>
+      </w:rPr>
+    </w:lvl>
+    <w:lvl w:ilvl="8">
+      <w:start w:val="1"/>
+      <w:numFmt w:val="decimal"/>
+      <w:lvlText w:val="%1.%2.%3.%4.%5.%6.%7.%8.%9"/>
+      <w:lvlJc w:val="left"/>
+      <w:pPr>
+        <w:ind w:left="1800" w:hanging="1800"/>
+      </w:pPr>
+      <w:rPr>
+        <w:rFonts w:hint="default"/>
+      </w:rPr>
+    </w:lvl>
+  </w:abstractNum>
+  <w:abstractNum w:abstractNumId="8" w15:restartNumberingAfterBreak="0">
+    <w:nsid w:val="3C0E222D"/>
+    <w:multiLevelType w:val="hybridMultilevel"/>
+    <w:tmpl w:val="AE02ED94"/>
+    <w:lvl w:ilvl="0" w:tplc="0409000F">
+      <w:start w:val="1"/>
+      <w:numFmt w:val="decimal"/>
+      <w:lvlText w:val="%1."/>
+      <w:lvlJc w:val="left"/>
+      <w:pPr>
+        <w:ind w:left="720" w:hanging="360"/>
+      </w:pPr>
+    </w:lvl>
+    <w:lvl w:ilvl="1" w:tplc="04090019" w:tentative="1">
+      <w:start w:val="1"/>
+      <w:numFmt w:val="lowerLetter"/>
+      <w:lvlText w:val="%2."/>
+      <w:lvlJc w:val="left"/>
+      <w:pPr>
+        <w:ind w:left="1440" w:hanging="360"/>
+      </w:pPr>
+    </w:lvl>
+    <w:lvl w:ilvl="2" w:tplc="0409001B" w:tentative="1">
+      <w:start w:val="1"/>
+      <w:numFmt w:val="lowerRoman"/>
+      <w:lvlText w:val="%3."/>
+      <w:lvlJc w:val="right"/>
+      <w:pPr>
+        <w:ind w:left="2160" w:hanging="180"/>
+      </w:pPr>
+    </w:lvl>
+    <w:lvl w:ilvl="3" w:tplc="0409000F" w:tentative="1">
+      <w:start w:val="1"/>
+      <w:numFmt w:val="decimal"/>
+      <w:lvlText w:val="%4."/>
+      <w:lvlJc w:val="left"/>
+      <w:pPr>
+        <w:ind w:left="2880" w:hanging="360"/>
+      </w:pPr>
+    </w:lvl>
+    <w:lvl w:ilvl="4" w:tplc="04090019" w:tentative="1">
+      <w:start w:val="1"/>
+      <w:numFmt w:val="lowerLetter"/>
+      <w:lvlText w:val="%5."/>
+      <w:lvlJc w:val="left"/>
+      <w:pPr>
+        <w:ind w:left="3600" w:hanging="360"/>
+      </w:pPr>
+    </w:lvl>
+    <w:lvl w:ilvl="5" w:tplc="0409001B" w:tentative="1">
+      <w:start w:val="1"/>
+      <w:numFmt w:val="lowerRoman"/>
+      <w:lvlText w:val="%6."/>
+      <w:lvlJc w:val="right"/>
+      <w:pPr>
+        <w:ind w:left="4320" w:hanging="180"/>
+      </w:pPr>
+    </w:lvl>
+    <w:lvl w:ilvl="6" w:tplc="0409000F" w:tentative="1">
+      <w:start w:val="1"/>
+      <w:numFmt w:val="decimal"/>
+      <w:lvlText w:val="%7."/>
+      <w:lvlJc w:val="left"/>
+      <w:pPr>
+        <w:ind w:left="5040" w:hanging="360"/>
+      </w:pPr>
+    </w:lvl>
+    <w:lvl w:ilvl="7" w:tplc="04090019" w:tentative="1">
+      <w:start w:val="1"/>
+      <w:numFmt w:val="lowerLetter"/>
+      <w:lvlText w:val="%8."/>
+      <w:lvlJc w:val="left"/>
+      <w:pPr>
+        <w:ind w:left="5760" w:hanging="360"/>
+      </w:pPr>
+    </w:lvl>
+    <w:lvl w:ilvl="8" w:tplc="0409001B" w:tentative="1">
+      <w:start w:val="1"/>
+      <w:numFmt w:val="lowerRoman"/>
+      <w:lvlText w:val="%9."/>
+      <w:lvlJc w:val="right"/>
+      <w:pPr>
+        <w:ind w:left="6480" w:hanging="180"/>
+      </w:pPr>
+    </w:lvl>
+  </w:abstractNum>
+  <w:abstractNum w:abstractNumId="9" w15:restartNumberingAfterBreak="0">
     <w:nsid w:val="44C32271"/>
     <w:multiLevelType w:val="hybridMultilevel"/>
     <w:tmpl w:val="02443638"/>
@@ -1670,10 +4620,10 @@
       </w:pPr>
     </w:lvl>
   </w:abstractNum>
-  <w:abstractNum w:abstractNumId="4" w15:restartNumberingAfterBreak="0">
-    <w:nsid w:val="6CF656EE"/>
+  <w:abstractNum w:abstractNumId="10" w15:restartNumberingAfterBreak="0">
+    <w:nsid w:val="47525725"/>
     <w:multiLevelType w:val="hybridMultilevel"/>
-    <w:tmpl w:val="819A5BC0"/>
+    <w:tmpl w:val="B94C3288"/>
     <w:lvl w:ilvl="0" w:tplc="0409000F">
       <w:start w:val="1"/>
       <w:numFmt w:val="decimal"/>
@@ -1756,7 +4706,265 @@
       </w:pPr>
     </w:lvl>
   </w:abstractNum>
-  <w:abstractNum w:abstractNumId="5" w15:restartNumberingAfterBreak="0">
+  <w:abstractNum w:abstractNumId="11" w15:restartNumberingAfterBreak="0">
+    <w:nsid w:val="5ACB701F"/>
+    <w:multiLevelType w:val="hybridMultilevel"/>
+    <w:tmpl w:val="6E6450DC"/>
+    <w:lvl w:ilvl="0" w:tplc="FFFFFFFF">
+      <w:start w:val="1"/>
+      <w:numFmt w:val="decimal"/>
+      <w:lvlText w:val="%1."/>
+      <w:lvlJc w:val="left"/>
+      <w:pPr>
+        <w:ind w:left="720" w:hanging="360"/>
+      </w:pPr>
+    </w:lvl>
+    <w:lvl w:ilvl="1" w:tplc="04090019" w:tentative="1">
+      <w:start w:val="1"/>
+      <w:numFmt w:val="lowerLetter"/>
+      <w:lvlText w:val="%2."/>
+      <w:lvlJc w:val="left"/>
+      <w:pPr>
+        <w:ind w:left="1440" w:hanging="360"/>
+      </w:pPr>
+    </w:lvl>
+    <w:lvl w:ilvl="2" w:tplc="0409001B" w:tentative="1">
+      <w:start w:val="1"/>
+      <w:numFmt w:val="lowerRoman"/>
+      <w:lvlText w:val="%3."/>
+      <w:lvlJc w:val="right"/>
+      <w:pPr>
+        <w:ind w:left="2160" w:hanging="180"/>
+      </w:pPr>
+    </w:lvl>
+    <w:lvl w:ilvl="3" w:tplc="0409000F" w:tentative="1">
+      <w:start w:val="1"/>
+      <w:numFmt w:val="decimal"/>
+      <w:lvlText w:val="%4."/>
+      <w:lvlJc w:val="left"/>
+      <w:pPr>
+        <w:ind w:left="2880" w:hanging="360"/>
+      </w:pPr>
+    </w:lvl>
+    <w:lvl w:ilvl="4" w:tplc="04090019" w:tentative="1">
+      <w:start w:val="1"/>
+      <w:numFmt w:val="lowerLetter"/>
+      <w:lvlText w:val="%5."/>
+      <w:lvlJc w:val="left"/>
+      <w:pPr>
+        <w:ind w:left="3600" w:hanging="360"/>
+      </w:pPr>
+    </w:lvl>
+    <w:lvl w:ilvl="5" w:tplc="0409001B" w:tentative="1">
+      <w:start w:val="1"/>
+      <w:numFmt w:val="lowerRoman"/>
+      <w:lvlText w:val="%6."/>
+      <w:lvlJc w:val="right"/>
+      <w:pPr>
+        <w:ind w:left="4320" w:hanging="180"/>
+      </w:pPr>
+    </w:lvl>
+    <w:lvl w:ilvl="6" w:tplc="0409000F" w:tentative="1">
+      <w:start w:val="1"/>
+      <w:numFmt w:val="decimal"/>
+      <w:lvlText w:val="%7."/>
+      <w:lvlJc w:val="left"/>
+      <w:pPr>
+        <w:ind w:left="5040" w:hanging="360"/>
+      </w:pPr>
+    </w:lvl>
+    <w:lvl w:ilvl="7" w:tplc="04090019" w:tentative="1">
+      <w:start w:val="1"/>
+      <w:numFmt w:val="lowerLetter"/>
+      <w:lvlText w:val="%8."/>
+      <w:lvlJc w:val="left"/>
+      <w:pPr>
+        <w:ind w:left="5760" w:hanging="360"/>
+      </w:pPr>
+    </w:lvl>
+    <w:lvl w:ilvl="8" w:tplc="0409001B" w:tentative="1">
+      <w:start w:val="1"/>
+      <w:numFmt w:val="lowerRoman"/>
+      <w:lvlText w:val="%9."/>
+      <w:lvlJc w:val="right"/>
+      <w:pPr>
+        <w:ind w:left="6480" w:hanging="180"/>
+      </w:pPr>
+    </w:lvl>
+  </w:abstractNum>
+  <w:abstractNum w:abstractNumId="12" w15:restartNumberingAfterBreak="0">
+    <w:nsid w:val="6104317B"/>
+    <w:multiLevelType w:val="hybridMultilevel"/>
+    <w:tmpl w:val="1436B1F0"/>
+    <w:lvl w:ilvl="0" w:tplc="FFFFFFFF">
+      <w:start w:val="1"/>
+      <w:numFmt w:val="decimal"/>
+      <w:lvlText w:val="%1."/>
+      <w:lvlJc w:val="left"/>
+      <w:pPr>
+        <w:ind w:left="720" w:hanging="360"/>
+      </w:pPr>
+    </w:lvl>
+    <w:lvl w:ilvl="1" w:tplc="FFFFFFFF" w:tentative="1">
+      <w:start w:val="1"/>
+      <w:numFmt w:val="lowerLetter"/>
+      <w:lvlText w:val="%2."/>
+      <w:lvlJc w:val="left"/>
+      <w:pPr>
+        <w:ind w:left="1440" w:hanging="360"/>
+      </w:pPr>
+    </w:lvl>
+    <w:lvl w:ilvl="2" w:tplc="FFFFFFFF" w:tentative="1">
+      <w:start w:val="1"/>
+      <w:numFmt w:val="lowerRoman"/>
+      <w:lvlText w:val="%3."/>
+      <w:lvlJc w:val="right"/>
+      <w:pPr>
+        <w:ind w:left="2160" w:hanging="180"/>
+      </w:pPr>
+    </w:lvl>
+    <w:lvl w:ilvl="3" w:tplc="FFFFFFFF" w:tentative="1">
+      <w:start w:val="1"/>
+      <w:numFmt w:val="decimal"/>
+      <w:lvlText w:val="%4."/>
+      <w:lvlJc w:val="left"/>
+      <w:pPr>
+        <w:ind w:left="2880" w:hanging="360"/>
+      </w:pPr>
+    </w:lvl>
+    <w:lvl w:ilvl="4" w:tplc="FFFFFFFF" w:tentative="1">
+      <w:start w:val="1"/>
+      <w:numFmt w:val="lowerLetter"/>
+      <w:lvlText w:val="%5."/>
+      <w:lvlJc w:val="left"/>
+      <w:pPr>
+        <w:ind w:left="3600" w:hanging="360"/>
+      </w:pPr>
+    </w:lvl>
+    <w:lvl w:ilvl="5" w:tplc="FFFFFFFF" w:tentative="1">
+      <w:start w:val="1"/>
+      <w:numFmt w:val="lowerRoman"/>
+      <w:lvlText w:val="%6."/>
+      <w:lvlJc w:val="right"/>
+      <w:pPr>
+        <w:ind w:left="4320" w:hanging="180"/>
+      </w:pPr>
+    </w:lvl>
+    <w:lvl w:ilvl="6" w:tplc="FFFFFFFF" w:tentative="1">
+      <w:start w:val="1"/>
+      <w:numFmt w:val="decimal"/>
+      <w:lvlText w:val="%7."/>
+      <w:lvlJc w:val="left"/>
+      <w:pPr>
+        <w:ind w:left="5040" w:hanging="360"/>
+      </w:pPr>
+    </w:lvl>
+    <w:lvl w:ilvl="7" w:tplc="FFFFFFFF" w:tentative="1">
+      <w:start w:val="1"/>
+      <w:numFmt w:val="lowerLetter"/>
+      <w:lvlText w:val="%8."/>
+      <w:lvlJc w:val="left"/>
+      <w:pPr>
+        <w:ind w:left="5760" w:hanging="360"/>
+      </w:pPr>
+    </w:lvl>
+    <w:lvl w:ilvl="8" w:tplc="FFFFFFFF" w:tentative="1">
+      <w:start w:val="1"/>
+      <w:numFmt w:val="lowerRoman"/>
+      <w:lvlText w:val="%9."/>
+      <w:lvlJc w:val="right"/>
+      <w:pPr>
+        <w:ind w:left="6480" w:hanging="180"/>
+      </w:pPr>
+    </w:lvl>
+  </w:abstractNum>
+  <w:abstractNum w:abstractNumId="13" w15:restartNumberingAfterBreak="0">
+    <w:nsid w:val="6CF656EE"/>
+    <w:multiLevelType w:val="hybridMultilevel"/>
+    <w:tmpl w:val="1436B1F0"/>
+    <w:lvl w:ilvl="0" w:tplc="0409000F">
+      <w:start w:val="1"/>
+      <w:numFmt w:val="decimal"/>
+      <w:lvlText w:val="%1."/>
+      <w:lvlJc w:val="left"/>
+      <w:pPr>
+        <w:ind w:left="720" w:hanging="360"/>
+      </w:pPr>
+    </w:lvl>
+    <w:lvl w:ilvl="1" w:tplc="04090019" w:tentative="1">
+      <w:start w:val="1"/>
+      <w:numFmt w:val="lowerLetter"/>
+      <w:lvlText w:val="%2."/>
+      <w:lvlJc w:val="left"/>
+      <w:pPr>
+        <w:ind w:left="1440" w:hanging="360"/>
+      </w:pPr>
+    </w:lvl>
+    <w:lvl w:ilvl="2" w:tplc="0409001B" w:tentative="1">
+      <w:start w:val="1"/>
+      <w:numFmt w:val="lowerRoman"/>
+      <w:lvlText w:val="%3."/>
+      <w:lvlJc w:val="right"/>
+      <w:pPr>
+        <w:ind w:left="2160" w:hanging="180"/>
+      </w:pPr>
+    </w:lvl>
+    <w:lvl w:ilvl="3" w:tplc="0409000F" w:tentative="1">
+      <w:start w:val="1"/>
+      <w:numFmt w:val="decimal"/>
+      <w:lvlText w:val="%4."/>
+      <w:lvlJc w:val="left"/>
+      <w:pPr>
+        <w:ind w:left="2880" w:hanging="360"/>
+      </w:pPr>
+    </w:lvl>
+    <w:lvl w:ilvl="4" w:tplc="04090019" w:tentative="1">
+      <w:start w:val="1"/>
+      <w:numFmt w:val="lowerLetter"/>
+      <w:lvlText w:val="%5."/>
+      <w:lvlJc w:val="left"/>
+      <w:pPr>
+        <w:ind w:left="3600" w:hanging="360"/>
+      </w:pPr>
+    </w:lvl>
+    <w:lvl w:ilvl="5" w:tplc="0409001B" w:tentative="1">
+      <w:start w:val="1"/>
+      <w:numFmt w:val="lowerRoman"/>
+      <w:lvlText w:val="%6."/>
+      <w:lvlJc w:val="right"/>
+      <w:pPr>
+        <w:ind w:left="4320" w:hanging="180"/>
+      </w:pPr>
+    </w:lvl>
+    <w:lvl w:ilvl="6" w:tplc="0409000F" w:tentative="1">
+      <w:start w:val="1"/>
+      <w:numFmt w:val="decimal"/>
+      <w:lvlText w:val="%7."/>
+      <w:lvlJc w:val="left"/>
+      <w:pPr>
+        <w:ind w:left="5040" w:hanging="360"/>
+      </w:pPr>
+    </w:lvl>
+    <w:lvl w:ilvl="7" w:tplc="04090019" w:tentative="1">
+      <w:start w:val="1"/>
+      <w:numFmt w:val="lowerLetter"/>
+      <w:lvlText w:val="%8."/>
+      <w:lvlJc w:val="left"/>
+      <w:pPr>
+        <w:ind w:left="5760" w:hanging="360"/>
+      </w:pPr>
+    </w:lvl>
+    <w:lvl w:ilvl="8" w:tplc="0409001B" w:tentative="1">
+      <w:start w:val="1"/>
+      <w:numFmt w:val="lowerRoman"/>
+      <w:lvlText w:val="%9."/>
+      <w:lvlJc w:val="right"/>
+      <w:pPr>
+        <w:ind w:left="6480" w:hanging="180"/>
+      </w:pPr>
+    </w:lvl>
+  </w:abstractNum>
+  <w:abstractNum w:abstractNumId="14" w15:restartNumberingAfterBreak="0">
     <w:nsid w:val="75493BA8"/>
     <w:multiLevelType w:val="hybridMultilevel"/>
     <w:tmpl w:val="C5F616D0"/>
@@ -1842,23 +5050,139 @@
       </w:pPr>
     </w:lvl>
   </w:abstractNum>
+  <w:abstractNum w:abstractNumId="15" w15:restartNumberingAfterBreak="0">
+    <w:nsid w:val="79837203"/>
+    <w:multiLevelType w:val="hybridMultilevel"/>
+    <w:tmpl w:val="73FAA8BE"/>
+    <w:lvl w:ilvl="0" w:tplc="0409000F">
+      <w:start w:val="1"/>
+      <w:numFmt w:val="decimal"/>
+      <w:lvlText w:val="%1."/>
+      <w:lvlJc w:val="left"/>
+      <w:pPr>
+        <w:ind w:left="720" w:hanging="360"/>
+      </w:pPr>
+    </w:lvl>
+    <w:lvl w:ilvl="1" w:tplc="04090019" w:tentative="1">
+      <w:start w:val="1"/>
+      <w:numFmt w:val="lowerLetter"/>
+      <w:lvlText w:val="%2."/>
+      <w:lvlJc w:val="left"/>
+      <w:pPr>
+        <w:ind w:left="1440" w:hanging="360"/>
+      </w:pPr>
+    </w:lvl>
+    <w:lvl w:ilvl="2" w:tplc="0409001B" w:tentative="1">
+      <w:start w:val="1"/>
+      <w:numFmt w:val="lowerRoman"/>
+      <w:lvlText w:val="%3."/>
+      <w:lvlJc w:val="right"/>
+      <w:pPr>
+        <w:ind w:left="2160" w:hanging="180"/>
+      </w:pPr>
+    </w:lvl>
+    <w:lvl w:ilvl="3" w:tplc="0409000F" w:tentative="1">
+      <w:start w:val="1"/>
+      <w:numFmt w:val="decimal"/>
+      <w:lvlText w:val="%4."/>
+      <w:lvlJc w:val="left"/>
+      <w:pPr>
+        <w:ind w:left="2880" w:hanging="360"/>
+      </w:pPr>
+    </w:lvl>
+    <w:lvl w:ilvl="4" w:tplc="04090019" w:tentative="1">
+      <w:start w:val="1"/>
+      <w:numFmt w:val="lowerLetter"/>
+      <w:lvlText w:val="%5."/>
+      <w:lvlJc w:val="left"/>
+      <w:pPr>
+        <w:ind w:left="3600" w:hanging="360"/>
+      </w:pPr>
+    </w:lvl>
+    <w:lvl w:ilvl="5" w:tplc="0409001B" w:tentative="1">
+      <w:start w:val="1"/>
+      <w:numFmt w:val="lowerRoman"/>
+      <w:lvlText w:val="%6."/>
+      <w:lvlJc w:val="right"/>
+      <w:pPr>
+        <w:ind w:left="4320" w:hanging="180"/>
+      </w:pPr>
+    </w:lvl>
+    <w:lvl w:ilvl="6" w:tplc="0409000F" w:tentative="1">
+      <w:start w:val="1"/>
+      <w:numFmt w:val="decimal"/>
+      <w:lvlText w:val="%7."/>
+      <w:lvlJc w:val="left"/>
+      <w:pPr>
+        <w:ind w:left="5040" w:hanging="360"/>
+      </w:pPr>
+    </w:lvl>
+    <w:lvl w:ilvl="7" w:tplc="04090019" w:tentative="1">
+      <w:start w:val="1"/>
+      <w:numFmt w:val="lowerLetter"/>
+      <w:lvlText w:val="%8."/>
+      <w:lvlJc w:val="left"/>
+      <w:pPr>
+        <w:ind w:left="5760" w:hanging="360"/>
+      </w:pPr>
+    </w:lvl>
+    <w:lvl w:ilvl="8" w:tplc="0409001B" w:tentative="1">
+      <w:start w:val="1"/>
+      <w:numFmt w:val="lowerRoman"/>
+      <w:lvlText w:val="%9."/>
+      <w:lvlJc w:val="right"/>
+      <w:pPr>
+        <w:ind w:left="6480" w:hanging="180"/>
+      </w:pPr>
+    </w:lvl>
+  </w:abstractNum>
   <w:num w:numId="1" w16cid:durableId="1113943460">
+    <w:abstractNumId w:val="13"/>
+  </w:num>
+  <w:num w:numId="2" w16cid:durableId="1005789063">
     <w:abstractNumId w:val="4"/>
   </w:num>
-  <w:num w:numId="2" w16cid:durableId="1005789063">
+  <w:num w:numId="3" w16cid:durableId="9378922">
+    <w:abstractNumId w:val="9"/>
+  </w:num>
+  <w:num w:numId="4" w16cid:durableId="1724210860">
+    <w:abstractNumId w:val="3"/>
+  </w:num>
+  <w:num w:numId="5" w16cid:durableId="1987932203">
+    <w:abstractNumId w:val="14"/>
+  </w:num>
+  <w:num w:numId="6" w16cid:durableId="1660497119">
+    <w:abstractNumId w:val="5"/>
+  </w:num>
+  <w:num w:numId="7" w16cid:durableId="1308778253">
+    <w:abstractNumId w:val="8"/>
+  </w:num>
+  <w:num w:numId="8" w16cid:durableId="40180637">
     <w:abstractNumId w:val="1"/>
   </w:num>
-  <w:num w:numId="3" w16cid:durableId="9378922">
-    <w:abstractNumId w:val="3"/>
+  <w:num w:numId="9" w16cid:durableId="2111126169">
+    <w:abstractNumId w:val="10"/>
   </w:num>
-  <w:num w:numId="4" w16cid:durableId="1724210860">
+  <w:num w:numId="10" w16cid:durableId="1641808421">
+    <w:abstractNumId w:val="15"/>
+  </w:num>
+  <w:num w:numId="11" w16cid:durableId="2103335277">
+    <w:abstractNumId w:val="12"/>
+  </w:num>
+  <w:num w:numId="12" w16cid:durableId="1910269256">
+    <w:abstractNumId w:val="11"/>
+  </w:num>
+  <w:num w:numId="13" w16cid:durableId="47415229">
     <w:abstractNumId w:val="0"/>
   </w:num>
-  <w:num w:numId="5" w16cid:durableId="1987932203">
-    <w:abstractNumId w:val="5"/>
+  <w:num w:numId="14" w16cid:durableId="1672836251">
+    <w:abstractNumId w:val="7"/>
   </w:num>
-  <w:num w:numId="6" w16cid:durableId="1660497119">
+  <w:num w:numId="15" w16cid:durableId="1257985022">
     <w:abstractNumId w:val="2"/>
+  </w:num>
+  <w:num w:numId="16" w16cid:durableId="1073358988">
+    <w:abstractNumId w:val="6"/>
   </w:num>
 </w:numbering>
 </file>

</xml_diff>

<commit_message>
Chore (doc): Updated Chapter 2
</commit_message>
<xml_diff>
--- a/Chapter2.docx
+++ b/Chapter2.docx
@@ -59,42 +59,84 @@
     </w:p>
     <w:p>
       <w:r>
-        <w:t xml:space="preserve">A sound zero-knowledge system is commonly discussed in terms of completeness, soundness, and zero-knowledge. Completeness requires an honest proof of a true statement to be accepted; </w:t>
-      </w:r>
-      <w:r>
         <w:lastRenderedPageBreak/>
-        <w:t>soundness limits the ability of a dishonest prover to convince the verifier of a false statement; and zero-knowledge limits the information learned by the verifier beyond the validity of the statement. For this study, these properties provide the security foundation, but the primary research concern is performance: what computational and blockchain costs arise when privacy-preserving credential verification is implemented as a ZK-SNARK workflow?</w:t>
+        <w:t xml:space="preserve">A sound zero-knowledge system is commonly discussed in terms of completeness, soundness, and zero-knowledge. Completeness requires an honest proof of a true statement to be accepted; soundness limits the ability of a dishonest prover to convince the verifier of a false statement; and zero-knowledge limits the information learned by the verifier beyond the validity of the statement. </w:t>
       </w:r>
     </w:p>
     <w:p>
-      <w:pPr>
-        <w:pStyle w:val="Heading3"/>
-      </w:pPr>
-      <w:r>
-        <w:t>2.1.2 ZK-SNARKs</w:t>
+      <w:r>
+        <w:t>A zero-knowledge proof (ZKP) is a cryptographic primitive enabling a prover (</w:t>
+      </w:r>
+      <w:r>
+        <w:t>P</w:t>
+      </w:r>
+      <w:r>
+        <w:t>) to demonstrate the truth of a statement to a verifier (V) without revealing the private witness that makes the statement true. Formally, for an NP-relation R(x, w) with public input x and private witness w, a ZKP scheme must satisfy three core properties</w:t>
+      </w:r>
+      <w:r>
+        <w:t>;</w:t>
       </w:r>
     </w:p>
     <w:p>
-      <w:r>
-        <w:t>ZK-SNARKs are non-interactive zero-knowledge arguments designed to provide succinct proofs and efficient verification. Their practical value in blockchain applications arises from moving computationally intensive private computation off-chain while allowing a verifier, including a smart contract, to check a compact proof. However, succinctness does not mean that all performance dimensions are independent of circuit design. Proof generation, witness construction, memory consumption, proof representation, public inputs, the proving backend, and verifier implementation can all affect practical performance.</w:t>
+      <w:pPr>
+        <w:pStyle w:val="ListParagraph"/>
+        <w:numPr>
+          <w:ilvl w:val="0"/>
+          <w:numId w:val="10"/>
+        </w:numPr>
+      </w:pPr>
+      <w:r>
+        <w:rPr>
+          <w:b/>
+          <w:bCs/>
+        </w:rPr>
+        <w:t>Completeness</w:t>
+      </w:r>
+      <w:r>
+        <w:t>: If the statement is true and both participants follow the protocol correctly, the verifier accepts the proof.</w:t>
       </w:r>
     </w:p>
     <w:p>
-      <w:r>
-        <w:t>A typical ZK-SNARK workflow involves circuit definition, witness construction, proof generation, and proof verification. Depending on the proving system, setup or key-generation activities may also be required. The distinction between proving and verification is central to this research because the computational burden is not necessarily distributed equally between prover and verifier.</w:t>
+      <w:pPr>
+        <w:pStyle w:val="ListParagraph"/>
+        <w:numPr>
+          <w:ilvl w:val="0"/>
+          <w:numId w:val="10"/>
+        </w:numPr>
+      </w:pPr>
+      <w:r>
+        <w:rPr>
+          <w:b/>
+          <w:bCs/>
+        </w:rPr>
+        <w:t>Soundness</w:t>
+      </w:r>
+      <w:r>
+        <w:t>: A dishonest prover should not be able to convince the verifier of a false statement except with negligible probability.</w:t>
       </w:r>
     </w:p>
     <w:p>
       <w:pPr>
-        <w:pStyle w:val="Heading3"/>
-      </w:pPr>
-      <w:r>
-        <w:t>2.1.3 Proof Generation and Verification as Separate Performance Problems</w:t>
+        <w:pStyle w:val="ListParagraph"/>
+        <w:numPr>
+          <w:ilvl w:val="0"/>
+          <w:numId w:val="10"/>
+        </w:numPr>
+      </w:pPr>
+      <w:r>
+        <w:rPr>
+          <w:b/>
+          <w:bCs/>
+        </w:rPr>
+        <w:t>Zero-knowledge</w:t>
+      </w:r>
+      <w:r>
+        <w:t>: The verifier learns no additional information about the secret inputs beyond the fact that the claimed statement is valid.</w:t>
       </w:r>
     </w:p>
     <w:p>
       <w:r>
-        <w:t>Previous research supports treating off-chain proving and verification as related but distinct performance problems. Schanzenbach et al. (2019) introduced ZKlaims, a SNARK-based approach to privacy-preserving attribute credentials and included a performance evaluation. Later credential research also measured presentation, verification, and blockchain-related costs (Flamini et al., 2024; Xu et al., 2023). These studies support reporting separate measurements rather than reducing system efficiency to a single value.</w:t>
+        <w:t>For this study, these properties provide the security foundation, but the primary research concern is performance: what computational and blockchain costs arise when privacy-preserving credential verification is implemented as a ZK-SNARK workflow?</w:t>
       </w:r>
     </w:p>
     <w:p>
@@ -102,47 +144,74 @@
         <w:pStyle w:val="Heading3"/>
       </w:pPr>
       <w:r>
-        <w:t>2.2 Attribute-Based and Verifiable Credentials</w:t>
+        <w:t>2.1.2 ZK-SNARKs</w:t>
       </w:r>
     </w:p>
     <w:p>
-      <w:pPr>
-        <w:pStyle w:val="Heading3"/>
-      </w:pPr>
-      <w:r>
-        <w:t>2.2.1 Attribute-Based Credentials</w:t>
+      <w:r>
+        <w:t>ZK-SNARKs are non-interactive zero-knowledge arguments designed to provide succinct proofs and efficient verification. Their practical value in blockchain applications arises from moving computationally intensive private computation off-chain while allowing a verifier, including a smart contract, to check a compact proof. However, succinctness does not mean that all performance dimensions are independent of circuit design. Proof generation, witness construction, memory consumption, proof representation, public inputs, the proving backend, and verifier implementation can all affect practical performance.</w:t>
       </w:r>
     </w:p>
     <w:p>
       <w:r>
-        <w:t xml:space="preserve">Attribute-based credentials (ABCs) allow a holder to receive credentials containing attributes or claims from an issuer and later demonstrate possession of those attributes to a verifier. Typical </w:t>
+        <w:t>A typical ZK-SNARK workflow involves circuit definition, witness construction, proof generation, and proof verification. Depending on the proving system, setup or key-</w:t>
       </w:r>
       <w:r>
         <w:lastRenderedPageBreak/>
-        <w:t>attributes include age, nationality, membership, educational qualification, or eligibility. The principal roles are the issuer, holder, and verifier, with registries or revocation mechanisms sometimes added to establish credential status.</w:t>
+        <w:t>generation activities may also be required. The distinction between proving and verification is central to this research because the computational burden is not necessarily distributed equally between prover and verifier.</w:t>
       </w:r>
     </w:p>
     <w:p>
       <w:r>
-        <w:t>The ABC model is closely related to the broader verifiable-credential ecosystem. The W3C Verifiable Credentials Data Model 2.0 defines an issuer-holder-verifier ecosystem and a standardised data model for expressing and verifying claims (World Wide Web Consortium [W3C], 2025). The standard also recognises zero-knowledge mechanisms as relevant to privacy-enhancing credential presentations.</w:t>
+        <w:t>ZK-SNARKs (Zero-Knowledge Succinct Non-Interactive Arguments of Knowledge) enforce succinct proof sizes and fast verification times independently of circuit computation size. A standard ZK-SNARK scheme consists of three polynomial-time algorithms (Setup,</w:t>
+      </w:r>
+      <w:r>
+        <w:t xml:space="preserve"> </w:t>
+      </w:r>
+      <w:r>
+        <w:t>Prove</w:t>
+      </w:r>
+      <w:r>
+        <w:t xml:space="preserve"> and </w:t>
+      </w:r>
+      <w:r>
+        <w:t>Verify)</w:t>
+      </w:r>
+      <w:r>
+        <w:t>.</w:t>
+      </w:r>
+      <w:r>
+        <w:t xml:space="preserve"> </w:t>
       </w:r>
     </w:p>
     <w:p>
-      <w:pPr>
-        <w:pStyle w:val="Heading3"/>
-      </w:pPr>
-      <w:r>
-        <w:t>2.2.2 Selective Disclosure and Predicate Proofs</w:t>
+      <w:r>
+        <w:t>To execute computations inside a ZK-SNARK, high-level code is transformed into an arithmetic circuit over a finite field</w:t>
+      </w:r>
+      <w:r>
+        <w:t>.</w:t>
+      </w:r>
+      <w:r>
+        <w:t xml:space="preserve"> While legacy systems rely on Rank-1 Constraint Systems (R1CS) enforcing equations</w:t>
+      </w:r>
+      <w:r>
+        <w:t xml:space="preserve">, </w:t>
+      </w:r>
+      <w:r>
+        <w:t>modern systems like Noir utilize PlonKish Arithmetization. PlonKish grids support custom gate constraints and Plookup tables, significantly reducing constraint overhead for non-linear operations such as cryptographic hashing and range checks.</w:t>
       </w:r>
     </w:p>
     <w:p>
-      <w:r>
-        <w:t>Privacy in credential systems can be achieved through selective disclosure, in which only selected claims are revealed, or through predicate proofs, in which a holder demonstrates that an attribute satisfies a condition without revealing its value. These mechanisms address the problem of revealing more information than is necessary for a verification decision.</w:t>
+      <w:pPr>
+        <w:pStyle w:val="Heading3"/>
+      </w:pPr>
+      <w:r>
+        <w:t>2.1.3 Proof Generation and Verification as Separate Performance Problems</w:t>
       </w:r>
     </w:p>
     <w:p>
       <w:r>
-        <w:t>Flamini et al. (2024) compared cryptographic mechanisms for selective disclosure and evaluated properties including presentation size, generation time, verification time, unlinkability, and predicate-proof support. Their work demonstrates that privacy functionality and performance need to be considered together. However, it does not provide an end-to-end evaluation of a Noir-based ZK-SNARK credential circuit verified through an Ethereum smart contract.</w:t>
+        <w:t>Previous research supports treating off-chain proving and verification as related but distinct performance problems. Schanzenbach et al. (2019) introduced ZKlaims, a SNARK-based approach to privacy-preserving attribute credentials and included a performance evaluation. Later credential research also measured presentation, verification, and blockchain-related costs (Flamini et al., 2024; Xu et al., 2023). These studies support reporting separate measurements rather than reducing system efficiency to a single value.</w:t>
       </w:r>
     </w:p>
     <w:p>
@@ -150,20 +219,83 @@
         <w:pStyle w:val="Heading3"/>
       </w:pPr>
       <w:r>
-        <w:t>2.2.3 Credential Revocation and Status</w:t>
+        <w:t>2.2 Attribute-Based and Verifiable Credentials</w:t>
       </w:r>
     </w:p>
     <w:p>
-      <w:r>
-        <w:t>Credential validity introduces another dimension of privacy-preserving verification. Xu et al. (2023) proposed a privacy-preserving, tamper-evident revocation mechanism combining a cryptographic accumulator, blockchain information, and zero-knowledge proofs. Their prototype measured additional presentation and verification overhead and included scalability analysis. The study demonstrates that revocation can be integrated into privacy-preserving credentials, but it also illustrates that additional cryptographic components can alter proving and verification performance.</w:t>
+      <w:pPr>
+        <w:pStyle w:val="Heading3"/>
+      </w:pPr>
+      <w:r>
+        <w:t>2.2.1 Attribute-Based Credentials</w:t>
       </w:r>
     </w:p>
     <w:p>
       <w:r>
-        <w:t>For the present study, revocation should be treated as an explicit experimental feature rather than being silently included in the definition of attribute complexity. If included, its circuit cost should be measured separately.</w:t>
+        <w:t>Attribute-based credentials (ABCs) allow a holder to receive credentials containing attributes or claims from an issuer and later demonstrate possession of those attributes to a verifier</w:t>
+      </w:r>
+      <w:r>
+        <w:t xml:space="preserve"> </w:t>
+      </w:r>
+      <w:r>
+        <w:t>without disclosing unnecessary personal identifying information (PII)</w:t>
+      </w:r>
+      <w:r>
+        <w:t>. Typical attributes include age, nationality, membership, educational qualification, or eligibility. The principal roles are the issuer, holder, and verifier, with registries or revocation mechanisms sometimes added to establish credential status.</w:t>
       </w:r>
     </w:p>
     <w:p>
+      <w:r>
+        <w:lastRenderedPageBreak/>
+        <w:t>The ABC model is closely related to the broader verifiable-credential ecosystem. The W3C Verifiable Credentials Data Model 2.0 defines an issuer-holder-verifier ecosystem and a standardised data model for expressing and verifying claims (World Wide Web Consortium [W3C], 2025). The standard also recognises zero-knowledge mechanisms as relevant to privacy-enhancing credential presentations.</w:t>
+      </w:r>
+    </w:p>
+    <w:p>
+      <w:pPr>
+        <w:pStyle w:val="Heading3"/>
+      </w:pPr>
+      <w:r>
+        <w:t>2.2.2 Selective Disclosure and Predicate Proofs</w:t>
+      </w:r>
+    </w:p>
+    <w:p>
+      <w:r>
+        <w:t>Privacy in credential systems can be achieved through selective disclosure, in which only selected claims are revealed, or through predicate proofs, in which a holder demonstrates that an attribute satisfies a condition without revealing its value. These mechanisms address the problem of revealing more information than is necessary for a verification decision.</w:t>
+      </w:r>
+    </w:p>
+    <w:p>
+      <w:r>
+        <w:t xml:space="preserve">Flamini et al. (2024) compared cryptographic mechanisms for selective disclosure and evaluated properties including presentation size, generation time, verification time, unlinkability, and predicate-proof support. Their work demonstrates that privacy functionality and performance need to be considered together. </w:t>
+      </w:r>
+      <w:r>
+        <w:t>However, their work did not evaluate an end-to-end Noir-based ZK-SNARK circuit verified via Ethereum smart contracts.</w:t>
+      </w:r>
+    </w:p>
+    <w:p>
+      <w:pPr>
+        <w:pStyle w:val="Heading3"/>
+      </w:pPr>
+      <w:r>
+        <w:t>2.2.3 Credential Revocation and Status</w:t>
+      </w:r>
+    </w:p>
+    <w:p>
+      <w:r>
+        <w:t>Credential validity introduces another dimension of privacy-preserving verification. Xu et al. (2023) proposed a privacy-preserving, tamper-evident revocation mechanism combining a cryptographic accumulator, blockchain information, and zero-knowledge proofs. Their prototype measured additional presentation and verification overhead and included scalability analysis. The study demonstrates that revocation can be integrated into privacy-preserving credentials, but it also illustrates that additional cryptographic components can alter proving and verification performance.</w:t>
+      </w:r>
+    </w:p>
+    <w:p>
+      <w:r>
+        <w:t xml:space="preserve">For the present study, revocation should be treated as an </w:t>
+      </w:r>
+      <w:r>
+        <w:t>clear</w:t>
+      </w:r>
+      <w:r>
+        <w:t xml:space="preserve"> experimental feature rather than being silently included in the definition of attribute complexity. If included, its circuit cost should be measured separately.</w:t>
+      </w:r>
+    </w:p>
+    <w:p>
       <w:pPr>
         <w:pStyle w:val="Heading3"/>
       </w:pPr>
@@ -182,7 +314,13 @@
     </w:p>
     <w:p>
       <w:r>
-        <w:t>BBS signatures provide a cryptographic approach to selective disclosure in which a holder can derive a proof revealing selected credential information while protecting undisclosed claims. The W3C BBS cryptosuite describes selective disclosure and unlinkable derived proofs (W3C, 2026). Flamini et al. (2024) also evaluate BBS among other disclosure mechanisms.</w:t>
+        <w:t>BBS</w:t>
+      </w:r>
+      <w:r>
+        <w:t>+</w:t>
+      </w:r>
+      <w:r>
+        <w:t xml:space="preserve"> signatures provide a cryptographic approach to selective disclosure in which a holder can derive a proof revealing selected credential information while protecting undisclosed claims. The W3C BBS cryptosuite describes selective disclosure and unlinkable derived proofs (W3C, 2026). Flamini et al. (2024) also evaluate BBS among other disclosure mechanisms.</w:t>
       </w:r>
     </w:p>
     <w:p>
@@ -223,6 +361,7 @@
     </w:p>
     <w:p>
       <w:r>
+        <w:lastRenderedPageBreak/>
         <w:t>These studies demonstrate feasibility, but their credential models, proof constructions, blockchain environments, and performance metrics differ. Their numerical results should therefore not be transferred directly to a Noir/Barretenberg implementation.</w:t>
       </w:r>
     </w:p>
@@ -231,7 +370,6 @@
         <w:pStyle w:val="Heading3"/>
       </w:pPr>
       <w:r>
-        <w:lastRenderedPageBreak/>
         <w:t>2.3.4 Comparative Interpretation</w:t>
       </w:r>
     </w:p>
@@ -263,12 +401,15 @@
     </w:p>
     <w:p>
       <w:r>
-        <w:t>Noir is a domain-specific language for writing programs that can be compiled into zero-knowledge circuits. Noir documentation describes compilation into an Abstract Circuit Intermediate Representation (ACIR), which separates the developer-facing program from the proving backend (Noir Project, n.d.).</w:t>
+        <w:t>Noir is a domain-specific language for writing programs that can be compiled into zero-knowledge circuits. Noir documentation describes compilation into an Abstract Circuit Intermediate Representation (ACIR), which separates the developer-facing program from the proving backend</w:t>
+      </w:r>
+      <w:r>
+        <w:t>.</w:t>
       </w:r>
     </w:p>
     <w:p>
       <w:r>
-        <w:t>A high-level language does not automatically imply low proving cost. Noir documentation notes that circuit size and backend gate structure can be examined to understand the effect of program changes, and that ACIR operation counts are only approximations of actual backend proving cost (Noir Project, n.d.). This supports the need to measure the complete stack rather than treating the number of high-level attributes as the sole measure of complexity.</w:t>
+        <w:t>A high-level language does not automatically imply low proving cost. Noir documentation notes that circuit size and backend gate structure can be examined to understand the effect of program changes, and that ACIR operation counts are only approximations of actual backend proving cost. This supports the need to measure the complete stack rather than treating the number of high-level attributes as the sole measure of complexity.</w:t>
       </w:r>
     </w:p>
     <w:p>
@@ -276,6 +417,7 @@
         <w:pStyle w:val="Heading3"/>
       </w:pPr>
       <w:r>
+        <w:lastRenderedPageBreak/>
         <w:t>2.4.2 ACIR and Circuit Complexity</w:t>
       </w:r>
     </w:p>
@@ -286,7 +428,6 @@
     </w:p>
     <w:p>
       <w:r>
-        <w:lastRenderedPageBreak/>
         <w:t>The proposed study will distinguish attribute set size, predicate or circuit complexity, circuit size, and performance outcomes. Attribute set size will refer to the number of credential attributes in a benchmark scenario. Predicate or circuit complexity will refer to the logic required to establish the claims. Circuit size will be treated as an intermediate measured characteristic, while proof-generation time, memory, proof size, verification time, and gas consumption will be performance outcomes.</w:t>
       </w:r>
     </w:p>
@@ -300,12 +441,12 @@
     </w:p>
     <w:p>
       <w:r>
-        <w:t>Barretenberg is a proving backend associated with the Noir ecosystem. Its documentation describes a workflow in which Noir produces circuit artifacts and Barretenberg performs proving and verification, including EVM-oriented verification workflows (Aztec Labs, n.d.). This means that performance is a property of the complete implementation stack rather than Noir alone.</w:t>
+        <w:t>Barretenberg is a proving backend associated with the Noir ecosystem. Its documentation describes a workflow in which Noir produces circuit artifacts and Barretenberg performs proving and verification, including EVM-oriented verification workflows. This means that performance is a property of the complete implementation stack rather than Noir alone.</w:t>
       </w:r>
     </w:p>
     <w:p>
       <w:r>
-        <w:t>The Noir version, Barretenberg version, proving system, transcript configuration, hardware, and verifier implementation can affect measured performance. These conditions should therefore be documented explicitly. Noir also provides profiling facilities that can relate program operations to backend gate footprints, supporting more detailed investigation of proving bottlenecks (Noir Project, n.d.).</w:t>
+        <w:t>The Noir version, Barretenberg version, proving system, transcript configuration, hardware, and verifier implementation can affect measured performance. These conditions should therefore be documented explicitly. Noir also provides profiling facilities that can relate program operations to backend gate footprints, supporting more detailed investigation of proving bottlenecks.</w:t>
       </w:r>
     </w:p>
     <w:p>
@@ -313,7 +454,13 @@
         <w:pStyle w:val="Heading3"/>
       </w:pPr>
       <w:r>
-        <w:t>2.5 Ethereum as a Verification Environment</w:t>
+        <w:t>2.5 Ethereum as a</w:t>
+      </w:r>
+      <w:r>
+        <w:t>n On-chain</w:t>
+      </w:r>
+      <w:r>
+        <w:t xml:space="preserve"> Verification Environment</w:t>
       </w:r>
     </w:p>
     <w:p>
@@ -331,6 +478,7 @@
     </w:p>
     <w:p>
       <w:r>
+        <w:lastRenderedPageBreak/>
         <w:t>The cost of on-chain verification is not necessarily determined by the complexity of the private computation alone. It can depend on proof format, verifier contract, public inputs, calldata, cryptographic operations, and other contract logic. The proposed study therefore treats proof-generation performance and Ethereum verification cost as separate but connected dimensions.</w:t>
       </w:r>
     </w:p>
@@ -339,7 +487,6 @@
         <w:pStyle w:val="Heading3"/>
       </w:pPr>
       <w:r>
-        <w:lastRenderedPageBreak/>
         <w:t>2.5.2 Cryptographic Precompiles and Gas</w:t>
       </w:r>
     </w:p>
@@ -347,31 +494,94 @@
       <w:r>
         <w:t>Ethereum provides specialised precompiled contracts for certain cryptographic operations. These can make elliptic-curve operations more practical than implementing equivalent arithmetic directly in EVM bytecode. However, gas schedules depend on protocol and network configuration. A gas figure from one implementation should therefore not be presented as a universal constant.</w:t>
       </w:r>
+      <w:r>
+        <w:t xml:space="preserve"> </w:t>
+      </w:r>
+      <w:r>
+        <w:t>Ethereum optimizes elliptic curve arithmetic through specialized precompiled contracts:</w:t>
+      </w:r>
     </w:p>
     <w:p>
-      <w:r>
-        <w:t>The proposed study should specify its Ethereum environment, compiler and verifier implementation, public-input structure, and measurement method. Gas usage should be reported as an empirical result of the selected implementation.</w:t>
+      <w:pPr>
+        <w:pStyle w:val="ListParagraph"/>
+        <w:numPr>
+          <w:ilvl w:val="0"/>
+          <w:numId w:val="11"/>
+        </w:numPr>
+      </w:pPr>
+      <w:r>
+        <w:rPr>
+          <w:b/>
+          <w:bCs/>
+        </w:rPr>
+        <w:t>ecAdd</w:t>
+      </w:r>
+      <w:r>
+        <w:t xml:space="preserve"> (0x06): BN254 point addition (150 gas)</w:t>
       </w:r>
     </w:p>
     <w:p>
       <w:pPr>
-        <w:pStyle w:val="Heading3"/>
-      </w:pPr>
-      <w:r>
-        <w:t>2.6 Performance Evaluation of ZK-SNARK-Based Credential Systems</w:t>
+        <w:pStyle w:val="ListParagraph"/>
+        <w:numPr>
+          <w:ilvl w:val="0"/>
+          <w:numId w:val="11"/>
+        </w:numPr>
+      </w:pPr>
+      <w:r>
+        <w:rPr>
+          <w:b/>
+          <w:bCs/>
+        </w:rPr>
+        <w:t>ecMul</w:t>
+      </w:r>
+      <w:r>
+        <w:t xml:space="preserve"> (0x07): BN254 scalar multiplication (6,000 gas)</w:t>
       </w:r>
     </w:p>
     <w:p>
       <w:pPr>
-        <w:pStyle w:val="Heading3"/>
-      </w:pPr>
-      <w:r>
-        <w:t>2.6.1 Proof-Generation Time</w:t>
+        <w:pStyle w:val="ListParagraph"/>
+        <w:numPr>
+          <w:ilvl w:val="0"/>
+          <w:numId w:val="11"/>
+        </w:numPr>
+      </w:pPr>
+      <w:r>
+        <w:rPr>
+          <w:b/>
+          <w:bCs/>
+        </w:rPr>
+        <w:t>ecPairing</w:t>
+      </w:r>
+      <w:r>
+        <w:t xml:space="preserve"> (0x08): BN254 bilinear pairing check (45,000 </w:t>
+      </w:r>
+      <w:r>
+        <w:t>bas</w:t>
+      </w:r>
+      <w:r>
+        <w:t xml:space="preserve">e gas + 34,000 </w:t>
+      </w:r>
+      <w:r>
+        <w:t xml:space="preserve">gas </w:t>
+      </w:r>
+      <w:r>
+        <w:t>per pairing pair).</w:t>
       </w:r>
     </w:p>
     <w:p>
       <w:r>
-        <w:t>Proof-generation time measures the time required to construct a valid proof from the circuit and witness. It is particularly important when proving occurs on the holder's device. Existing credential and ZK benchmarking studies show that proving cost can become a practical constraint even where verification is comparatively efficient (Schanzenbach et al., 2019; Flamini et al., 2024; Guo et al., 2024).</w:t>
+        <w:t>Because pairing operations dominate verifier gas consumption, total execution cost scales primarily with proof scheme structure and public input sizing rather than private circuit logic complexity</w:t>
+      </w:r>
+      <w:r>
+        <w:t>.</w:t>
+      </w:r>
+      <w:r>
+        <w:t xml:space="preserve"> </w:t>
+      </w:r>
+      <w:r>
+        <w:t>The proposed study should specify its Ethereum environment, compiler and verifier implementation, public-input structure, and measurement method. Gas usage should be reported as an empirical result of the selected implementation.</w:t>
       </w:r>
     </w:p>
     <w:p>
@@ -379,70 +589,262 @@
         <w:pStyle w:val="Heading3"/>
       </w:pPr>
       <w:r>
-        <w:t>2.6.2 Verification Time</w:t>
+        <w:t>2.6 Performance Evaluation of ZK-SNARK-Based Credential Systems</w:t>
       </w:r>
     </w:p>
     <w:p>
-      <w:r>
-        <w:t>Verification should be measured separately from proof generation. Local verification provides information about the cryptographic verifier, while Ethereum verification includes smart-contract execution and transaction encoding. This separation helps identify where the dominant computational burden occurs.</w:t>
+      <w:pPr>
+        <w:pStyle w:val="Heading3"/>
+      </w:pPr>
+      <w:r>
+        <w:t>2.6.1 Proof-Generation Time</w:t>
       </w:r>
     </w:p>
     <w:p>
-      <w:pPr>
-        <w:pStyle w:val="Heading3"/>
-      </w:pPr>
-      <w:r>
-        <w:t>2.6.3 Memory Consumption</w:t>
+      <w:r>
+        <w:t>Proof-generation time measures the time required to construct a valid proof from the circuit and witness. It is particularly important when proving occurs on the holder's device. Existing credential and ZK benchmarking studies show that proving cost can become a practical constraint even where verification is comparatively efficient (Schanzenbach et al., 2019; Flamini et al., 2024; Guo et al., 2024).</w:t>
+      </w:r>
+      <w:r>
+        <w:t xml:space="preserve"> </w:t>
+      </w:r>
+      <w:r>
+        <w:t xml:space="preserve">To comprehensively evaluate ZK-SNARK performance, six metrics must be evaluated across off-chain and </w:t>
+      </w:r>
+      <w:r>
+        <w:lastRenderedPageBreak/>
+        <w:t>on-chain boundaries (Guo et al., 2024)</w:t>
+      </w:r>
+      <w:r>
+        <w:t>.</w:t>
+      </w:r>
+      <w:r>
+        <w:t xml:space="preserve"> They are p</w:t>
+      </w:r>
+      <w:r>
+        <w:t>roof-</w:t>
+      </w:r>
+      <w:r>
+        <w:t>g</w:t>
+      </w:r>
+      <w:r>
+        <w:t xml:space="preserve">eneration </w:t>
+      </w:r>
+      <w:r>
+        <w:t>t</w:t>
+      </w:r>
+      <w:r>
+        <w:t>ime</w:t>
+      </w:r>
+      <w:r>
+        <w:t>; a w</w:t>
+      </w:r>
+      <w:r>
+        <w:t xml:space="preserve">all-clock duration required for witness construction and proof </w:t>
+      </w:r>
+      <w:r>
+        <w:t>calculation</w:t>
+      </w:r>
+      <w:r>
+        <w:t>,</w:t>
+      </w:r>
+      <w:r>
+        <w:t xml:space="preserve"> peak</w:t>
+      </w:r>
+      <w:r>
+        <w:t xml:space="preserve"> </w:t>
+      </w:r>
+      <w:r>
+        <w:t>m</w:t>
+      </w:r>
+      <w:r>
+        <w:t xml:space="preserve">emory </w:t>
+      </w:r>
+      <w:r>
+        <w:t>c</w:t>
+      </w:r>
+      <w:r>
+        <w:t>onsumption</w:t>
+      </w:r>
+      <w:r>
+        <w:t>; the m</w:t>
+      </w:r>
+      <w:r>
+        <w:t>aximum RAM allocated during off-chain proving</w:t>
+      </w:r>
+      <w:r>
+        <w:t>,</w:t>
+      </w:r>
+      <w:r>
+        <w:t xml:space="preserve">  </w:t>
+      </w:r>
+      <w:r>
+        <w:t>p</w:t>
+      </w:r>
+      <w:r>
+        <w:t xml:space="preserve">roof </w:t>
+      </w:r>
+      <w:r>
+        <w:t>s</w:t>
+      </w:r>
+      <w:r>
+        <w:t>ize</w:t>
+      </w:r>
+      <w:r>
+        <w:t>;</w:t>
+      </w:r>
+      <w:r>
+        <w:t xml:space="preserve"> Byte length of the generated cryptographic proof transcript</w:t>
+      </w:r>
+      <w:r>
+        <w:t>,</w:t>
+      </w:r>
+      <w:r>
+        <w:t xml:space="preserve">  </w:t>
+      </w:r>
+      <w:r>
+        <w:t>l</w:t>
+      </w:r>
+      <w:r>
+        <w:t xml:space="preserve">ocal </w:t>
+      </w:r>
+      <w:r>
+        <w:t>v</w:t>
+      </w:r>
+      <w:r>
+        <w:t xml:space="preserve">erification </w:t>
+      </w:r>
+      <w:r>
+        <w:t>t</w:t>
+      </w:r>
+      <w:r>
+        <w:t>ime</w:t>
+      </w:r>
+      <w:r>
+        <w:t>; o</w:t>
+      </w:r>
+      <w:r>
+        <w:t>ff-chain execution time required to validate a proof transcript</w:t>
+      </w:r>
+      <w:r>
+        <w:t>,</w:t>
+      </w:r>
+      <w:r>
+        <w:t xml:space="preserve"> Ethereum </w:t>
+      </w:r>
+      <w:r>
+        <w:t>g</w:t>
+      </w:r>
+      <w:r>
+        <w:t xml:space="preserve">as </w:t>
+      </w:r>
+      <w:r>
+        <w:t>c</w:t>
+      </w:r>
+      <w:r>
+        <w:t>onsumption</w:t>
+      </w:r>
+      <w:r>
+        <w:t xml:space="preserve">; </w:t>
+      </w:r>
+      <w:r>
+        <w:t>EVM execution cost incurred during smart contract verifier execution</w:t>
+      </w:r>
+      <w:r>
+        <w:t xml:space="preserve"> and finally</w:t>
+      </w:r>
+      <w:r>
+        <w:t xml:space="preserve"> </w:t>
+      </w:r>
+      <w:r>
+        <w:t>t</w:t>
+      </w:r>
+      <w:r>
+        <w:t xml:space="preserve">ransaction </w:t>
+      </w:r>
+      <w:r>
+        <w:t>c</w:t>
+      </w:r>
+      <w:r>
+        <w:t xml:space="preserve">alldata </w:t>
+      </w:r>
+      <w:r>
+        <w:t>s</w:t>
+      </w:r>
+      <w:r>
+        <w:t>ize</w:t>
+      </w:r>
+      <w:r>
+        <w:t>; the</w:t>
+      </w:r>
+      <w:r>
+        <w:t xml:space="preserve"> </w:t>
+      </w:r>
+      <w:r>
+        <w:t>t</w:t>
+      </w:r>
+      <w:r>
+        <w:t>otal payload size submitted to the Ethereum network.</w:t>
       </w:r>
     </w:p>
     <w:p>
-      <w:r>
-        <w:t>Peak memory consumption is relevant because proving may eventually occur on laptops, browsers, or mobile-class devices. Guo et al. (2024) demonstrate the value of reporting memory alongside runtime in ZK benchmarking. The proposed study should therefore record peak memory rather than relying on execution time alone.</w:t>
+      <w:pPr>
+        <w:pStyle w:val="Heading3"/>
+      </w:pPr>
+      <w:r>
+        <w:t>2.6.2 Verification Time</w:t>
       </w:r>
     </w:p>
     <w:p>
-      <w:pPr>
-        <w:pStyle w:val="Heading3"/>
-      </w:pPr>
-      <w:r>
-        <w:lastRenderedPageBreak/>
-        <w:t>2.6.4 Proof Size and Transaction Data</w:t>
+      <w:r>
+        <w:t>Verification should be measured separately from proof generation. Local verification provides information about the cryptographic verifier, while Ethereum verification includes smart-contract execution and transaction encoding. This separation helps identify where the dominant computational burden occurs.</w:t>
       </w:r>
     </w:p>
     <w:p>
-      <w:r>
-        <w:t>Proof size affects transmission and storage, and can contribute to blockchain calldata. Proof size should therefore be reported independently from total transaction calldata. A compact proof does not imply a compact transaction if public inputs and other parameters are large.</w:t>
+      <w:pPr>
+        <w:pStyle w:val="Heading3"/>
+      </w:pPr>
+      <w:r>
+        <w:t xml:space="preserve">2.6.3 </w:t>
+      </w:r>
+      <w:r>
+        <w:t>Peak</w:t>
+      </w:r>
+      <w:r>
+        <w:t xml:space="preserve"> </w:t>
+      </w:r>
+      <w:r>
+        <w:t>Memory Consumption</w:t>
       </w:r>
     </w:p>
     <w:p>
-      <w:pPr>
-        <w:pStyle w:val="Heading3"/>
-      </w:pPr>
-      <w:r>
-        <w:t>2.6.5 Ethereum Gas Consumption</w:t>
+      <w:r>
+        <w:t>Peak memory consumption is relevant because proving may eventually occur on laptops, browsers, or mobile-class devices. Guo et al. (2024) demonstrate the value of reporting memory alongside runtime in ZK benchmarking. The proposed study should therefore record peak memory rather than relying on execution time alone.</w:t>
       </w:r>
     </w:p>
     <w:p>
-      <w:r>
-        <w:t>Gas consumption measures execution resources used by the verifier contract and is a central metric for Ethereum-based credential verification. However, gas should be interpreted together with proof format, verifier design, public-input count, calldata, and execution environment rather than treated as an intrinsic property of a ZK-SNARK.</w:t>
+      <w:pPr>
+        <w:pStyle w:val="Heading3"/>
+      </w:pPr>
+      <w:r>
+        <w:t>2.6.4 Proof Size and Transaction Data</w:t>
       </w:r>
     </w:p>
     <w:p>
-      <w:pPr>
-        <w:pStyle w:val="Heading3"/>
-      </w:pPr>
-      <w:r>
-        <w:t>2.6.6 Complexity and Scalability</w:t>
+      <w:r>
+        <w:t>Proof size affects transmission and storage, and can contribute to blockchain calldata. Proof size should therefore be reported independently from total transaction calldata. A compact proof does not imply a compact transaction if public inputs and other parameters are large.</w:t>
       </w:r>
     </w:p>
     <w:p>
-      <w:r>
-        <w:t>The literature indicates that increasing credential or circuit complexity can affect proving time, memory use, and related off-chain resources. However, greater private computation does not necessarily produce a proportional increase in on-chain verification cost. This distinction is important because proof systems can compress complex private computation into verification procedures whose cost depends on the proof system and public inputs.</w:t>
+      <w:pPr>
+        <w:pStyle w:val="Heading3"/>
+      </w:pPr>
+      <w:r>
+        <w:t>2.6.5 Ethereum Gas Consumption</w:t>
       </w:r>
     </w:p>
     <w:p>
       <w:r>
-        <w:t>Unless the proposed experiment measures concurrency or system-level throughput, the study should not claim to measure scalability in its broadest sense. It should instead evaluate performance trends as credential and circuit complexity increase and discuss their implications for practical scalability.</w:t>
+        <w:t>Gas consumption measures execution resources used by the verifier contract and is a central metric for Ethereum-based credential verification. However, gas should be interpreted together with proof format, verifier design, public-input count, calldata, and execution environment rather than treated as an intrinsic property of a ZK-SNARK.</w:t>
       </w:r>
     </w:p>
     <w:p>
@@ -450,39 +852,148 @@
         <w:pStyle w:val="Heading3"/>
       </w:pPr>
       <w:r>
-        <w:t>2.7 Empirical Studies and Critical Comparison</w:t>
+        <w:lastRenderedPageBreak/>
+        <w:t>2.6.6 Complexity and Scalability</w:t>
       </w:r>
     </w:p>
     <w:p>
       <w:r>
-        <w:t>The reviewed literature can be grouped into three broad categories. The first demonstrates privacy-preserving credential functionality. ZKlaims established an early SNARK-based approach to attribute credentials, while later work introduced blockchain-based access control, credential revocation, and transparent certification mechanisms (Schanzenbach et al., 2019; Di Francesco Maesa et al., 2023; Saramago et al., 2023; Xu et al., 2023).</w:t>
+        <w:t>The literature indicates that increasing credential or circuit complexity can affect proving time, memory use, and related off-chain resources. However, greater private computation does not necessarily produce a proportional increase in on-chain verification cost. This distinction is important because proof systems can compress complex private computation into verification procedures whose cost depends on the proof system and public inputs.</w:t>
       </w:r>
     </w:p>
     <w:p>
       <w:r>
-        <w:t xml:space="preserve">The second category evaluates cryptographic mechanisms for credential presentation. Flamini et al. (2024) compared selective-disclosure mechanisms using functional and experimental criteria, including presentation size and generation and verification time. Li (2022) examined a blockchain-oriented credential scheme based on selective disclosure and aggregate signatures. </w:t>
-      </w:r>
-      <w:r>
-        <w:lastRenderedPageBreak/>
-        <w:t>These studies demonstrate the value of empirical evaluation, but they do not provide the same end-to-end Noir/Ethereum benchmark proposed here.</w:t>
+        <w:t>Unless the proposed experiment measures concurrency or system-level throughput, the study should not claim to measure scalability in its broadest sense. It should instead evaluate performance trends as credential and circuit complexity increase and discuss their implications for practical scalability.</w:t>
       </w:r>
     </w:p>
     <w:p>
-      <w:r>
-        <w:t>The third category focuses more directly on ZK performance and blockchain execution. Guo et al. (2024) benchmarked SNARK proving systems and ZK-friendly hash functions for EVM-compatible blockchains and showed that performance and on-chain cost vary with implementation choices. This supports the need for controlled benchmark configurations. However, that work focuses on cryptographic primitives and transaction-oriented applications rather than attribute-based credentials implemented in Noir.</w:t>
+      <w:pPr>
+        <w:pStyle w:val="Heading3"/>
+      </w:pPr>
+      <w:r>
+        <w:t>2.7 Empirical Studies and Critical Comparison</w:t>
       </w:r>
     </w:p>
     <w:p>
       <w:r>
-        <w:t>The comparison suggests that performance values from unrelated circuits cannot be treated as universal. A hashing benchmark cannot automatically represent a credential circuit containing predicates, commitments, signature checks, or membership logic. Likewise, a gas measurement from one proof system cannot automatically characterise another verifier. The proposed benchmark must therefore use the actual credential circuit and a fully documented execution stack.</w:t>
+        <w:t>The reviewed literature can be grouped into three broad categories. The first demonstrates privacy-preserving credential functionality. ZKlaims established an early SNARK-based approach to attribute credentials, while later work introduced blockchain-based access control, credential revocation, and transparent certification mechanisms (Schanzenbach et al., 2019; Di Francesco Maesa et al., 2023; Saramago et al., 2023; Xu et al., 2023).</w:t>
       </w:r>
     </w:p>
     <w:p>
+      <w:r>
+        <w:t>The second category evaluates cryptographic mechanisms for credential presentation. Flamini et al. (2024) compared selective-disclosure mechanisms using functional and experimental criteria, including presentation size and generation and verification time. Li (2022) examined a blockchain-oriented credential scheme based on selective disclosure and aggregate signatures. These studies demonstrate the value of empirical evaluation, but they do not provide the same end-to-end Noir/Ethereum benchmark proposed here.</w:t>
+      </w:r>
+    </w:p>
+    <w:p>
+      <w:r>
+        <w:t xml:space="preserve">The third category focuses more directly on ZK performance and blockchain execution. Guo et al. (2024) benchmarked SNARK proving systems and ZK-friendly hash functions for EVM-compatible blockchains and showed that performance and on-chain cost vary with implementation choices. This supports the need for controlled benchmark </w:t>
+      </w:r>
+      <w:r>
+        <w:lastRenderedPageBreak/>
+        <w:t>configurations. However, that work focuses on cryptographic primitives and transaction-oriented applications rather than attribute-based credentials implemented in Noir.</w:t>
+      </w:r>
+    </w:p>
+    <w:p>
+      <w:r>
+        <w:t>The comparison suggests that performance values from unrelated circuits cannot be treated as universal. A hashing benchmark cannot automatically represent a credential circuit containing predicates, commitments, signature checks, or membership logic. Likewise, a gas measurement from one proof system cannot automatically characterise another verifier. The proposed benchmark must therefore use the actual credential circuit and a fully documented execution stack.</w:t>
+      </w:r>
+      <w:r>
+        <w:br w:type="page"/>
+      </w:r>
+    </w:p>
+    <w:p>
+      <w:pPr>
+        <w:sectPr>
+          <w:pgSz w:w="12240" w:h="15840"/>
+          <w:pgMar w:top="1440" w:right="1440" w:bottom="1440" w:left="2160" w:header="720" w:footer="720" w:gutter="0"/>
+          <w:cols w:space="720"/>
+          <w:docGrid w:linePitch="360"/>
+        </w:sectPr>
+      </w:pPr>
+    </w:p>
+    <w:p/>
+    <w:p>
       <w:pPr>
         <w:pStyle w:val="Heading3"/>
       </w:pPr>
       <w:r>
         <w:t>2.8 Literature Comparison Matrix</w:t>
+      </w:r>
+    </w:p>
+    <w:p>
+      <w:pPr>
+        <w:pStyle w:val="Caption"/>
+        <w:keepNext/>
+        <w:rPr>
+          <w:i/>
+          <w:iCs/>
+          <w:sz w:val="24"/>
+          <w:szCs w:val="24"/>
+        </w:rPr>
+      </w:pPr>
+      <w:r>
+        <w:rPr>
+          <w:i/>
+          <w:iCs/>
+          <w:sz w:val="24"/>
+          <w:szCs w:val="24"/>
+        </w:rPr>
+        <w:t xml:space="preserve">Table </w:t>
+      </w:r>
+      <w:r>
+        <w:rPr>
+          <w:i/>
+          <w:iCs/>
+          <w:sz w:val="24"/>
+          <w:szCs w:val="24"/>
+        </w:rPr>
+        <w:fldChar w:fldCharType="begin"/>
+      </w:r>
+      <w:r>
+        <w:rPr>
+          <w:i/>
+          <w:iCs/>
+          <w:sz w:val="24"/>
+          <w:szCs w:val="24"/>
+        </w:rPr>
+        <w:instrText xml:space="preserve"> SEQ Table \* ARABIC </w:instrText>
+      </w:r>
+      <w:r>
+        <w:rPr>
+          <w:i/>
+          <w:iCs/>
+          <w:sz w:val="24"/>
+          <w:szCs w:val="24"/>
+        </w:rPr>
+        <w:fldChar w:fldCharType="separate"/>
+      </w:r>
+      <w:r>
+        <w:rPr>
+          <w:i/>
+          <w:iCs/>
+          <w:noProof/>
+          <w:sz w:val="24"/>
+          <w:szCs w:val="24"/>
+        </w:rPr>
+        <w:t>1</w:t>
+      </w:r>
+      <w:r>
+        <w:rPr>
+          <w:i/>
+          <w:iCs/>
+          <w:sz w:val="24"/>
+          <w:szCs w:val="24"/>
+        </w:rPr>
+        <w:fldChar w:fldCharType="end"/>
+      </w:r>
+      <w:r>
+        <w:rPr>
+          <w:i/>
+          <w:iCs/>
+          <w:sz w:val="24"/>
+          <w:szCs w:val="24"/>
+        </w:rPr>
+        <w:t>: Literature Synthesis Matrix</w:t>
       </w:r>
     </w:p>
     <w:tbl>
@@ -493,12 +1004,12 @@
         <w:tblLook w:val="04A0" w:firstRow="1" w:lastRow="0" w:firstColumn="1" w:lastColumn="0" w:noHBand="0" w:noVBand="1"/>
       </w:tblPr>
       <w:tblGrid>
-        <w:gridCol w:w="1310"/>
-        <w:gridCol w:w="1375"/>
-        <w:gridCol w:w="1715"/>
-        <w:gridCol w:w="2012"/>
-        <w:gridCol w:w="1417"/>
-        <w:gridCol w:w="1747"/>
+        <w:gridCol w:w="1589"/>
+        <w:gridCol w:w="1670"/>
+        <w:gridCol w:w="2443"/>
+        <w:gridCol w:w="2469"/>
+        <w:gridCol w:w="1723"/>
+        <w:gridCol w:w="2136"/>
       </w:tblGrid>
       <w:tr>
         <w:trPr>
@@ -506,67 +1017,127 @@
         </w:trPr>
         <w:tc>
           <w:tcPr>
-            <w:tcW w:w="1560" w:type="dxa"/>
+            <w:tcW w:w="1589" w:type="dxa"/>
             <w:shd w:val="clear" w:color="auto" w:fill="D9EAF7"/>
           </w:tcPr>
           <w:p>
+            <w:pPr>
+              <w:rPr>
+                <w:b/>
+                <w:bCs/>
+              </w:rPr>
+            </w:pPr>
             <w:r>
-              <w:t>Study</w:t>
+              <w:rPr>
+                <w:b/>
+                <w:bCs/>
+              </w:rPr>
+              <w:t>Lead Author</w:t>
             </w:r>
           </w:p>
         </w:tc>
         <w:tc>
           <w:tcPr>
-            <w:tcW w:w="1560" w:type="dxa"/>
+            <w:tcW w:w="1670" w:type="dxa"/>
             <w:shd w:val="clear" w:color="auto" w:fill="D9EAF7"/>
           </w:tcPr>
           <w:p>
+            <w:pPr>
+              <w:rPr>
+                <w:b/>
+                <w:bCs/>
+              </w:rPr>
+            </w:pPr>
             <w:r>
-              <w:t>Main focus</w:t>
+              <w:rPr>
+                <w:b/>
+                <w:bCs/>
+              </w:rPr>
+              <w:t>Application context</w:t>
             </w:r>
           </w:p>
         </w:tc>
         <w:tc>
           <w:tcPr>
-            <w:tcW w:w="1560" w:type="dxa"/>
+            <w:tcW w:w="2309" w:type="dxa"/>
             <w:shd w:val="clear" w:color="auto" w:fill="D9EAF7"/>
           </w:tcPr>
           <w:p>
+            <w:pPr>
+              <w:rPr>
+                <w:b/>
+                <w:bCs/>
+              </w:rPr>
+            </w:pPr>
             <w:r>
-              <w:t>Technology / approach</w:t>
+              <w:rPr>
+                <w:b/>
+                <w:bCs/>
+              </w:rPr>
+              <w:t>Technology/approach</w:t>
             </w:r>
           </w:p>
         </w:tc>
         <w:tc>
           <w:tcPr>
-            <w:tcW w:w="1560" w:type="dxa"/>
+            <w:tcW w:w="2469" w:type="dxa"/>
             <w:shd w:val="clear" w:color="auto" w:fill="D9EAF7"/>
           </w:tcPr>
           <w:p>
+            <w:pPr>
+              <w:rPr>
+                <w:b/>
+                <w:bCs/>
+              </w:rPr>
+            </w:pPr>
             <w:r>
+              <w:rPr>
+                <w:b/>
+                <w:bCs/>
+              </w:rPr>
               <w:t>Evaluation</w:t>
             </w:r>
           </w:p>
         </w:tc>
         <w:tc>
           <w:tcPr>
-            <w:tcW w:w="1560" w:type="dxa"/>
+            <w:tcW w:w="1723" w:type="dxa"/>
             <w:shd w:val="clear" w:color="auto" w:fill="D9EAF7"/>
           </w:tcPr>
           <w:p>
+            <w:pPr>
+              <w:rPr>
+                <w:b/>
+                <w:bCs/>
+              </w:rPr>
+            </w:pPr>
             <w:r>
+              <w:rPr>
+                <w:b/>
+                <w:bCs/>
+              </w:rPr>
               <w:t>Contribution</w:t>
             </w:r>
           </w:p>
         </w:tc>
         <w:tc>
           <w:tcPr>
-            <w:tcW w:w="1560" w:type="dxa"/>
+            <w:tcW w:w="2136" w:type="dxa"/>
             <w:shd w:val="clear" w:color="auto" w:fill="D9EAF7"/>
           </w:tcPr>
           <w:p>
+            <w:pPr>
+              <w:rPr>
+                <w:b/>
+                <w:bCs/>
+              </w:rPr>
+            </w:pPr>
             <w:r>
-              <w:t>Limitation for present study</w:t>
+              <w:rPr>
+                <w:b/>
+                <w:bCs/>
+              </w:rPr>
+              <w:t>Key Limitations</w:t>
             </w:r>
           </w:p>
         </w:tc>
@@ -577,7 +1148,7 @@
         </w:trPr>
         <w:tc>
           <w:tcPr>
-            <w:tcW w:w="1560" w:type="dxa"/>
+            <w:tcW w:w="1589" w:type="dxa"/>
           </w:tcPr>
           <w:p>
             <w:r>
@@ -587,7 +1158,7 @@
         </w:tc>
         <w:tc>
           <w:tcPr>
-            <w:tcW w:w="1560" w:type="dxa"/>
+            <w:tcW w:w="1670" w:type="dxa"/>
           </w:tcPr>
           <w:p>
             <w:r>
@@ -597,7 +1168,7 @@
         </w:tc>
         <w:tc>
           <w:tcPr>
-            <w:tcW w:w="1560" w:type="dxa"/>
+            <w:tcW w:w="2309" w:type="dxa"/>
           </w:tcPr>
           <w:p>
             <w:r>
@@ -607,7 +1178,7 @@
         </w:tc>
         <w:tc>
           <w:tcPr>
-            <w:tcW w:w="1560" w:type="dxa"/>
+            <w:tcW w:w="2469" w:type="dxa"/>
           </w:tcPr>
           <w:p>
             <w:r>
@@ -617,7 +1188,7 @@
         </w:tc>
         <w:tc>
           <w:tcPr>
-            <w:tcW w:w="1560" w:type="dxa"/>
+            <w:tcW w:w="1723" w:type="dxa"/>
           </w:tcPr>
           <w:p>
             <w:r>
@@ -627,7 +1198,7 @@
         </w:tc>
         <w:tc>
           <w:tcPr>
-            <w:tcW w:w="1560" w:type="dxa"/>
+            <w:tcW w:w="2136" w:type="dxa"/>
           </w:tcPr>
           <w:p>
             <w:r>
@@ -642,7 +1213,7 @@
         </w:trPr>
         <w:tc>
           <w:tcPr>
-            <w:tcW w:w="1560" w:type="dxa"/>
+            <w:tcW w:w="1589" w:type="dxa"/>
           </w:tcPr>
           <w:p>
             <w:r>
@@ -652,7 +1223,7 @@
         </w:tc>
         <w:tc>
           <w:tcPr>
-            <w:tcW w:w="1560" w:type="dxa"/>
+            <w:tcW w:w="1670" w:type="dxa"/>
           </w:tcPr>
           <w:p>
             <w:r>
@@ -662,7 +1233,7 @@
         </w:tc>
         <w:tc>
           <w:tcPr>
-            <w:tcW w:w="1560" w:type="dxa"/>
+            <w:tcW w:w="2309" w:type="dxa"/>
           </w:tcPr>
           <w:p>
             <w:r>
@@ -672,7 +1243,7 @@
         </w:tc>
         <w:tc>
           <w:tcPr>
-            <w:tcW w:w="1560" w:type="dxa"/>
+            <w:tcW w:w="2469" w:type="dxa"/>
           </w:tcPr>
           <w:p>
             <w:r>
@@ -682,7 +1253,7 @@
         </w:tc>
         <w:tc>
           <w:tcPr>
-            <w:tcW w:w="1560" w:type="dxa"/>
+            <w:tcW w:w="1723" w:type="dxa"/>
           </w:tcPr>
           <w:p>
             <w:r>
@@ -692,7 +1263,7 @@
         </w:tc>
         <w:tc>
           <w:tcPr>
-            <w:tcW w:w="1560" w:type="dxa"/>
+            <w:tcW w:w="2136" w:type="dxa"/>
           </w:tcPr>
           <w:p>
             <w:r>
@@ -707,18 +1278,17 @@
         </w:trPr>
         <w:tc>
           <w:tcPr>
-            <w:tcW w:w="1560" w:type="dxa"/>
+            <w:tcW w:w="1589" w:type="dxa"/>
           </w:tcPr>
           <w:p>
             <w:r>
-              <w:lastRenderedPageBreak/>
               <w:t>Saramago et al. (2023)</w:t>
             </w:r>
           </w:p>
         </w:tc>
         <w:tc>
           <w:tcPr>
-            <w:tcW w:w="1560" w:type="dxa"/>
+            <w:tcW w:w="1670" w:type="dxa"/>
           </w:tcPr>
           <w:p>
             <w:r>
@@ -728,7 +1298,7 @@
         </w:tc>
         <w:tc>
           <w:tcPr>
-            <w:tcW w:w="1560" w:type="dxa"/>
+            <w:tcW w:w="2309" w:type="dxa"/>
           </w:tcPr>
           <w:p>
             <w:r>
@@ -738,7 +1308,7 @@
         </w:tc>
         <w:tc>
           <w:tcPr>
-            <w:tcW w:w="1560" w:type="dxa"/>
+            <w:tcW w:w="2469" w:type="dxa"/>
           </w:tcPr>
           <w:p>
             <w:r>
@@ -748,7 +1318,7 @@
         </w:tc>
         <w:tc>
           <w:tcPr>
-            <w:tcW w:w="1560" w:type="dxa"/>
+            <w:tcW w:w="1723" w:type="dxa"/>
           </w:tcPr>
           <w:p>
             <w:r>
@@ -758,7 +1328,7 @@
         </w:tc>
         <w:tc>
           <w:tcPr>
-            <w:tcW w:w="1560" w:type="dxa"/>
+            <w:tcW w:w="2136" w:type="dxa"/>
           </w:tcPr>
           <w:p>
             <w:r>
@@ -773,7 +1343,7 @@
         </w:trPr>
         <w:tc>
           <w:tcPr>
-            <w:tcW w:w="1560" w:type="dxa"/>
+            <w:tcW w:w="1589" w:type="dxa"/>
           </w:tcPr>
           <w:p>
             <w:r>
@@ -783,7 +1353,7 @@
         </w:tc>
         <w:tc>
           <w:tcPr>
-            <w:tcW w:w="1560" w:type="dxa"/>
+            <w:tcW w:w="1670" w:type="dxa"/>
           </w:tcPr>
           <w:p>
             <w:r>
@@ -793,7 +1363,7 @@
         </w:tc>
         <w:tc>
           <w:tcPr>
-            <w:tcW w:w="1560" w:type="dxa"/>
+            <w:tcW w:w="2309" w:type="dxa"/>
           </w:tcPr>
           <w:p>
             <w:r>
@@ -803,7 +1373,7 @@
         </w:tc>
         <w:tc>
           <w:tcPr>
-            <w:tcW w:w="1560" w:type="dxa"/>
+            <w:tcW w:w="2469" w:type="dxa"/>
           </w:tcPr>
           <w:p>
             <w:r>
@@ -813,7 +1383,7 @@
         </w:tc>
         <w:tc>
           <w:tcPr>
-            <w:tcW w:w="1560" w:type="dxa"/>
+            <w:tcW w:w="1723" w:type="dxa"/>
           </w:tcPr>
           <w:p>
             <w:r>
@@ -823,7 +1393,7 @@
         </w:tc>
         <w:tc>
           <w:tcPr>
-            <w:tcW w:w="1560" w:type="dxa"/>
+            <w:tcW w:w="2136" w:type="dxa"/>
           </w:tcPr>
           <w:p>
             <w:r>
@@ -838,17 +1408,59 @@
         </w:trPr>
         <w:tc>
           <w:tcPr>
-            <w:tcW w:w="1560" w:type="dxa"/>
+            <w:tcW w:w="1589" w:type="dxa"/>
+          </w:tcPr>
+          <w:p/>
+        </w:tc>
+        <w:tc>
+          <w:tcPr>
+            <w:tcW w:w="1670" w:type="dxa"/>
+          </w:tcPr>
+          <w:p/>
+        </w:tc>
+        <w:tc>
+          <w:tcPr>
+            <w:tcW w:w="2309" w:type="dxa"/>
+          </w:tcPr>
+          <w:p/>
+        </w:tc>
+        <w:tc>
+          <w:tcPr>
+            <w:tcW w:w="2469" w:type="dxa"/>
+          </w:tcPr>
+          <w:p/>
+        </w:tc>
+        <w:tc>
+          <w:tcPr>
+            <w:tcW w:w="1723" w:type="dxa"/>
+          </w:tcPr>
+          <w:p/>
+        </w:tc>
+        <w:tc>
+          <w:tcPr>
+            <w:tcW w:w="2136" w:type="dxa"/>
+          </w:tcPr>
+          <w:p/>
+        </w:tc>
+      </w:tr>
+      <w:tr>
+        <w:trPr>
+          <w:jc w:val="center"/>
+        </w:trPr>
+        <w:tc>
+          <w:tcPr>
+            <w:tcW w:w="1589" w:type="dxa"/>
           </w:tcPr>
           <w:p>
             <w:r>
+              <w:lastRenderedPageBreak/>
               <w:t>Xu et al. (2023)</w:t>
             </w:r>
           </w:p>
         </w:tc>
         <w:tc>
           <w:tcPr>
-            <w:tcW w:w="1560" w:type="dxa"/>
+            <w:tcW w:w="1670" w:type="dxa"/>
           </w:tcPr>
           <w:p>
             <w:r>
@@ -858,7 +1470,7 @@
         </w:tc>
         <w:tc>
           <w:tcPr>
-            <w:tcW w:w="1560" w:type="dxa"/>
+            <w:tcW w:w="2309" w:type="dxa"/>
           </w:tcPr>
           <w:p>
             <w:r>
@@ -868,7 +1480,7 @@
         </w:tc>
         <w:tc>
           <w:tcPr>
-            <w:tcW w:w="1560" w:type="dxa"/>
+            <w:tcW w:w="2469" w:type="dxa"/>
           </w:tcPr>
           <w:p>
             <w:r>
@@ -878,7 +1490,7 @@
         </w:tc>
         <w:tc>
           <w:tcPr>
-            <w:tcW w:w="1560" w:type="dxa"/>
+            <w:tcW w:w="1723" w:type="dxa"/>
           </w:tcPr>
           <w:p>
             <w:r>
@@ -888,7 +1500,7 @@
         </w:tc>
         <w:tc>
           <w:tcPr>
-            <w:tcW w:w="1560" w:type="dxa"/>
+            <w:tcW w:w="2136" w:type="dxa"/>
           </w:tcPr>
           <w:p>
             <w:r>
@@ -903,7 +1515,7 @@
         </w:trPr>
         <w:tc>
           <w:tcPr>
-            <w:tcW w:w="1560" w:type="dxa"/>
+            <w:tcW w:w="1589" w:type="dxa"/>
           </w:tcPr>
           <w:p>
             <w:r>
@@ -913,7 +1525,7 @@
         </w:tc>
         <w:tc>
           <w:tcPr>
-            <w:tcW w:w="1560" w:type="dxa"/>
+            <w:tcW w:w="1670" w:type="dxa"/>
           </w:tcPr>
           <w:p>
             <w:r>
@@ -923,7 +1535,7 @@
         </w:tc>
         <w:tc>
           <w:tcPr>
-            <w:tcW w:w="1560" w:type="dxa"/>
+            <w:tcW w:w="2309" w:type="dxa"/>
           </w:tcPr>
           <w:p>
             <w:r>
@@ -933,7 +1545,7 @@
         </w:tc>
         <w:tc>
           <w:tcPr>
-            <w:tcW w:w="1560" w:type="dxa"/>
+            <w:tcW w:w="2469" w:type="dxa"/>
           </w:tcPr>
           <w:p>
             <w:r>
@@ -943,7 +1555,7 @@
         </w:tc>
         <w:tc>
           <w:tcPr>
-            <w:tcW w:w="1560" w:type="dxa"/>
+            <w:tcW w:w="1723" w:type="dxa"/>
           </w:tcPr>
           <w:p>
             <w:r>
@@ -953,7 +1565,7 @@
         </w:tc>
         <w:tc>
           <w:tcPr>
-            <w:tcW w:w="1560" w:type="dxa"/>
+            <w:tcW w:w="2136" w:type="dxa"/>
           </w:tcPr>
           <w:p>
             <w:r>
@@ -968,7 +1580,7 @@
         </w:trPr>
         <w:tc>
           <w:tcPr>
-            <w:tcW w:w="1560" w:type="dxa"/>
+            <w:tcW w:w="1589" w:type="dxa"/>
           </w:tcPr>
           <w:p>
             <w:r>
@@ -978,7 +1590,7 @@
         </w:tc>
         <w:tc>
           <w:tcPr>
-            <w:tcW w:w="1560" w:type="dxa"/>
+            <w:tcW w:w="1670" w:type="dxa"/>
           </w:tcPr>
           <w:p>
             <w:r>
@@ -988,7 +1600,7 @@
         </w:tc>
         <w:tc>
           <w:tcPr>
-            <w:tcW w:w="1560" w:type="dxa"/>
+            <w:tcW w:w="2309" w:type="dxa"/>
           </w:tcPr>
           <w:p>
             <w:r>
@@ -998,7 +1610,7 @@
         </w:tc>
         <w:tc>
           <w:tcPr>
-            <w:tcW w:w="1560" w:type="dxa"/>
+            <w:tcW w:w="2469" w:type="dxa"/>
           </w:tcPr>
           <w:p>
             <w:r>
@@ -1008,7 +1620,7 @@
         </w:tc>
         <w:tc>
           <w:tcPr>
-            <w:tcW w:w="1560" w:type="dxa"/>
+            <w:tcW w:w="1723" w:type="dxa"/>
           </w:tcPr>
           <w:p>
             <w:r>
@@ -1018,7 +1630,7 @@
         </w:tc>
         <w:tc>
           <w:tcPr>
-            <w:tcW w:w="1560" w:type="dxa"/>
+            <w:tcW w:w="2136" w:type="dxa"/>
           </w:tcPr>
           <w:p>
             <w:r>
@@ -1033,7 +1645,7 @@
         </w:trPr>
         <w:tc>
           <w:tcPr>
-            <w:tcW w:w="1560" w:type="dxa"/>
+            <w:tcW w:w="1589" w:type="dxa"/>
           </w:tcPr>
           <w:p>
             <w:r>
@@ -1043,7 +1655,7 @@
         </w:tc>
         <w:tc>
           <w:tcPr>
-            <w:tcW w:w="1560" w:type="dxa"/>
+            <w:tcW w:w="1670" w:type="dxa"/>
           </w:tcPr>
           <w:p>
             <w:r>
@@ -1053,7 +1665,7 @@
         </w:tc>
         <w:tc>
           <w:tcPr>
-            <w:tcW w:w="1560" w:type="dxa"/>
+            <w:tcW w:w="2309" w:type="dxa"/>
           </w:tcPr>
           <w:p>
             <w:r>
@@ -1063,7 +1675,7 @@
         </w:tc>
         <w:tc>
           <w:tcPr>
-            <w:tcW w:w="1560" w:type="dxa"/>
+            <w:tcW w:w="2469" w:type="dxa"/>
           </w:tcPr>
           <w:p>
             <w:r>
@@ -1073,7 +1685,7 @@
         </w:tc>
         <w:tc>
           <w:tcPr>
-            <w:tcW w:w="1560" w:type="dxa"/>
+            <w:tcW w:w="1723" w:type="dxa"/>
           </w:tcPr>
           <w:p>
             <w:r>
@@ -1083,7 +1695,7 @@
         </w:tc>
         <w:tc>
           <w:tcPr>
-            <w:tcW w:w="1560" w:type="dxa"/>
+            <w:tcW w:w="2136" w:type="dxa"/>
           </w:tcPr>
           <w:p>
             <w:r>
@@ -1098,7 +1710,7 @@
         </w:trPr>
         <w:tc>
           <w:tcPr>
-            <w:tcW w:w="1560" w:type="dxa"/>
+            <w:tcW w:w="1589" w:type="dxa"/>
           </w:tcPr>
           <w:p>
             <w:r>
@@ -1108,7 +1720,7 @@
         </w:tc>
         <w:tc>
           <w:tcPr>
-            <w:tcW w:w="1560" w:type="dxa"/>
+            <w:tcW w:w="1670" w:type="dxa"/>
           </w:tcPr>
           <w:p>
             <w:r>
@@ -1118,7 +1730,7 @@
         </w:tc>
         <w:tc>
           <w:tcPr>
-            <w:tcW w:w="1560" w:type="dxa"/>
+            <w:tcW w:w="2309" w:type="dxa"/>
           </w:tcPr>
           <w:p>
             <w:r>
@@ -1128,7 +1740,7 @@
         </w:tc>
         <w:tc>
           <w:tcPr>
-            <w:tcW w:w="1560" w:type="dxa"/>
+            <w:tcW w:w="2469" w:type="dxa"/>
           </w:tcPr>
           <w:p>
             <w:r>
@@ -1138,7 +1750,7 @@
         </w:tc>
         <w:tc>
           <w:tcPr>
-            <w:tcW w:w="1560" w:type="dxa"/>
+            <w:tcW w:w="1723" w:type="dxa"/>
           </w:tcPr>
           <w:p>
             <w:r>
@@ -1148,7 +1760,7 @@
         </w:tc>
         <w:tc>
           <w:tcPr>
-            <w:tcW w:w="1560" w:type="dxa"/>
+            <w:tcW w:w="2136" w:type="dxa"/>
           </w:tcPr>
           <w:p>
             <w:r>
@@ -1163,7 +1775,7 @@
         </w:trPr>
         <w:tc>
           <w:tcPr>
-            <w:tcW w:w="1560" w:type="dxa"/>
+            <w:tcW w:w="1589" w:type="dxa"/>
           </w:tcPr>
           <w:p>
             <w:r>
@@ -1173,7 +1785,7 @@
         </w:tc>
         <w:tc>
           <w:tcPr>
-            <w:tcW w:w="1560" w:type="dxa"/>
+            <w:tcW w:w="1670" w:type="dxa"/>
           </w:tcPr>
           <w:p>
             <w:r>
@@ -1183,7 +1795,7 @@
         </w:tc>
         <w:tc>
           <w:tcPr>
-            <w:tcW w:w="1560" w:type="dxa"/>
+            <w:tcW w:w="2309" w:type="dxa"/>
           </w:tcPr>
           <w:p>
             <w:r>
@@ -1193,7 +1805,7 @@
         </w:tc>
         <w:tc>
           <w:tcPr>
-            <w:tcW w:w="1560" w:type="dxa"/>
+            <w:tcW w:w="2469" w:type="dxa"/>
           </w:tcPr>
           <w:p>
             <w:r>
@@ -1203,25 +1815,20 @@
         </w:tc>
         <w:tc>
           <w:tcPr>
-            <w:tcW w:w="1560" w:type="dxa"/>
+            <w:tcW w:w="1723" w:type="dxa"/>
           </w:tcPr>
           <w:p>
             <w:r>
-              <w:t xml:space="preserve">Shows implementation </w:t>
-            </w:r>
-            <w:r>
-              <w:lastRenderedPageBreak/>
-              <w:t>pipelines can contain serious bugs</w:t>
+              <w:t>Shows implementation pipelines can contain serious bugs</w:t>
             </w:r>
           </w:p>
         </w:tc>
         <w:tc>
           <w:tcPr>
-            <w:tcW w:w="1560" w:type="dxa"/>
+            <w:tcW w:w="2136" w:type="dxa"/>
           </w:tcPr>
           <w:p>
             <w:r>
-              <w:lastRenderedPageBreak/>
               <w:t>Security testing rather than performance</w:t>
             </w:r>
           </w:p>
@@ -1233,7 +1840,7 @@
         </w:trPr>
         <w:tc>
           <w:tcPr>
-            <w:tcW w:w="1560" w:type="dxa"/>
+            <w:tcW w:w="1589" w:type="dxa"/>
           </w:tcPr>
           <w:p>
             <w:r>
@@ -1244,7 +1851,7 @@
         </w:tc>
         <w:tc>
           <w:tcPr>
-            <w:tcW w:w="1560" w:type="dxa"/>
+            <w:tcW w:w="1670" w:type="dxa"/>
           </w:tcPr>
           <w:p>
             <w:r>
@@ -1254,7 +1861,7 @@
         </w:tc>
         <w:tc>
           <w:tcPr>
-            <w:tcW w:w="1560" w:type="dxa"/>
+            <w:tcW w:w="2309" w:type="dxa"/>
           </w:tcPr>
           <w:p>
             <w:r>
@@ -1264,7 +1871,7 @@
         </w:tc>
         <w:tc>
           <w:tcPr>
-            <w:tcW w:w="1560" w:type="dxa"/>
+            <w:tcW w:w="2469" w:type="dxa"/>
           </w:tcPr>
           <w:p>
             <w:r>
@@ -1274,7 +1881,7 @@
         </w:tc>
         <w:tc>
           <w:tcPr>
-            <w:tcW w:w="1560" w:type="dxa"/>
+            <w:tcW w:w="1723" w:type="dxa"/>
           </w:tcPr>
           <w:p>
             <w:r>
@@ -1284,7 +1891,7 @@
         </w:tc>
         <w:tc>
           <w:tcPr>
-            <w:tcW w:w="1560" w:type="dxa"/>
+            <w:tcW w:w="2136" w:type="dxa"/>
           </w:tcPr>
           <w:p>
             <w:r>
@@ -1294,41 +1901,56 @@
         </w:tc>
       </w:tr>
     </w:tbl>
+    <w:p/>
     <w:p>
-      <w:r>
-        <w:t>The matrix shows that the literature provides strong evidence for the feasibility and privacy value of ZK-based credentials, but the studies use different credential models, circuits, proving systems, hardware, and blockchain environments. Their results are therefore complementary rather than directly interchangeable.</w:t>
+      <w:pPr>
+        <w:sectPr>
+          <w:pgSz w:w="15840" w:h="12240" w:orient="landscape"/>
+          <w:pgMar w:top="1440" w:right="1440" w:bottom="1440" w:left="2160" w:header="720" w:footer="720" w:gutter="0"/>
+          <w:cols w:space="720"/>
+          <w:docGrid w:linePitch="360"/>
+        </w:sectPr>
+      </w:pPr>
+      <w:r>
+        <w:t xml:space="preserve">The matrix shows that the literature provides strong evidence for the feasibility and privacy value of ZK-based credentials, but the studies use different credential models, </w:t>
       </w:r>
     </w:p>
     <w:p>
-      <w:pPr>
-        <w:pStyle w:val="Heading3"/>
-      </w:pPr>
-      <w:r>
-        <w:t>2.9 Identified Research Gap</w:t>
+      <w:r>
+        <w:lastRenderedPageBreak/>
+        <w:t>circuits, proving systems, hardware, and blockchain environments. Their results are therefore complementary rather than directly interchangeable.</w:t>
       </w:r>
     </w:p>
     <w:p>
-      <w:r>
-        <w:t>The reviewed literature establishes that zero-knowledge techniques can support privacy-preserving credential presentation and that blockchain systems can provide public verification and auditability. However, the evidence remains fragmented across credential design, cryptographic implementation, and performance evaluation. Credential studies often emphasise privacy, functionality, revocation, or access control, while ZK benchmarking studies often use generic circuits, cryptographic primitives, or transaction-oriented applications.</w:t>
+      <w:pPr>
+        <w:pStyle w:val="Heading3"/>
+      </w:pPr>
+      <w:r>
+        <w:t>2.9 Identified Research Gap</w:t>
       </w:r>
     </w:p>
     <w:p>
       <w:r>
-        <w:t>A second gap concerns the modern Noir-based proving stack. Technical documentation shows that Noir compiles programs to ACIR and that a proving backend such as Barretenberg processes the resulting circuit. Noir documentation also notes that ACIR operation counts are only approximations of backend proving cost. This creates a need to evaluate the complete implementation stack empirically rather than assuming that high-level program complexity predicts performance directly.</w:t>
+        <w:t>The reviewed literature establishes that zero-knowledge techniques can support privacy-preserving credential presentation and that blockchain systems can provide public verification and auditability. However, the evidence remains fragmented across credential design, cryptographic implementation, and performance evaluation. Credential studies often emphasise privacy, functionality, revocation, or access control, while ZK benchmarking studies often use generic circuits, cryptographic primitives, or transaction-oriented applications.</w:t>
       </w:r>
     </w:p>
     <w:p>
       <w:r>
-        <w:t xml:space="preserve">A third gap concerns end-to-end measurement. Within the sources reviewed for this chapter, there is no directly comparable benchmark centred on an attribute-based credential circuit implemented in Noir that simultaneously relates credential/circuit complexity to proof-generation time, peak memory, proof size, local verification time, transaction calldata, and Ethereum verification gas under a controlled environment. Existing studies provide important </w:t>
-      </w:r>
-      <w:r>
-        <w:lastRenderedPageBreak/>
-        <w:t>partial evidence, but differences in circuits, proving systems, hardware, and blockchain configuration limit direct comparison.</w:t>
+        <w:t>A second gap concerns the modern Noir-based proving stack. Technical documentation shows that Noir compiles programs to ACIR and that a proving backend such as Barretenberg processes the resulting circuit. Noir documentation also notes that ACIR operation counts are only approximations of backend proving cost. This creates a need to evaluate the complete implementation stack empirically rather than assuming that high-level program complexity predicts performance directly.</w:t>
       </w:r>
     </w:p>
     <w:p>
       <w:r>
-        <w:t>The proposed study addresses this focused gap by constructing a defined attribute-based credential circuit in Noir, using a specified proving backend and controlled environment, varying selected complexity factors, and measuring both off-chain and Ethereum-side performance. The study does not claim that Noir or Ethereum is universally superior to alternative credential technologies. Instead, it seeks to establish experimentally how the selected implementation behaves under controlled conditions and what trade-offs arise between credential complexity, proving resources, proof characteristics, and on-chain verification cost.</w:t>
+        <w:t>A third gap concerns end-to-end measurement. Within the sources reviewed for this chapter, there is no directly comparable benchmark centred on an attribute-based credential circuit implemented in Noir that simultaneously relates credential/circuit complexity to proof-generation time, peak memory, proof size, local verification time, transaction calldata, and Ethereum verification gas under a controlled environment. Existing studies provide important partial evidence, but differences in circuits, proving systems, hardware, and blockchain configuration limit direct comparison.</w:t>
+      </w:r>
+    </w:p>
+    <w:p>
+      <w:r>
+        <w:t xml:space="preserve">The proposed study addresses this focused gap by constructing a defined attribute-based credential circuit in Noir, using a specified proving backend and controlled environment, varying selected complexity factors, and measuring both off-chain and Ethereum-side performance. The study does not claim that Noir or Ethereum is universally superior to alternative credential technologies. Instead, it seeks to establish experimentally how the selected implementation behaves under controlled conditions and what trade-offs arise </w:t>
+      </w:r>
+      <w:r>
+        <w:lastRenderedPageBreak/>
+        <w:t>between credential complexity, proving resources, proof characteristics, and on-chain verification cost.</w:t>
       </w:r>
     </w:p>
     <w:p>
@@ -1352,9 +1974,9 @@
         <w:tblLook w:val="04A0" w:firstRow="1" w:lastRow="0" w:firstColumn="1" w:lastColumn="0" w:noHBand="0" w:noVBand="1"/>
       </w:tblPr>
       <w:tblGrid>
-        <w:gridCol w:w="3120"/>
-        <w:gridCol w:w="3120"/>
-        <w:gridCol w:w="3120"/>
+        <w:gridCol w:w="2889"/>
+        <w:gridCol w:w="2974"/>
+        <w:gridCol w:w="2993"/>
       </w:tblGrid>
       <w:tr>
         <w:trPr>
@@ -1614,7 +2236,6 @@
           </w:tcPr>
           <w:p>
             <w:r>
-              <w:lastRenderedPageBreak/>
               <w:t>Dependent outcome</w:t>
             </w:r>
           </w:p>
@@ -1720,6 +2341,7 @@
           </w:tcPr>
           <w:p>
             <w:r>
+              <w:lastRenderedPageBreak/>
               <w:t>Dependent outcome</w:t>
             </w:r>
           </w:p>
@@ -1809,13 +2431,19 @@
         <w:pStyle w:val="Heading3"/>
       </w:pPr>
       <w:r>
-        <w:lastRenderedPageBreak/>
-        <w:t>2.12 Chapter Summary</w:t>
+        <w:t xml:space="preserve">2.12 </w:t>
+      </w:r>
+      <w:r>
+        <w:t>Summary of Literature Review</w:t>
       </w:r>
     </w:p>
     <w:p>
       <w:r>
-        <w:t>This chapter reviewed the theoretical, technological, and empirical foundations of privacy-preserving attribute-based credential verification. It established that zero-knowledge proofs can allow holders to prove credential-related claims without revealing underlying information, while ZK-SNARKs provide a mechanism for non-interactive and succinct proof verification. It also examined BBS-based selective disclosure, Merkle-based constructions, and general-purpose ZK-SNARK approaches as related privacy-preserving mechanisms.</w:t>
+        <w:t>This chapter reviewed the theoretical, technological, and empirical foundations of privacy-preserving attribute-based credential verification. It established that zero-knowledge proofs can allow holders to prove credential-related claims without revealing underlying information, while ZK-SNARKs provide a mechanism for non-interactive and succinct proof verification. It also examined BBS-based selective disclosure, Merkle-</w:t>
+      </w:r>
+      <w:r>
+        <w:lastRenderedPageBreak/>
+        <w:t>based constructions, and general-purpose ZK-SNARK approaches as related privacy-preserving mechanisms.</w:t>
       </w:r>
     </w:p>
     <w:p>
@@ -1857,11 +2485,7 @@
         <w:ind w:left="720" w:hanging="720"/>
       </w:pPr>
       <w:r>
-        <w:t xml:space="preserve">Flamini, A., Sciarretta, G., Scuro, M., Sharif, A., Tomasi, A., &amp; Ranise, S. (2024). On cryptographic mechanisms for the selective disclosure of verifiable credentials. Journal of </w:t>
-      </w:r>
-      <w:r>
-        <w:lastRenderedPageBreak/>
-        <w:t>Information Security and Applications, 83, 103789. https://doi.org/10.1016/j.jisa.2024.103789</w:t>
+        <w:t>Flamini, A., Sciarretta, G., Scuro, M., Sharif, A., Tomasi, A., &amp; Ranise, S. (2024). On cryptographic mechanisms for the selective disclosure of verifiable credentials. Journal of Information Security and Applications, 83, 103789. https://doi.org/10.1016/j.jisa.2024.103789</w:t>
       </w:r>
     </w:p>
     <w:p>
@@ -1877,6 +2501,7 @@
         <w:ind w:left="720" w:hanging="720"/>
       </w:pPr>
       <w:r>
+        <w:lastRenderedPageBreak/>
         <w:t>Guo, H., Feng, Y., Wu, C., Li, Z., &amp; Xu, J. (2024). Benchmarking ZK-friendly hash functions and SNARK proving systems for EVM-compatible blockchains. arXiv. https://arxiv.org/abs/2409.01976</w:t>
       </w:r>
     </w:p>
@@ -1941,7 +2566,6 @@
         <w:ind w:left="720" w:hanging="720"/>
       </w:pPr>
       <w:r>
-        <w:lastRenderedPageBreak/>
         <w:t>World Wide Web Consortium. (2025). Verifiable Credentials Data Model v2.0. https://www.w3.org/TR/vc-data-model-2.0/</w:t>
       </w:r>
     </w:p>
@@ -1958,6 +2582,7 @@
         <w:ind w:left="720" w:hanging="720"/>
       </w:pPr>
       <w:r>
+        <w:lastRenderedPageBreak/>
         <w:t>Wood, G. (2024). Ethereum: A secure decentralised generalised transaction ledger (Shanghai version). Ethereum Yellow Paper. https://ethereum.github.io/yellowpaper/paper.pdf</w:t>
       </w:r>
     </w:p>
@@ -2057,7 +2682,7 @@
     </w:p>
     <w:sectPr>
       <w:pgSz w:w="12240" w:h="15840"/>
-      <w:pgMar w:top="1440" w:right="1440" w:bottom="1440" w:left="1440" w:header="720" w:footer="720" w:gutter="0"/>
+      <w:pgMar w:top="1440" w:right="1440" w:bottom="1440" w:left="2160" w:header="720" w:footer="720" w:gutter="0"/>
       <w:cols w:space="720"/>
       <w:docGrid w:linePitch="360"/>
     </w:sectPr>
@@ -2236,6 +2861,178 @@
       <w:rPr>
         <w:rFonts w:ascii="Symbol" w:hAnsi="Symbol" w:hint="default"/>
       </w:rPr>
+    </w:lvl>
+  </w:abstractNum>
+  <w:abstractNum w:abstractNumId="9" w15:restartNumberingAfterBreak="0">
+    <w:nsid w:val="343F06F6"/>
+    <w:multiLevelType w:val="hybridMultilevel"/>
+    <w:tmpl w:val="8EF2651C"/>
+    <w:lvl w:ilvl="0" w:tplc="0409000F">
+      <w:start w:val="1"/>
+      <w:numFmt w:val="decimal"/>
+      <w:lvlText w:val="%1."/>
+      <w:lvlJc w:val="left"/>
+      <w:pPr>
+        <w:ind w:left="720" w:hanging="360"/>
+      </w:pPr>
+    </w:lvl>
+    <w:lvl w:ilvl="1" w:tplc="04090019" w:tentative="1">
+      <w:start w:val="1"/>
+      <w:numFmt w:val="lowerLetter"/>
+      <w:lvlText w:val="%2."/>
+      <w:lvlJc w:val="left"/>
+      <w:pPr>
+        <w:ind w:left="1440" w:hanging="360"/>
+      </w:pPr>
+    </w:lvl>
+    <w:lvl w:ilvl="2" w:tplc="0409001B" w:tentative="1">
+      <w:start w:val="1"/>
+      <w:numFmt w:val="lowerRoman"/>
+      <w:lvlText w:val="%3."/>
+      <w:lvlJc w:val="right"/>
+      <w:pPr>
+        <w:ind w:left="2160" w:hanging="180"/>
+      </w:pPr>
+    </w:lvl>
+    <w:lvl w:ilvl="3" w:tplc="0409000F" w:tentative="1">
+      <w:start w:val="1"/>
+      <w:numFmt w:val="decimal"/>
+      <w:lvlText w:val="%4."/>
+      <w:lvlJc w:val="left"/>
+      <w:pPr>
+        <w:ind w:left="2880" w:hanging="360"/>
+      </w:pPr>
+    </w:lvl>
+    <w:lvl w:ilvl="4" w:tplc="04090019" w:tentative="1">
+      <w:start w:val="1"/>
+      <w:numFmt w:val="lowerLetter"/>
+      <w:lvlText w:val="%5."/>
+      <w:lvlJc w:val="left"/>
+      <w:pPr>
+        <w:ind w:left="3600" w:hanging="360"/>
+      </w:pPr>
+    </w:lvl>
+    <w:lvl w:ilvl="5" w:tplc="0409001B" w:tentative="1">
+      <w:start w:val="1"/>
+      <w:numFmt w:val="lowerRoman"/>
+      <w:lvlText w:val="%6."/>
+      <w:lvlJc w:val="right"/>
+      <w:pPr>
+        <w:ind w:left="4320" w:hanging="180"/>
+      </w:pPr>
+    </w:lvl>
+    <w:lvl w:ilvl="6" w:tplc="0409000F" w:tentative="1">
+      <w:start w:val="1"/>
+      <w:numFmt w:val="decimal"/>
+      <w:lvlText w:val="%7."/>
+      <w:lvlJc w:val="left"/>
+      <w:pPr>
+        <w:ind w:left="5040" w:hanging="360"/>
+      </w:pPr>
+    </w:lvl>
+    <w:lvl w:ilvl="7" w:tplc="04090019" w:tentative="1">
+      <w:start w:val="1"/>
+      <w:numFmt w:val="lowerLetter"/>
+      <w:lvlText w:val="%8."/>
+      <w:lvlJc w:val="left"/>
+      <w:pPr>
+        <w:ind w:left="5760" w:hanging="360"/>
+      </w:pPr>
+    </w:lvl>
+    <w:lvl w:ilvl="8" w:tplc="0409001B" w:tentative="1">
+      <w:start w:val="1"/>
+      <w:numFmt w:val="lowerRoman"/>
+      <w:lvlText w:val="%9."/>
+      <w:lvlJc w:val="right"/>
+      <w:pPr>
+        <w:ind w:left="6480" w:hanging="180"/>
+      </w:pPr>
+    </w:lvl>
+  </w:abstractNum>
+  <w:abstractNum w:abstractNumId="10" w15:restartNumberingAfterBreak="0">
+    <w:nsid w:val="7B9D7E73"/>
+    <w:multiLevelType w:val="hybridMultilevel"/>
+    <w:tmpl w:val="B4B03C28"/>
+    <w:lvl w:ilvl="0" w:tplc="0409000F">
+      <w:start w:val="1"/>
+      <w:numFmt w:val="decimal"/>
+      <w:lvlText w:val="%1."/>
+      <w:lvlJc w:val="left"/>
+      <w:pPr>
+        <w:ind w:left="720" w:hanging="360"/>
+      </w:pPr>
+    </w:lvl>
+    <w:lvl w:ilvl="1" w:tplc="04090019" w:tentative="1">
+      <w:start w:val="1"/>
+      <w:numFmt w:val="lowerLetter"/>
+      <w:lvlText w:val="%2."/>
+      <w:lvlJc w:val="left"/>
+      <w:pPr>
+        <w:ind w:left="1440" w:hanging="360"/>
+      </w:pPr>
+    </w:lvl>
+    <w:lvl w:ilvl="2" w:tplc="0409001B" w:tentative="1">
+      <w:start w:val="1"/>
+      <w:numFmt w:val="lowerRoman"/>
+      <w:lvlText w:val="%3."/>
+      <w:lvlJc w:val="right"/>
+      <w:pPr>
+        <w:ind w:left="2160" w:hanging="180"/>
+      </w:pPr>
+    </w:lvl>
+    <w:lvl w:ilvl="3" w:tplc="0409000F" w:tentative="1">
+      <w:start w:val="1"/>
+      <w:numFmt w:val="decimal"/>
+      <w:lvlText w:val="%4."/>
+      <w:lvlJc w:val="left"/>
+      <w:pPr>
+        <w:ind w:left="2880" w:hanging="360"/>
+      </w:pPr>
+    </w:lvl>
+    <w:lvl w:ilvl="4" w:tplc="04090019" w:tentative="1">
+      <w:start w:val="1"/>
+      <w:numFmt w:val="lowerLetter"/>
+      <w:lvlText w:val="%5."/>
+      <w:lvlJc w:val="left"/>
+      <w:pPr>
+        <w:ind w:left="3600" w:hanging="360"/>
+      </w:pPr>
+    </w:lvl>
+    <w:lvl w:ilvl="5" w:tplc="0409001B" w:tentative="1">
+      <w:start w:val="1"/>
+      <w:numFmt w:val="lowerRoman"/>
+      <w:lvlText w:val="%6."/>
+      <w:lvlJc w:val="right"/>
+      <w:pPr>
+        <w:ind w:left="4320" w:hanging="180"/>
+      </w:pPr>
+    </w:lvl>
+    <w:lvl w:ilvl="6" w:tplc="0409000F" w:tentative="1">
+      <w:start w:val="1"/>
+      <w:numFmt w:val="decimal"/>
+      <w:lvlText w:val="%7."/>
+      <w:lvlJc w:val="left"/>
+      <w:pPr>
+        <w:ind w:left="5040" w:hanging="360"/>
+      </w:pPr>
+    </w:lvl>
+    <w:lvl w:ilvl="7" w:tplc="04090019" w:tentative="1">
+      <w:start w:val="1"/>
+      <w:numFmt w:val="lowerLetter"/>
+      <w:lvlText w:val="%8."/>
+      <w:lvlJc w:val="left"/>
+      <w:pPr>
+        <w:ind w:left="5760" w:hanging="360"/>
+      </w:pPr>
+    </w:lvl>
+    <w:lvl w:ilvl="8" w:tplc="0409001B" w:tentative="1">
+      <w:start w:val="1"/>
+      <w:numFmt w:val="lowerRoman"/>
+      <w:lvlText w:val="%9."/>
+      <w:lvlJc w:val="right"/>
+      <w:pPr>
+        <w:ind w:left="6480" w:hanging="180"/>
+      </w:pPr>
     </w:lvl>
   </w:abstractNum>
   <w:num w:numId="1" w16cid:durableId="1204559128">
@@ -2264,6 +3061,12 @@
   </w:num>
   <w:num w:numId="9" w16cid:durableId="313950002">
     <w:abstractNumId w:val="0"/>
+  </w:num>
+  <w:num w:numId="10" w16cid:durableId="944923841">
+    <w:abstractNumId w:val="10"/>
+  </w:num>
+  <w:num w:numId="11" w16cid:durableId="687172929">
+    <w:abstractNumId w:val="9"/>
   </w:num>
 </w:numbering>
 </file>
@@ -3442,7 +4245,6 @@
     <w:basedOn w:val="Normal"/>
     <w:next w:val="Normal"/>
     <w:uiPriority w:val="35"/>
-    <w:semiHidden/>
     <w:unhideWhenUsed/>
     <w:qFormat/>
     <w:rsid w:val="00FC693F"/>

</xml_diff>